<commit_message>
Regenerate Book 1 reading docx after merging main; Gate 1 evidence
Co-Authored-By: Claude Opus 5.5 (1M context) <noreply@anthropic.com>
Claude-Session: https://claude.ai/code/session_017PPzq48x9ej1eVbGkBuBjj
</commit_message>
<xml_diff>
--- a/exports/Ides_Book1_FULL_Ch01-36.docx
+++ b/exports/Ides_Book1_FULL_Ch01-36.docx
@@ -27,7 +27,7 @@
         <w:br/>
         <w:t>Book 1 reading export · Utica prologue, then Ch 1 dinner · ends at Philippi · author-voice (no em dash)</w:t>
         <w:br/>
-        <w:t>Source: Manuscript b801449 (2026-10-24) · generated 2026-10-24 07:43 UTC from claude/project-thread-yoegy1 @ b801449 · source digest 0c091763569a718b · prologue and chapters 1–36</w:t>
+        <w:t>Source: Manuscript 065d7a3 (2026-10-24) · generated 2026-10-24 07:50 UTC from claude/project-thread-yoegy1 @ 065d7a3 · source digest c160038de3a7f597 · prologue and chapters 1–36</w:t>
       </w:r>
     </w:p>
     <w:p>
@@ -166,7 +166,7 @@
     <w:p>
       <w:r>
         <w:rPr/>
-        <w:t>Before the first birds Cato sent the freedman Butas down to the harbour to see whether all the ships were away. Butas came back with the sky going grey. The ships were gone, he said, all but one; the sea was rough; a wind had got up from the north. Cato groaned aloud at that, for the men at sea, and sent Butas back down to see whether anyone had been forced to put in again and needed help. Cleanthes heard him say it. He heard the concern in it, real concern, and that was the thing he could not afterward explain to anyone: the man had sent Butas out of the room for the sake of strangers on the water.</w:t>
+        <w:t>Before the first birds Cato sent the freedman Butas down to the harbour to see whether all the ships were away. Butas came back with the sky going grey. The ships were gone, he said, all but one; the sea was rough; a wind had got up from the north. Cato groaned aloud at that, for the men at sea, and sent Butas back down to see whether anyone had been forced to put in again and needed help. Cleanthes heard him say it. He heard the concern in it, real concern, and that was the thing he could not afterwards explain to anyone: the man had sent Butas out of the room for the sake of strangers on the water.</w:t>
       </w:r>
     </w:p>
     <w:p>
@@ -2889,7 +2889,7 @@
     <w:p>
       <w:r>
         <w:rPr/>
-        <w:t>Afterward he drank and said the symbol was temporary again, to men who wanted the word as a blanket. He could already hear what Fulvia would do with that word: weigh it, not correct it.</w:t>
+        <w:t>Afterwards he drank and said the symbol was temporary again, to men who wanted the word as a blanket. He could already hear what Fulvia would do with that word: weigh it, not correct it.</w:t>
       </w:r>
     </w:p>
     <w:p>
@@ -3447,7 +3447,7 @@
       </w:r>
       <w:r>
         <w:rPr/>
-        <w:t xml:space="preserve"> sounded. The man had not only signed a tablet. He had kept a place for him at ordinary tables afterward, hand on his shoulder like kinship that politics had not earned. Killing that hand later would not be surgery in the blood. It would be answering warmth with steel and calling the answer law.</w:t>
+        <w:t xml:space="preserve"> sounded. The man had not only signed a tablet. He had kept a place for him at ordinary tables afterwards, hand on his shoulder like kinship that politics had not earned. Killing that hand later would not be surgery in the blood. It would be answering warmth with steel and calling the answer law.</w:t>
       </w:r>
     </w:p>
     <w:p>
@@ -4589,7 +4589,7 @@
     <w:p>
       <w:r>
         <w:rPr/>
-        <w:t>“Only a king,” he murmured afterward, tasting the phrase like a bad period, and returned to the desk before the courier’s dust had settled in the courtyard.</w:t>
+        <w:t>“Only a king,” he murmured afterwards, tasting the phrase like a bad period, and returned to the desk before the courier’s dust had settled in the courtyard.</w:t>
       </w:r>
     </w:p>
     <w:p>
@@ -10435,7 +10435,7 @@
     <w:p>
       <w:r>
         <w:rPr/>
-        <w:t>Hordeonius picked the scrap up with two fingers, the way a man lifts something that might stain, and set it back on the whisperer’s palm. “The Senate pardoned the doing in March,” he said. “You want me to pay for the knowing?” Then, gently, blessing-flat: “Archaeology. I deal in the living. The living pay interest. The dead pay only in stories, and stories are oversupplied.” He wiped his fingers on the stall-cloth afterward, ego housekeeping, not fear.</w:t>
+        <w:t>Hordeonius picked the scrap up with two fingers, the way a man lifts something that might stain, and set it back on the whisperer’s palm. “The Senate pardoned the doing in March,” he said. “You want me to pay for the knowing?” Then, gently, blessing-flat: “Archaeology. I deal in the living. The living pay interest. The dead pay only in stories, and stories are oversupplied.” He wiped his fingers on the stall-cloth afterwards, ego housekeeping, not fear.</w:t>
       </w:r>
     </w:p>
     <w:p>
@@ -11142,7 +11142,7 @@
     <w:p>
       <w:r>
         <w:rPr/>
-        <w:t>Someone further along was explaining it to a crowd, and Nysa heard, “They say the hair of the star means…” and then a cheer went up from inside the walls and drowned the rest. She never learned what the hair meant. She thought about it afterward, scrubbing pans, and decided she had been better off without the end of the sentence.</w:t>
+        <w:t>Someone further along was explaining it to a crowd, and Nysa heard, “They say the hair of the star means…” and then a cheer went up from inside the walls and drowned the rest. She never learned what the hair meant. She thought about it afterwards, scrubbing pans, and decided she had been better off without the end of the sentence.</w:t>
       </w:r>
     </w:p>
     <w:p>
@@ -12182,7 +12182,7 @@
     <w:p>
       <w:r>
         <w:rPr/>
-        <w:t>When it was over the courtyard smelled of the sea and of the other thing. A slave brought a basin. Fulvia dipped two fingers and touched them to her cheek, without hurry, and looked at the water afterward.</w:t>
+        <w:t>When it was over the courtyard smelled of the sea and of the other thing. A slave brought a basin. Fulvia dipped two fingers and touched them to her cheek, without hurry, and looked at the water afterwards.</w:t>
       </w:r>
     </w:p>
     <w:p>
@@ -13103,7 +13103,7 @@
     <w:p>
       <w:r>
         <w:rPr/>
-        <w:t>Afterward a senator clasped his arm and called him the Republic’s luck. Octavian returned the clasp at half strength. Half strength still looked like gratitude if you did not measure. Agrippa’s stillness held until the clasp ended. Only then did he match pace toward the vendor street. A northern courier’s fragments stayed unmerged in Octavian’s hand: Decimus holding, Antony digging, Pacuvius still hungry for storm. Cicero left looking like a man certain he had saved the Republic. Outside, a vendor sold hot food and called no one Caesar. Octavian heard him and didn’t correct him.</w:t>
+        <w:t>Afterwards a senator clasped his arm and called him the Republic’s luck. Octavian returned the clasp at half strength. Half strength still looked like gratitude if you did not measure. Agrippa’s stillness held until the clasp ended. Only then did he match pace toward the vendor street. A northern courier’s fragments stayed unmerged in Octavian’s hand: Decimus holding, Antony digging, Pacuvius still hungry for storm. Cicero left looking like a man certain he had saved the Republic. Outside, a vendor sold hot food and called no one Caesar. Octavian heard him and didn’t correct him.</w:t>
       </w:r>
     </w:p>
     <w:p>
@@ -18429,7 +18429,7 @@
     <w:p>
       <w:r>
         <w:rPr/>
-        <w:t>Fever made the tent canvas pulse. Twenty days ago Brutus’s men had come through this camp and run their swords through the litter he had left an hour before. His doctor had dreamed something and had him carried out into the marsh. Octavian remembered reeds, and lying very still, and being told afterward that it had been prudence. Sweat ran into his eyes and made the map swim. A courier asked for orders. Octavian gave two that mattered: hold the camp ditch; do not chase beyond the markers Agrippa had set. And one that only sounded like command, a sentence about courage he regretted as soon as it left his mouth. He didn’t invent himself as genius of the plain. He survived noise. He survived other men’s versions of his usefulness.</w:t>
+        <w:t>Fever made the tent canvas pulse. Twenty days ago Brutus’s men had come through this camp and run their swords through the litter he had left an hour before. His doctor had dreamed something and had him carried out into the marsh. Octavian remembered reeds, and lying very still, and being told afterwards that it had been prudence. Sweat ran into his eyes and made the map swim. A courier asked for orders. Octavian gave two that mattered: hold the camp ditch; do not chase beyond the markers Agrippa had set. And one that only sounded like command, a sentence about courage he regretted as soon as it left his mouth. He didn’t invent himself as genius of the plain. He survived noise. He survived other men’s versions of his usefulness.</w:t>
       </w:r>
     </w:p>
     <w:p>

</xml_diff>

<commit_message>
Regenerate Book 1 reading docx; Gate 1 evidence after story graph pass
Co-Authored-By: Claude Opus 5.5 (1M context) <noreply@anthropic.com>
Claude-Session: https://claude.ai/code/session_017PPzq48x9ej1eVbGkBuBjj
</commit_message>
<xml_diff>
--- a/exports/Ides_Book1_FULL_Ch01-36.docx
+++ b/exports/Ides_Book1_FULL_Ch01-36.docx
@@ -27,7 +27,7 @@
         <w:br/>
         <w:t>Book 1 reading export · Utica prologue, then Ch 1 dinner · ends at Philippi · author-voice (no em dash)</w:t>
         <w:br/>
-        <w:t>Source: Manuscript dff54f9 (2026-10-24) · generated 2026-10-24 08:11 UTC from claude/project-thread-yoegy1 @ dff54f9 · source digest 0480917855fe882d · prologue, chapters 1–36, historical note and cast</w:t>
+        <w:t>Source: Manuscript c58bbf0 (2026-10-24) · generated 2026-10-24 09:11 UTC from claude/project-thread-yoegy1 @ c58bbf0 · source digest 6b7c7d557c5dbe5d · prologue, chapters 1–36, historical note and cast</w:t>
       </w:r>
     </w:p>
     <w:p>
@@ -7944,7 +7944,7 @@
     <w:p>
       <w:r>
         <w:rPr/>
-        <w:t>A junior senator (Seius’s type, though not Seius) laughed too loudly. Sosia, on the next stool, did not. The laugh wanted company; the stall offered rates instead. Hordeonius didn’t join the laugh. Humour was for men who didn’t hold other men’s winters in wax, unless the humour sold a second cup without confessing appetite.</w:t>
+        <w:t>Seius laughed too loudly. He had come in the whitened toga he had bought on Hordeonius’s paper, for an aedile’s canvass in an election Caesar had arranged before Parthia, and Caesar would not be going to Parthia. Sosia, on the next stool, did not laugh. The laugh wanted company; the stall offered rates instead.</w:t>
       </w:r>
     </w:p>
     <w:p>
@@ -7968,13 +7968,61 @@
     <w:p>
       <w:r>
         <w:rPr/>
-        <w:t>The junior wiped his eyes. “You talk as if mourning were a price list.”</w:t>
-      </w:r>
-    </w:p>
-    <w:p>
-      <w:r>
-        <w:rPr/>
-        <w:t>“Then buy a list,” Hordeonius said, stylus already moving, “or stop wasting the stool.” Sosia’s mouth twitched toward a joke about Alexandria and died there. The junior was already leaning in for leases, and jokes that named queens out loud became entries in a daybook. “Gardens, boy, queen: watch which one empties a purse first. I don’t grade grief.” The junior’s loud laugh came back smaller. The stall had taxed it. Hordeonius did not smile. Smiling would have spoiled the next sale.</w:t>
+        <w:t>Seius wiped his eyes. “You talk as if mourning were a price list.”</w:t>
+      </w:r>
+    </w:p>
+    <w:p>
+      <w:r>
+        <w:rPr/>
+        <w:t>“Then buy a list,” Hordeonius said, stylus already moving, “or tell me what you came for.”</w:t>
+      </w:r>
+    </w:p>
+    <w:p>
+      <w:r>
+        <w:rPr/>
+        <w:t>Seius had come for a month. The canvass paper fell due on the Kalends: the toga, the small gifts, the jar of oil good enough to be seen carrying, all bought for a year that might not now have elections in it. “Roll it,” he said. “Until the Senate decides whether there is a year.”</w:t>
+      </w:r>
+    </w:p>
+    <w:p>
+      <w:r>
+        <w:rPr/>
+        <w:t>Half the Janus was calling in Caesarian paper that morning, every loan secured on a dead man’s goodwill. Calling Seius would clear a column and cost nothing but a client who had never been worth much. Hordeonius looked at the column, and then at the man in the white toga, sweating through it.</w:t>
+      </w:r>
+    </w:p>
+    <w:p>
+      <w:r>
+        <w:rPr/>
+        <w:t>“I will roll it,” he said. “At two in the hundred. On the Sabine farm. Your wife’s father’s.”</w:t>
+      </w:r>
+    </w:p>
+    <w:p>
+      <w:r>
+        <w:rPr/>
+        <w:t>Seius’s laugh went out like a lamp. “Not the farm.”</w:t>
+      </w:r>
+    </w:p>
+    <w:p>
+      <w:r>
+        <w:rPr/>
+        <w:t>“Then two and a half, and no farm.”</w:t>
+      </w:r>
+    </w:p>
+    <w:p>
+      <w:r>
+        <w:rPr/>
+        <w:t>“Done,” said Seius, too fast, and went before the stall could think of a third thing.</w:t>
+      </w:r>
+    </w:p>
+    <w:p>
+      <w:r>
+        <w:rPr/>
+        <w:t>“You could have had his house on the Kalends,” Sosia said.</w:t>
+      </w:r>
+    </w:p>
+    <w:p>
+      <w:r>
+        <w:rPr/>
+        <w:t>“I could have had a house nobody will buy this month.” Hordeonius entered the new rate. “Interest keeps. Houses burn.”</w:t>
       </w:r>
     </w:p>
     <w:p>
@@ -9141,39 +9189,7 @@
     <w:p>
       <w:r>
         <w:rPr/>
-        <w:t xml:space="preserve">The second courier, younger, contradicted on cue, half-false news fighting in the same air. Antony generous. Antony monstrous. Brutus worshipped. Brutus finished. The boy already gathering flies in Campania. The boy already finished by Antony’s laugh. Cicero kept both halves without labelling either </w:t>
-      </w:r>
-      <w:r>
-        <w:rPr>
-          <w:i/>
-        </w:rPr>
-        <w:t>true</w:t>
-      </w:r>
-      <w:r>
-        <w:rPr/>
-        <w:t>. He could watch which mouth sweat.</w:t>
-      </w:r>
-    </w:p>
-    <w:p>
-      <w:r>
-        <w:rPr/>
-        <w:t>“Sport,” the neighbour said, tasting the wine-shop joke. “Rome’s favourite exercise. Underestimate until the underestimate grows teeth.”</w:t>
-      </w:r>
-    </w:p>
-    <w:p>
-      <w:r>
-        <w:rPr/>
-        <w:t xml:space="preserve">“Then stop exercising,” Cicero said lightly, and meant </w:t>
-      </w:r>
-      <w:r>
-        <w:rPr>
-          <w:i/>
-        </w:rPr>
-        <w:t>watch</w:t>
-      </w:r>
-      <w:r>
-        <w:rPr/>
-        <w:t xml:space="preserve">. He tipped the cracked-sandal boy, scratched </w:t>
+        <w:t xml:space="preserve">He tipped the cracked-sandal boy, scratched </w:t>
       </w:r>
       <w:r>
         <w:rPr>
@@ -9183,17 +9199,7 @@
       </w:r>
       <w:r>
         <w:rPr/>
-        <w:t xml:space="preserve"> in a margin, and underlined it twice, then added, smaller: </w:t>
-      </w:r>
-      <w:r>
-        <w:rPr>
-          <w:i/>
-        </w:rPr>
-        <w:t>wine shops already practising the laugh</w:t>
-      </w:r>
-      <w:r>
-        <w:rPr/>
-        <w:t>.</w:t>
+        <w:t xml:space="preserve"> in a margin, and underlined it twice.</w:t>
       </w:r>
     </w:p>
     <w:p>
@@ -9597,37 +9603,7 @@
     <w:p>
       <w:r>
         <w:rPr/>
-        <w:t>“And the boy?” Brutus asked, surprising himself. “The heir talk.”</w:t>
-      </w:r>
-    </w:p>
-    <w:p>
-      <w:r>
-        <w:rPr/>
-        <w:t>The steward hesitated. Hesitation was news. “Campania says the name. Rome’s wine shops still use him as sport: shadow, squeak, a will with no boots on it. Elders bet cups on how long the joke lasts. For now they laugh.”</w:t>
-      </w:r>
-    </w:p>
-    <w:p>
-      <w:r>
-        <w:rPr/>
-        <w:t>Porcia didn’t waste comfort. She stood where the steward still held his road-report and a client, robe too clean for eighteen miles, waited with loyalty that had already checked the sun. The steward wanted to give his news. Porcia wanted to give nothing. The client wanted a signature he had not yet asked for.</w:t>
-      </w:r>
-    </w:p>
-    <w:p>
-      <w:r>
-        <w:rPr/>
         <w:t>“They call you immortal in the same breath they ask you to be quiet,” Porcia said. “They call the boy temporary in the same breath they price his paper. Neither compliment is meant for your safety.”</w:t>
-      </w:r>
-    </w:p>
-    <w:p>
-      <w:r>
-        <w:rPr/>
-        <w:t>The steward’s eyes flicked to the client and back. “The roads still take veterans, praetor. If you mean to move, move before dusk invents another excuse.”</w:t>
-      </w:r>
-    </w:p>
-    <w:p>
-      <w:r>
-        <w:rPr/>
-        <w:t>The client smiled the smile of men who bring purses later. “Rome still whispers your name with hope. Hope needs a line, anything, that we stood with you in March.”</w:t>
       </w:r>
     </w:p>
     <w:p>
@@ -9649,7 +9625,7 @@
       </w:r>
       <w:r>
         <w:rPr/>
-        <w:t xml:space="preserve"> like a debt. She did not look at the client. Looking would have made the debt a performance. The steward closed his mouth on further roads. The client’s smile held while Brutus faced him. When Brutus turned toward the hedges, he heard it thin for the steward. “He will draft periods while the dust learns our gates. Hope came for ink. It left with gravel.”</w:t>
+        <w:t xml:space="preserve"> like a debt.</w:t>
       </w:r>
     </w:p>
     <w:p>
@@ -9667,7 +9643,7 @@
     <w:p>
       <w:r>
         <w:rPr/>
-        <w:t>Cassius’s letters, from his own house nearer the coast, smelled of ships and contempt. Brutus answered carefully, sentence by sentence. Care might still travel where he could not. At the gate a client offered a purse “for expenses on the road south, if the praetor would only write one introduction.” Brutus returned the purse unopened. “I will not buy quiet with other men’s coin,” he said. The client bowed too low and went.</w:t>
+        <w:t>Cassius’s letters, from his own house nearer the coast, smelled of ships and contempt. Brutus answered carefully, sentence by sentence. Care might still travel where he could not.</w:t>
       </w:r>
     </w:p>
     <w:p>
@@ -9703,7 +9679,7 @@
     <w:p>
       <w:r>
         <w:rPr/>
-        <w:t>The clerk left without clasping arms. Before supper the steward returned from the neighbouring town’s market with flour and a report that cost more than flour. Two clients who had meant to sleep at Lanuvium had already turned back, told at the gate there that Brutus’s house would not shield them. One refusal had made his name a local absence by nightfall. Another client asked when he would return to Rome. Brutus said, “When Rome remembers what a praetor is for.” That one nodded as if he’d been given a day to mark on wax, and didn’t offer a tablet.</w:t>
+        <w:t>The clerk left without clasping arms. Before supper the steward returned from the neighbouring town’s market with flour and a report that cost more than flour. Two clients who had meant to sleep at Lanuvium had already turned back, told at the gate there that Brutus’s house would not shield them. One refusal had made his name a local absence by nightfall.</w:t>
       </w:r>
     </w:p>
     <w:p>
@@ -9781,28 +9757,6 @@
       </w:r>
     </w:p>
     <w:p>
-      <w:r>
-        <w:rPr/>
-        <w:t>He didn’t practise a Senate line for the hedges. The hedges had already heard enough philosophy. He walked the gravel until his sandals hurt and counted the cost without making it a period. He still had a view, and fewer doors that would open if he knocked.</w:t>
-      </w:r>
-    </w:p>
-    <w:p>
-      <w:r>
-        <w:rPr/>
-        <w:t xml:space="preserve">Through the gate: hills, and beyond them a name war beginning without him, while a neighbouring town filed his silence under </w:t>
-      </w:r>
-      <w:r>
-        <w:rPr>
-          <w:i/>
-        </w:rPr>
-        <w:t>unavailable</w:t>
-      </w:r>
-      <w:r>
-        <w:rPr/>
-        <w:t>.</w:t>
-      </w:r>
-    </w:p>
-    <w:p>
       <w:pPr>
         <w:spacing w:before="280"/>
       </w:pPr>
@@ -9941,33 +9895,7 @@
     <w:p>
       <w:r>
         <w:rPr/>
-        <w:t xml:space="preserve">“Neither will I,” Cicero said lightly, as if it were a matter of taste. Behind him two elders from a neighbouring villa were already converting the courtyard chant into wine-shop sport updated. Not </w:t>
-      </w:r>
-      <w:r>
-        <w:rPr>
-          <w:i/>
-        </w:rPr>
-        <w:t>whether</w:t>
-      </w:r>
-      <w:r>
-        <w:rPr/>
-        <w:t xml:space="preserve"> the boy would squeak, but </w:t>
-      </w:r>
-      <w:r>
-        <w:rPr>
-          <w:i/>
-        </w:rPr>
-        <w:t>how many weeks</w:t>
-      </w:r>
-      <w:r>
-        <w:rPr/>
-        <w:t xml:space="preserve"> until Antony’s laugh bought him cheap. Underestimation had changed costume. It had not retired.</w:t>
-      </w:r>
-    </w:p>
-    <w:p>
-      <w:r>
-        <w:rPr/>
-        <w:t>Cicero’s smile held. “They are still exercising,” he murmured, to no one in particular. “Tell me when the exercise stops amusing them.”</w:t>
+        <w:t>“Neither will I,” Cicero said lightly, as if it were a matter of taste.</w:t>
       </w:r>
     </w:p>
     <w:p>
@@ -10092,12 +10020,6 @@
     <w:p>
       <w:r>
         <w:rPr/>
-        <w:t>He posted continuity like piety: Caesar’s acts stand. Ink dried on decrees that kept the dead man’s calendar breathing. The crowd heard stability. Liberators heard a noose made of paperwork. Antony heard himself buying time. Time, in April, still felt cheaper than blood.</w:t>
-      </w:r>
-    </w:p>
-    <w:p>
-      <w:r>
-        <w:rPr/>
         <w:t>“If the boy becomes loud,” Fulvia said, “buy his friends or break them. Do not wait until the wine shops stop laughing.”</w:t>
       </w:r>
     </w:p>
@@ -10117,18 +10039,6 @@
       <w:r>
         <w:rPr/>
         <w:t>“Shadow,” Antony repeated, amused, tasting an officer’s old joke secondhand. “Even better. Shadows don’t hold fasces.”</w:t>
-      </w:r>
-    </w:p>
-    <w:p>
-      <w:r>
-        <w:rPr/>
-        <w:t>A clerk asked whether the Campania rumour should be answered in writing. Antony waved him off. Writing gave squeaks a shape. He preferred them as jokes told over wine, already half forgotten by morning.</w:t>
-      </w:r>
-    </w:p>
-    <w:p>
-      <w:r>
-        <w:rPr/>
-        <w:t>The veteran’s careful sentence sat in the room like an unopened letter. Antony didn’t open it. He had a city to drink into loyalty, and a name he still thought belonged to a corpse and a posting board.</w:t>
       </w:r>
     </w:p>
     <w:p>
@@ -10429,19 +10339,13 @@
     <w:p>
       <w:r>
         <w:rPr/>
-        <w:t>“I price living seals,” Hordeonius said. “Mothers rewriting decrees are politics. Politics I charge for seats near. Eagle men who refuse a purse are weather. Watch which weather arrives with coin.”</w:t>
-      </w:r>
-    </w:p>
-    <w:p>
-      <w:r>
-        <w:rPr/>
         <w:t>The Puteoli man wiped his brow. “You weigh a dead man like a sack of grain.”</w:t>
       </w:r>
     </w:p>
     <w:p>
       <w:r>
         <w:rPr/>
-        <w:t>Hordeonius’s stylus paused, then kept writing. “Then don’t mourn on my stool. Watch which veterans take the boy’s pay. Watch which paper arrives from Antium smelling like Servilia’s people.” Sosia, who had heard this speech in three markets, went back to counting coin. “I sell you which rumour empties a purse first. Certainty costs extra, and I don’t stock it.”</w:t>
+        <w:t>Hordeonius’s stylus paused, then kept writing. “Then don’t mourn on my stool. I sell you which rumour empties a purse first. Certainty costs extra, and I don’t stock it.”</w:t>
       </w:r>
     </w:p>
     <w:p>
@@ -10799,12 +10703,6 @@
     <w:p>
       <w:r>
         <w:rPr/>
-        <w:t>Antony’s man caught up three steps later, voice lowered for a bargain that wanted to sound like care. “We can take you on the road as safety, guard the skin, eat with the column. Capua unpaid is a debt someone else can carry if you stand where the purse stands.” Laberius stopped long enough to make refusal look like thought. “I don’t gift my boots to a purse,” he said. “I listen for which purse still dates dirt.” He walked on. The offer followed a pace, then died. Gift-for-safety was still a transfer. He refused it and kept the road.</w:t>
-      </w:r>
-    </w:p>
-    <w:p>
-      <w:r>
-        <w:rPr/>
         <w:t>On the road edge an older veteran, scar through the lip, no agent’s polish, spat dust and spoke to the corporal only after Laberius was far enough to overhear without being invited. “Old eagles don’t take the boy’s pay yet. Wine shops still call him a shadow with a seal. When the shadow learns to feed us, we’ll talk. Until then Antony’s skin tastes familiar.”</w:t>
       </w:r>
     </w:p>
@@ -10956,7 +10854,7 @@
     <w:p>
       <w:r>
         <w:rPr/>
-        <w:t>He left praising everyone. Praise was the only exit from rooms that had already decided without you. In the colonnade the same two clients were still there, no longer whispering. “Told you,” the first said. “She cut it. Hilarus moved. Cicero advised, and the family did not need him.” The second laughed once, short. “Pretty light. Ugly house.” Cicero walked past with the smile still on and their verdict already written in his ears. On the road he began composing, already, the letter to Atticus that would make him central again on the page. Antium had already taught him how little the page weighed when Servilia moved a clause.</w:t>
+        <w:t>He left praising everyone. Praise was the only exit from rooms that had already decided without you. On the road he began composing, already, the letter to Atticus that would make him central again on the page.</w:t>
       </w:r>
     </w:p>
     <w:p>
@@ -11374,17 +11272,27 @@
     <w:p>
       <w:r>
         <w:rPr/>
-        <w:t xml:space="preserve">The mate did not let the snort die alone. He spat over the rail, careful of wind, and spoke for the two boys coiling line who had heard </w:t>
+        <w:t xml:space="preserve">Trebonius had written from Smyrna in June, and Cassius had the letter in his belt and had read it more often than it deserved. The figs were as good as promised. The walls were better. The province paid its dues on time, which no province had ever done for Trebonius before, and he suspected a trick. </w:t>
       </w:r>
       <w:r>
         <w:rPr>
           <w:i/>
         </w:rPr>
-        <w:t>collecting</w:t>
-      </w:r>
-      <w:r>
-        <w:rPr/>
-        <w:t xml:space="preserve"> and not known whether to laugh. “Collecting means cities pay. Cities paying means we eat. Fleeing means we starve and call it philosophy. Tell your senators that when they stamp receipts.” One boy grinned. The other looked at Brutus’s courtesy like a second religion.</w:t>
+        <w:t>Dolabella is still in Italy, borrowing</w:t>
+      </w:r>
+      <w:r>
+        <w:rPr/>
+        <w:t xml:space="preserve">, he wrote. </w:t>
+      </w:r>
+      <w:r>
+        <w:rPr>
+          <w:i/>
+        </w:rPr>
+        <w:t>When he comes through I shall feed him and wave. Come and eat my figs on your way to wherever you are going. Bring Brutus. Do not let him bring a book.</w:t>
+      </w:r>
+      <w:r>
+        <w:rPr/>
+        <w:t xml:space="preserve"> Cassius had not answered it yet. Asia would be the first place they went for silver, and the first door he knocked on there would be a friend’s.</w:t>
       </w:r>
     </w:p>
     <w:p>
@@ -11675,7 +11583,7 @@
     <w:p>
       <w:r>
         <w:rPr/>
-        <w:t>“Marcus Cicero,” he said. “The son. Not the one who writes.” He grinned. “My father writes to me twice a week about my debts and my drinking and my Greek, in that order. He writes to you about the Republic. I thought you should know we’re on the same list.”</w:t>
+        <w:t>“Marcus Cicero,” he said. “The son. Not the one who writes.” He grinned. “My father writes to me twice a week about my debts and my drinking and my Greek, in that order. He writes to you about the Republic. I thought you should know we’re on the same list.” He was enjoying himself. “Trebonius came through in the spring on his way to Asia. He took me to dinner and wrote my father that I was a reformed character. My father believed him for almost a month.”</w:t>
       </w:r>
     </w:p>
     <w:p>
@@ -12709,25 +12617,13 @@
     <w:p>
       <w:r>
         <w:rPr/>
-        <w:t>A southern courier arrived near dusk with dust on his cloak and a packet that smelled of harbour pitch. The queen was home in Alexandria, boy and all, months gone from Caesar’s gardens, and her people were calling it continuity to anyone who asked, not flight. The courier said it like marketplace weather. Decimus did not chase the rumour across the sea. He had hinges. He had Antony’s hunger. He set the packet under the stone with Antony’s courtesy-threats. What the queen meant to do with Egypt was Egypt’s business until it had ships in his harbour.</w:t>
-      </w:r>
-    </w:p>
-    <w:p>
-      <w:r>
-        <w:rPr/>
-        <w:t>Cicero’s latest letter, opened on the same stone, carried a margin note in Cicero’s own hand, unease, not fact. Sextus still held, or seemed to hold, the western sea’s knife; do not invent a Republic that ignores fleets. A second report under the note claimed Sextus finished. Cicero had kept both coals. Decimus kept the contradiction as one more unfinished edge on a board already loud with Antony. He almost smiled at philosophers discovering docks. The smile died when he remembered his own thinning chest.</w:t>
-      </w:r>
-    </w:p>
-    <w:p>
-      <w:r>
-        <w:rPr/>
-        <w:t>A different courier asked whether to answer Antony’s latest written “request” with softness. Decimus chose a sentence that sounded like law and felt like a door barred from inside.</w:t>
-      </w:r>
-    </w:p>
-    <w:p>
-      <w:r>
-        <w:rPr/>
-        <w:t>The sentence did not need an answer. A rider came up the Via Aemilia from Ariminum with his horse lathered to the girth: Antony had left Rome with what the boy had left him of the Macedonian legions and was on the road north. Not hurrying. That was worse.</w:t>
+        <w:t>A southern courier arrived near dusk with a packet that smelled of harbour pitch. The queen was home in Alexandria, boy and all, months gone from Caesar’s gardens. Decimus set the packet under the stone with Antony’s courtesy-threats. Egypt was Egypt’s business until it had ships in his harbour.</w:t>
+      </w:r>
+    </w:p>
+    <w:p>
+      <w:r>
+        <w:rPr/>
+        <w:t>A rider came up the Via Aemilia from Ariminum with his horse lathered to the girth: Antony had left Rome with what the boy had left him of the Macedonian legions and was on the road north. Not hurrying. That was worse.</w:t>
       </w:r>
     </w:p>
     <w:p>
@@ -12909,7 +12805,7 @@
     <w:p>
       <w:r>
         <w:rPr/>
-        <w:t>That night a courier brought Plancus’s newest courtesy, dated after a thaw that had not begun. Decimus set it under the same stone as Antony’s old threats, and wrote fewer letters that pretended optimism. He walked the walls with a cloak that did not keep the Ides out. The deed felt far and stupidly intimate, a debt owed a corpse who had trusted his cheer. An aide offered wine. Decimus refused, then took half a cup anyway. Below, Antony’s fires multiplied.</w:t>
+        <w:t>That night a courier brought Plancus’s newest courtesy, dated after a thaw that had not begun. Decimus set it under the same stone as Antony’s old threats and wrote to Cicero, and for the first time he did not round. Grain for so many days at full ration, so many at half. The oxen salted. The horses next. He knew what the figure would do in Rome. It would frighten the fathers, and frightened fathers reached for the nearest army, and the nearest army belonged to a boy of nineteen who called himself Caesar’s son and had not forgiven anyone who stood in the Curia that morning. A rounder number would keep the boy out of it a month longer, and might starve the town. Decimus looked at the true one until the lamp guttered. Then he sealed it and gave it to a man who could swim the river under the ice with the tablet in a bladder at his neck. Below, Antony’s fires multiplied.</w:t>
       </w:r>
     </w:p>
     <w:p>
@@ -12931,6 +12827,12 @@
       <w:r>
         <w:rPr/>
         <w:t>The consuls’ chairs had new men in them. Antony’s year was over; Antony was in a ditch outside Mutina. Hirtius sat wrapped too warmly, the spring’s sickness still in his cheekbones. Octavian had read his last book of the Gallic war at Apollonia and privately thought it better than the dead man’s. Pansa sat beside him, broad and plain, a list of recruits and pay open on his knee before the auspices were cold. Cicero had two consuls and wanted a third blade to go with them.</w:t>
+      </w:r>
+    </w:p>
+    <w:p>
+      <w:r>
+        <w:rPr/>
+        <w:t>Cicero began with a letter. He held it up so the benches could see the seal, Decimus Brutus’s, brought out of Mutina by a swimmer, and read one line of it in a voice gone plain: the grain, in days. Octavian, on the threshold, heard the fathers hear it. Caesar’s murderer was hungry behind a wall, and his hunger was the best argument anyone had yet made for Caesar’s son.</w:t>
       </w:r>
     </w:p>
     <w:p>
@@ -13004,13 +12906,31 @@
     <w:p>
       <w:r>
         <w:rPr/>
-        <w:t>Agrippa stood where the Curia fringe still smelled of wet wool and ambition. Close enough to hear Pacuvius’s name travel in a courier’s mutter, Antony’s storm-man still pricing timing at Mutina. Far enough that senators could pretend the boy arrived alone. A sweating senator wanted Octavian to smile gratitude. Agrippa did not move. Octavian kept his own nod thin.</w:t>
-      </w:r>
-    </w:p>
-    <w:p>
-      <w:r>
-        <w:rPr/>
-        <w:t>Afterwards a senator clasped his arm and called him the Republic’s luck. Octavian returned the clasp at half strength. Half strength still looked like gratitude if you did not measure. Agrippa’s stillness held until the clasp ended. Only then did he match pace toward the vendor street. A northern courier’s fragments stayed unmerged in Octavian’s hand: Decimus holding, Antony digging, Pacuvius still hungry for storm. Cicero left looking like a man certain he had saved the Republic. Outside, a vendor sold hot food and called no one Caesar. Octavian heard him and didn’t correct him.</w:t>
+        <w:t>Afterwards a senator clasped his arm and called him the Republic’s luck. Octavian returned the clasp at half strength. Half strength still looked like gratitude if you did not measure.</w:t>
+      </w:r>
+    </w:p>
+    <w:p>
+      <w:r>
+        <w:rPr/>
+        <w:t>“You’ll march to get Decimus out,” Agrippa said on the steps, low. It was not quite a question. “The man who walked him in.”</w:t>
+      </w:r>
+    </w:p>
+    <w:p>
+      <w:r>
+        <w:rPr/>
+        <w:t>Octavian watched the fathers go down into the Forum in twos and threes, Cicero among them, looking like a man certain he had saved the Republic. He thought of the oath at the Temple of Castor and the veterans walking away with his money in their belts. They had not enrolled to kill a consul. They might march to open a town.</w:t>
+      </w:r>
+    </w:p>
+    <w:p>
+      <w:r>
+        <w:rPr/>
+        <w:t>“I’ll march to be there when he comes out,” he said. “Somebody should see his face.”</w:t>
+      </w:r>
+    </w:p>
+    <w:p>
+      <w:r>
+        <w:rPr/>
+        <w:t>Outside, a vendor sold hot food and called no one Caesar. Octavian heard him and didn’t correct him.</w:t>
       </w:r>
     </w:p>
     <w:p>
@@ -13170,7 +13090,7 @@
     <w:p>
       <w:r>
         <w:rPr/>
-        <w:t>Amyntas went. He took the books.</w:t>
+        <w:t>Amyntas went. He took the city’s books. He did not take the other one, the small book of the temple of Nemesis, where the dowries of the city’s orphan girls were kept, which lived under the floor of his own house because the temple roof leaked. Nobody had asked for it. Crossing the agora, with the chair at the top of the steps, he decided that nobody would.</w:t>
       </w:r>
     </w:p>
     <w:p>
@@ -13697,37 +13617,13 @@
     <w:p>
       <w:r>
         <w:rPr/>
-        <w:t>“Count what?” said the man behind them. “Five hundred from the boy at Capua to stand in this.”</w:t>
-      </w:r>
-    </w:p>
-    <w:p>
-      <w:r>
-        <w:rPr/>
-        <w:t>“Five hundred beats Antony’s hundred,” Vibius said. Laberius had taken the boy’s coin in the end, in the autumn, when the shadow with a seal learned to feed men. It had bought his boots for the young Caesar’s ranks and this ditch. It had not moved the twine.</w:t>
-      </w:r>
-    </w:p>
-    <w:p>
-      <w:r>
-        <w:rPr/>
-        <w:t>Pay talk lived under the noise like a second drum. Who owed donatives. Which Caesar’s name still fed mouths. Whether Hirtius’s clean reputation meant Rome finally understood mud. Capua still sat in Laberius’s boots as an unpaid date. A boy from another century asked if they were fighting for the Senate or for bread. Laberius said, “Fight for the man on your left. Capua argues later, if later still has a road.”</w:t>
-      </w:r>
-    </w:p>
-    <w:p>
-      <w:r>
-        <w:rPr/>
-        <w:t>Between assaults, when the yelling thinned and the cold found room, Vibius and two men from the contubernium talked dirt the way other men talked gods. “Capua was a date when the paymaster breathed,” Vibius said, voice flat. Mud did not buy jokes. “Now Capua is only what we stand in.” The second man wiped pink melt from his shield rim. “Still wants a road, if we live.” Laberius did not finish the thought aloud. Finishing would have made Capua a speech. He kept his century from becoming a gap. When a signal dipped wrong in the wet air, he held the line anyway.</w:t>
-      </w:r>
-    </w:p>
-    <w:p>
-      <w:r>
-        <w:rPr/>
         <w:t>Yell-rumours arrived before facts. Someone claimed a consul down. Someone claimed both. Someone claimed a victory large enough to make the ditch look like a lie. Laberius believed the ache in his forearms and nothing else. Until mid-afternoon, when a staff officer he recognised from Hirtius’s tent came past on a blown horse, cloak dark with more than rain, and said to a tribune three paces from Laberius’s ear: “The consul Hirtius is dead. I held his shoulder. Do not invent a better story.”</w:t>
       </w:r>
     </w:p>
     <w:p>
       <w:r>
         <w:rPr/>
-        <w:t>That was one fact Laberius could keep: Hirtius down, confirmed by a man who had touched him. Pansa’s name still swam in the yell-water, wounded, dying, fine, poisoned, blessed. “They carried him off at Forum Gallorum,” Vibius said. “A week back. Javelin in the side. I ran beside the litter. I didn’t see inside it.” Laberius didn’t promote any Pansa version. Vibius had a litter. Nobody had a shoulder.</w:t>
+        <w:t>That was one fact Laberius could keep: Hirtius down, confirmed by a man who had touched him. Pansa’s name still swam in the yell-water, wounded, dying, fine, poisoned, blessed. Vibius had run beside a litter a week ago and seen a curtain. Nobody had a shoulder.</w:t>
       </w:r>
     </w:p>
     <w:p>
@@ -13852,6 +13748,12 @@
     <w:p>
       <w:r>
         <w:rPr/>
+        <w:t>Seius’s interest came in on the same day, a day before it was due, carried by his doorkeeper, an old man called Dromo who counted it out on the board himself and then watched Hordeonius count it again. The extra half in the hundred was there. It had been there every month since the Ides. Seius no longer came in person. Hordeonius entered it under the farm he had asked for and not been given, and thought, not for the first time, that a man who paid that much to keep his wife’s father’s fields was either a fool or the best risk on his tablets.</w:t>
+      </w:r>
+    </w:p>
+    <w:p>
+      <w:r>
+        <w:rPr/>
         <w:t xml:space="preserve">Sosia brought a tablet up from the Carinae end of the Sacred Way: Fulvia’s paper, and her steward asking for a month. “The Senate has voted her husband an enemy,” Sosia said. “Everybody on the Janus is calling her in.” Hordeonius called it in, in full, charged the steward a fee for the haste, and wrote the fee under </w:t>
       </w:r>
       <w:r>
@@ -14411,19 +14313,13 @@
     <w:p>
       <w:r>
         <w:rPr/>
-        <w:t>“Let them,” Decimus said. “We take the west fork before dark. The east ford is watched, I smelled horse-lines on the wind this morning. Plancus has crossed. Lepidus’s man returned the tablet. We do not wait for dates that practise absence.”</w:t>
-      </w:r>
-    </w:p>
-    <w:p>
-      <w:r>
-        <w:rPr/>
-        <w:t>The second aide, older, tablet-hand still inked from Mutina’s last courtesy copy, had kept back the news from the south until the bridge was behind them. In May Lepidus’s legions had waded the river to embrace Antony, and Lepidus had written to the Senate that his soldiers did it. And the boy would not share a road with the man who had held Caesar’s door, and had said so where his centurions could hear.</w:t>
-      </w:r>
-    </w:p>
-    <w:p>
-      <w:r>
-        <w:rPr/>
-        <w:t>Decimus heard it as one more door that had closed while he counted hinges. “Then we do not invent a name for hope,” he said. The first aide opened his mouth on another complaint. Decimus was already counting remaining waterskins aloud, making the count the argument beside the named absences. At a crossroads shrine someone had left a cheap wreath for “the liberators.” Rain had ruined it. Decimus didn’t stop to fix it. He checked his horse’s mouth for sores and found none.</w:t>
+        <w:t>“Let them,” Decimus said. “We take the west fork before dark. The east ford is watched. I smelled horse-lines on the wind this morning.”</w:t>
+      </w:r>
+    </w:p>
+    <w:p>
+      <w:r>
+        <w:rPr/>
+        <w:t>At a crossroads shrine someone had left a cheap wreath for “the liberators.” Rain had ruined it. Decimus didn’t stop to fix it. He checked his horse’s mouth for sores and found none.</w:t>
       </w:r>
     </w:p>
     <w:p>
@@ -14748,6 +14644,30 @@
     <w:p>
       <w:r>
         <w:rPr/>
+        <w:t>While he ate, Octavia gave him the household news, the way she had put it in letters he had not had time to read. Calpurnia had gone to her father’s. The old house’s freedmen were scattered: one keeping a wine shop by the Circus, two gone to Lepidus with the Domus, one girl in Antony’s kitchen on the Carinae.</w:t>
+      </w:r>
+    </w:p>
+    <w:p>
+      <w:r>
+        <w:rPr/>
+        <w:t>“She counted heads at your games for his steward,” Octavia said. “Matius heard it. Somebody laughed at the number at Antony’s dinner.”</w:t>
+      </w:r>
+    </w:p>
+    <w:p>
+      <w:r>
+        <w:rPr/>
+        <w:t>Octavian swallowed. He remembered the cheap rows standing. “What’s her name?”</w:t>
+      </w:r>
+    </w:p>
+    <w:p>
+      <w:r>
+        <w:rPr/>
+        <w:t>Octavia did not know. Octavian looked past her at Agrippa, who nodded once and wrote nothing down, which meant he would remember.</w:t>
+      </w:r>
+    </w:p>
+    <w:p>
+      <w:r>
+        <w:rPr/>
         <w:t>The senators came to meet him in the afternoon. They came in twos and threes, in their bordered togas, and made speeches on the steps about the Republic and the young Caesar’s piety, and Octavian thanked each of them by name, because he had learned all their names in the winter from Cicero’s letters and Agrippa’s lists. Some of them had voted a week before to send the African legions out against him. They did not mention it. He did not mention it either.</w:t>
       </w:r>
     </w:p>
@@ -14815,6 +14735,22 @@
       <w:r>
         <w:rPr/>
         <w:t>“Honours after the line is fed,” he said.</w:t>
+      </w:r>
+    </w:p>
+    <w:p>
+      <w:r>
+        <w:rPr/>
+        <w:t xml:space="preserve">One man in the line he remembered afterwards. A centurion in boots resoled more than once came up with his century on the second afternoon, took his coin, made his mark, and then did not move on. He asked the clerk whether the roll still had his plot on it, by Capua, fourth line from the Volturnus road. The clerk found it with his thumb and said that the stones were a matter for after. The centurion nodded as if he had expected nothing else and went away with the coin in his fist. </w:t>
+      </w:r>
+      <w:r>
+        <w:rPr>
+          <w:i/>
+        </w:rPr>
+        <w:t>Laberius</w:t>
+      </w:r>
+      <w:r>
+        <w:rPr/>
+        <w:t>, the clerk had written. Octavian had the line copied on to a separate tablet and put it with the list of his father’s freedmen that Agrippa was making, and could not have said why.</w:t>
       </w:r>
     </w:p>
     <w:p>
@@ -14918,22 +14854,6 @@
     <w:p>
       <w:r>
         <w:rPr/>
-        <w:t xml:space="preserve">A senator who had voted him an ovation and then forgotten to pay for it called him the gods’ gift and waited for a smile of destiny. Octavian looked at him until the man found something to do with his hands. A soldier shouted the name </w:t>
-      </w:r>
-      <w:r>
-        <w:rPr>
-          <w:i/>
-        </w:rPr>
-        <w:t>Caesar</w:t>
-      </w:r>
-      <w:r>
-        <w:rPr/>
-        <w:t xml:space="preserve"> as paymaster; Octavian didn’t bow to it like a hymn. He let the shout stand because paymaster was a job his hands already understood better than luck.</w:t>
-      </w:r>
-    </w:p>
-    <w:p>
-      <w:r>
-        <w:rPr/>
         <w:t>By autumn a courier brought Decimus’s end in two lines: a ford in the hills, and somebody’s purse. Octavian did not ask whose. It was enough for the ranks that the last Liberator in Italy was gone, and the north had no one left to hold it but Antony and Lepidus. In the same week a tablet came under two seals pressed side by side in the same wax, Lepidus’s and Antony’s: talk, on the river island below Bononia, between the camps, where no city could listen.</w:t>
       </w:r>
     </w:p>
@@ -16023,7 +15943,7 @@
     <w:p>
       <w:r>
         <w:rPr/>
-        <w:t>Seius closed his eyes. The farm was where his wife’s father had been born, Hordeonius knew. He knew because Seius had pledged it once before and taken it back, years ago, when the canvass still looked like a road to a statue.</w:t>
+        <w:t>Seius closed his eyes. The farm was where his wife’s father had been born, Hordeonius knew. He knew because he had asked for it once before, the week after the Ides, and Seius had paid an extra half in the hundred every month since rather than give it.</w:t>
       </w:r>
     </w:p>
     <w:p>
@@ -16872,7 +16792,17 @@
     <w:p>
       <w:r>
         <w:rPr/>
-        <w:t>She gave Fulvia’s woman the true number, as near as she could make it. Fulvia’s woman wrote it down and did not thank her. Nysa found she had not wanted thanks.</w:t>
+        <w:t xml:space="preserve">She gave Fulvia’s woman the true number, as near as she could make it. Fulvia’s woman wrote it down and did not thank her. She wrote it on a tablet that already had a column on it, and Nysa, who had learned to read upside down in the Domus, slowly, saw what the column was: the names of the men who had called in the mistress’s paper in the spring, when the Senate voted the master an enemy. Near the top, in a clean hand, </w:t>
+      </w:r>
+      <w:r>
+        <w:rPr>
+          <w:i/>
+        </w:rPr>
+        <w:t>Hordeonius, at the Janus</w:t>
+      </w:r>
+      <w:r>
+        <w:rPr/>
+        <w:t>. Fulvia’s woman saw her see it and did not cover it. Nysa found she had not wanted thanks.</w:t>
       </w:r>
     </w:p>
     <w:p>
@@ -16969,6 +16899,12 @@
       <w:r>
         <w:rPr/>
         <w:t>“Smyrna will owe me,” he said. “Not today. Today it owes me nothing, because it has nothing, and I don’t waste clerks. Stay. Watch. When this is done you can tell your council what you saw, and then they’ll know what the sum is for.”</w:t>
+      </w:r>
+    </w:p>
+    <w:p>
+      <w:r>
+        <w:rPr/>
+        <w:t>Amyntas thought of the small book under his floor, the orphans’ dowries, which Dolabella had never asked for, and said nothing. Cassius’s eyes rested on him a moment longer, as if there were a line in the account he had not been given. Then they moved on.</w:t>
       </w:r>
     </w:p>
     <w:p>
@@ -17155,7 +17091,7 @@
     <w:p>
       <w:r>
         <w:rPr/>
-        <w:t>Before the audience closed, a courier from the west came in, dust, salt, a seal cracked by too many hands, with three tablets that did not agree. Mutina won and lost. Consuls dead. Lists in Italy. The boy with fasces, and a court in his consulship that had called the names of every man of March, Cassius’s among them, to empty benches and condemned the benches. Antony still breathing, and the three of them looking east. One tablet named Decimus without poetry: gone, or going.</w:t>
+        <w:t>Before the audience closed, a courier from the west came in, dust, salt, a seal cracked by too many hands, with three tablets that did not agree. Mutina won and lost. Lists in Italy. The boy with fasces, and a court that had condemned every man of March, Cassius among them, to empty benches. One tablet named Decimus without poetry: gone, or going.</w:t>
       </w:r>
     </w:p>
     <w:p>
@@ -17191,12 +17127,6 @@
       </w:r>
     </w:p>
     <w:p>
-      <w:r>
-        <w:rPr/>
-        <w:t>On the steps, wind off the harbour tried to steal a paper. Cassius pinned it with a thumb and didn’t smile. Escaped papers became other men’s geometry. He preferred his own, even when his own now held Decimus as an open wound in the column.</w:t>
-      </w:r>
-    </w:p>
-    <w:p>
       <w:pPr>
         <w:spacing w:before="200"/>
       </w:pPr>
@@ -17296,7 +17226,7 @@
     <w:p>
       <w:r>
         <w:rPr/>
-        <w:t>Cassius, somewhere else on the same war, would call this necessity, and would, Brutus guessed, already be entering west names as debits. Brutus called it necessity too, and hated that their mouths agreed while their sleep did not. Sleep, unlike coinage, still refused to clear. In the dark he held the warm coin until it cooled, then put it away.</w:t>
+        <w:t>In the dark he held the warm coin until it cooled, then put it away.</w:t>
       </w:r>
     </w:p>
     <w:p>
@@ -18016,6 +17946,24 @@
     <w:p>
       <w:r>
         <w:rPr/>
+        <w:t>Before the trumpets a centurion of the Second came to his horse at the head of the cut, mud to the thigh, with a gap where his front teeth should have been. His century had dug for ten nights. He wanted it at the far end of the causeway, where the boy’s lent cohorts would come up out of the reeds beside Antony’s own.</w:t>
+      </w:r>
+    </w:p>
+    <w:p>
+      <w:r>
+        <w:rPr/>
+        <w:t>“There’s a man of theirs I owe a marsh,” he said. “Laberius. He put me in the reeds at Forum Gallorum when he could have put me in the ground. I’d like him on my left.”</w:t>
+      </w:r>
+    </w:p>
+    <w:p>
+      <w:r>
+        <w:rPr/>
+        <w:t>Antony had meant the Second for the push on the hill. He looked at the gap in the man’s teeth, and at the boy’s standards in the reeds where none of his own men wanted to stand, and laughed, the first time that day. “Take the end,” he said. “If he runs, put him back in the reeds yourself.” The Second went into the cut, and the hill waited a quarter of an hour for its weight.</w:t>
+      </w:r>
+    </w:p>
+    <w:p>
+      <w:r>
+        <w:rPr/>
         <w:t>He rode the near wing until the dust made faces into guesses. “Weight left,” he told a tribune, hand chopping air. “Do not chase the pretty gap. Fill it. Timing, not poetry.” The tribune’s mouth opened on a question; Antony was already past him. Omens were for the tents. On the field he trusted weight and the sound of men who still obeyed.</w:t>
       </w:r>
     </w:p>
@@ -18049,7 +17997,7 @@
     <w:p>
       <w:r>
         <w:rPr/>
-        <w:t>Dust found every gap in Laberius’s teeth; the eagle staff was the only upright fact he trusted. The young Caesar’s men had been lent to the spades, so it was Antony’s marsh his century stood in this morning. Behind him, from the north, the shouting said the boy’s own camp was gone, tents, mules and Laberius’s spare tunic with it.</w:t>
+        <w:t>Dust found every gap in Laberius’s teeth; the eagle staff was the only upright fact he trusted. The young Caesar’s men had been lent to the spades, so it was Antony’s marsh his century stood in this morning. Behind him, from the north, the shouting said the boy’s own camp was gone, tents, mules and Laberius’s spare tunic with it. On his left, where Gaius used to stand, stood a gap-toothed centurion of the Second, who had come up out of the cut at first light and taken the place without asking. “Cordus,” Rufrius had said, and nothing else. Laberius had let him stand there. Antony’s man, the boy’s line: this morning it came to the same marsh.</w:t>
       </w:r>
     </w:p>
     <w:p>
@@ -18128,7 +18076,7 @@
     <w:p>
       <w:r>
         <w:rPr/>
-        <w:t>The runner came back empty-mouthed. No second count. Only another man who had heard the first yell secondhand and wanted to be useful by repeating it louder. A friend, attendant, someone with too much loyalty and not enough eyes, tried to amend the first report and only added fog. Brutus’s success, if it existed beyond the lying air, did not fit in either throat.</w:t>
+        <w:t>The runner came back empty-mouthed. No second count. Only another man who had heard the first yell secondhand and wanted to be useful by repeating it louder.</w:t>
       </w:r>
     </w:p>
     <w:p>
@@ -18180,7 +18128,7 @@
     <w:p>
       <w:r>
         <w:rPr/>
-        <w:t>He didn’t speechify liberty. He didn’t correct the map. He treated the incomplete report as closed by belief. He closed the account the only way left.</w:t>
+        <w:t>He closed the account the only way left.</w:t>
       </w:r>
     </w:p>
     <w:p>
@@ -18287,7 +18235,7 @@
     <w:p>
       <w:r>
         <w:rPr/>
-        <w:t>He refused the cleaner hill. The knot shrank. The breath got shorter. The officer’s face went from hope to something flatter. Brutus held what he could until what he could was a shrinking knot that no philosophy could stiffen again. Only then, at dusk, with nothing left on the plain to hold, did he take what remained up into the hills behind the line: the retreat the morning had refused, now with no day left to save.</w:t>
+        <w:t>He refused the cleaner hill. The knot shrank. The officer’s face went from hope to something flatter. Only then, at dusk, with nothing left on the plain to hold, did Brutus take what remained up into the hills behind the line: the retreat the morning had refused, now with no day left to save.</w:t>
       </w:r>
     </w:p>
     <w:p>
@@ -18364,19 +18312,13 @@
     <w:p>
       <w:r>
         <w:rPr/>
-        <w:t>When someone tried to crown him with the day’s glory in a sentence, Octavian kept breathing and didn’t bow. Sweat ran into the corner of his mouth; he swallowed it and asked Agrippa for the next count of the ditch.</w:t>
-      </w:r>
-    </w:p>
-    <w:p>
-      <w:r>
-        <w:rPr/>
         <w:t>Fever eased, later, into a thin clarity on the road-edge of the camp. “They will want farms,” Agrippa said, Italian soil, promises already louder than the plain’s dust.</w:t>
       </w:r>
     </w:p>
     <w:p>
       <w:r>
         <w:rPr/>
-        <w:t>“They will want farms that belong to someone else,” Octavian said. He didn’t dress it. He kept one hand flat on the list of promised acres until the paper stopped fluttering. Paper would not hold the soil still. That was the next war’s seed, held in the same breath as survival. He did not invent a destiny for it. He named the want. He kept breathing.</w:t>
+        <w:t>“They will want farms that belong to someone else,” Octavian said. He didn’t dress it. He kept one hand flat on the list of promised acres until the paper stopped fluttering. Paper would not hold the soil still. That was the next war’s seed.</w:t>
       </w:r>
     </w:p>
     <w:p>
@@ -18464,12 +18406,6 @@
       <w:r>
         <w:rPr/>
         <w:t>A tribune mentioned Italian land assignments, farms, promises. Antony waved it toward tomorrow with the same hand he had used to point cohorts. “The boy’s tomorrow. Italy will wait. Italy always complains. The East is bleeding now.”</w:t>
-      </w:r>
-    </w:p>
-    <w:p>
-      <w:r>
-        <w:rPr/>
-        <w:t>By the tent-flap, a cup further into the wine than his rank allowed, a junior officer said it to the horse-holder loud enough to carry: “Italy always complains until it bills you in veterans who know which farms have owners.” The horse stamped. Antony heard it, laughed once, short, and went back to the map.</w:t>
       </w:r>
     </w:p>
     <w:p>
@@ -18533,6 +18469,12 @@
       <w:r>
         <w:rPr/>
         <w:t>, and behind both a Sabine farm that had been an old man’s birthplace. He thought of Visellius on his floor, and of the copies he had taken that no magistrate had ever asked for. No one had solved Visellius. Civil war did not keep a magistrate free for a moneylender’s throat.</w:t>
+      </w:r>
+    </w:p>
+    <w:p>
+      <w:r>
+        <w:rPr/>
+        <w:t>Last winter a woman of Fulvia’s, the one who counted the mistress’s silver, had stopped at the stall with a basket on her arm, asked very politely what his rate was on a month, and gone away without borrowing. Sosia had laughed. Hordeonius had not. Antony did not keep ledgers.</w:t>
       </w:r>
     </w:p>
     <w:p>

</xml_diff>

<commit_message>
Regenerate Book 1 reading docx; Gate 1 evidence after Ides trim
Co-Authored-By: Claude Opus 5.5 (1M context) <noreply@anthropic.com>
Claude-Session: https://claude.ai/code/session_017PPzq48x9ej1eVbGkBuBjj
</commit_message>
<xml_diff>
--- a/exports/Ides_Book1_FULL_Ch01-36.docx
+++ b/exports/Ides_Book1_FULL_Ch01-36.docx
@@ -27,7 +27,7 @@
         <w:br/>
         <w:t>Book 1 reading export · Utica prologue, then Ch 1 dinner · ends at Philippi · author-voice (no em dash)</w:t>
         <w:br/>
-        <w:t>Source: Manuscript c58bbf0 (2026-10-24) · generated 2026-10-24 09:11 UTC from claude/project-thread-yoegy1 @ c58bbf0 · source digest 6b7c7d557c5dbe5d · prologue, chapters 1–36, historical note and cast</w:t>
+        <w:t>Source: Manuscript 5f49eb2 (2026-10-24) · generated 2026-10-24 09:41 UTC from claude/project-thread-yoegy1 @ 5f49eb2 · source digest f079248c437c5713 · prologue, chapters 1–36, historical note and cast</w:t>
       </w:r>
     </w:p>
     <w:p>
@@ -5571,7 +5571,7 @@
       </w:r>
       <w:r>
         <w:rPr/>
-        <w:t xml:space="preserve"> and was hushed by an older one. Phileros’s keys answered from farther off. The house was refusing ordinary night. Not yet the knife.</w:t>
+        <w:t xml:space="preserve"> and was hushed by an older one. Phileros’s keys answered from farther off.</w:t>
       </w:r>
     </w:p>
     <w:p>
@@ -5853,7 +5853,7 @@
     <w:p>
       <w:r>
         <w:rPr/>
-        <w:t>In the atrium Calpurnia’s fear was already a climate. Caesar stood dressed enough for the street, the unfinished stack of tablets behind him like a second, quieter Senate. Nysa had followed as far as the useful edge. Decimus counted what the room wanted. Caesar’s ease. Calpurnia’s grip on the doorframe. Phileros’s keys. Nysa’s empty hands still unfinished.</w:t>
+        <w:t>In the atrium Calpurnia’s fear was already a climate. Caesar stood dressed enough for the street, the unfinished stack of tablets behind him like a second, quieter Senate. Nysa had followed as far as the useful edge. Decimus counted what the room wanted. Caesar’s ease. Calpurnia’s grip on the doorframe. Phileros’s keys.</w:t>
       </w:r>
     </w:p>
     <w:p>
@@ -6001,7 +6001,7 @@
     <w:p>
       <w:r>
         <w:rPr/>
-        <w:t>Not as a prisoner. As a man helped over a threshold he had crossed ten thousand times. The dry warmth of the palm arrived without the laugh that should have come with the chin-tip. Decimus kept his chin still after that. The Campus route ahead would use the same trust, out past the old walls to the open plain and Pompey’s theatre, a long way for a litter; he would not spend the habit twice in one morning.</w:t>
+        <w:t>Not as a prisoner. As a man helped over a threshold he had crossed ten thousand times. The dry warmth of the palm arrived without the laugh that should have come with the chin-tip. Decimus kept his chin still after that.</w:t>
       </w:r>
     </w:p>
     <w:p>
@@ -6019,7 +6019,7 @@
     <w:p>
       <w:r>
         <w:rPr/>
-        <w:t>Caesar didn’t speak. Decimus filled the air anyway, soft logistics, the chatter of loyalty: which way, how many, Antony would be, Antony would be held. Trebonius’s job. Decimus didn’t say that. He said, “It will be a short session,” and smiled. Shortness was not mercy. It only sounded like it.</w:t>
+        <w:t>Caesar didn’t speak. Decimus filled the air anyway, soft logistics, the chatter of loyalty: which way, how many, Antony would be, Antony would be held. Trebonius’s job. Decimus didn’t say that. He said, “It will be a short session,” and smiled.</w:t>
       </w:r>
     </w:p>
     <w:p>
@@ -6055,19 +6055,13 @@
     <w:p>
       <w:r>
         <w:rPr/>
-        <w:t>Good, Decimus thought, without knowing what he was calling good. The morning was moving. Moving mornings did not tip into accusations in atriums, only into silences that would wait for the litter to return.</w:t>
-      </w:r>
-    </w:p>
-    <w:p>
-      <w:r>
-        <w:rPr/>
         <w:t>“We go,” Caesar said.</w:t>
       </w:r>
     </w:p>
     <w:p>
       <w:r>
         <w:rPr/>
-        <w:t>Decimus kept his hand available until Caesar no longer needed it, then let go as friends let go, casually. The world had narrowed to the width of a blade. Calpurnia’s cut was still lodged under the casual.</w:t>
+        <w:t>Decimus kept his hand available until Caesar no longer needed it, then let go as friends let go, casually.</w:t>
       </w:r>
     </w:p>
     <w:p>
@@ -6142,7 +6136,7 @@
     <w:p>
       <w:r>
         <w:rPr/>
-        <w:t>In the service court the sky shifted from iron to dirty pearl. Dama, the kitchen boy, claimed the sacred chickens had been sullen. Someone else said that was every morning. Nysa heard both and kept both. Forgetting was a luxury for people whose incomplete messages no longer cost them a house’s temper.</w:t>
+        <w:t>In the service court the sky shifted from iron to dirty pearl. Dama, the kitchen boy, claimed the sacred chickens had been sullen. Someone else said that was every morning. Nysa heard both and kept both.</w:t>
       </w:r>
     </w:p>
     <w:p>
@@ -6282,7 +6276,7 @@
     <w:p>
       <w:r>
         <w:rPr/>
-        <w:t>Nysa stood until the litter sound changed, swallowed by the Forum’s morning throat. Only then did she realise she was counting: steps, heartbeats, something. Numbers would not make a door stay closed.</w:t>
+        <w:t>Nysa stood until the litter sound changed, swallowed by the Forum’s morning throat. Only then did she realise she was counting: steps, heartbeats, something.</w:t>
       </w:r>
     </w:p>
     <w:p>
@@ -6294,7 +6288,7 @@
     <w:p>
       <w:r>
         <w:rPr/>
-        <w:t>Nysa didn’t put it in the fire. She returned it deeper against her skin, incomplete, childish, unopened by any dictator.</w:t>
+        <w:t>Nysa didn’t put it in the fire. She returned it deeper against her skin.</w:t>
       </w:r>
     </w:p>
     <w:p>
@@ -6420,12 +6414,6 @@
     <w:p>
       <w:r>
         <w:rPr/>
-        <w:t>She did not go to the cubiculum yet. The house wanted her to become furniture that waited. She refused that shape for one more room of air.</w:t>
-      </w:r>
-    </w:p>
-    <w:p>
-      <w:r>
-        <w:rPr/>
         <w:t>In the service court Dama swore the chickens were still sullen and that sullenness meant knives. A washerwoman from the next court leaned on the doorpost with Forum merchandise fresh that morning: Spurinna, beware, and a king-bird. “A wren,” she said. “The little one in the story that rode the eagle’s back and stole the crown. Flew into Pompey’s hall this morning with a sprig of laurel in its beak, and the other birds came after it and tore it to pieces on the step. Before the Senate even sat.” Pallas arrived with Calpurnia’s mantle. Dressing would not stop a morning.</w:t>
       </w:r>
     </w:p>
@@ -6474,19 +6462,19 @@
     <w:p>
       <w:r>
         <w:rPr/>
-        <w:t>Only then did Calpurnia walk to the cubiculum and close the door that had opened itself in the night. The latch was ordinary. Ordinary things had begun to feel like insults.</w:t>
-      </w:r>
-    </w:p>
-    <w:p>
-      <w:r>
-        <w:rPr/>
-        <w:t>“He will come back,” she told the empty bed, and hated that she had said it aloud. Speech could not hire a return. She did not invent the sound that would prove her wrong. She sat with the order she had given, and with Decimus’s chin-tip still bright behind her eyes: the little road habit that had always meant the friend would go. She practised the silence she would keep when the house tried again to make omen into conversation.</w:t>
-      </w:r>
-    </w:p>
-    <w:p>
-      <w:r>
-        <w:rPr/>
-        <w:t>The bed did not argue. From the street rose the ordinary roar of the Ides. The litter was already gone. Refusing theatre until news arrived with a body attached was all the power left.</w:t>
+        <w:t>Then Calpurnia walked to the cubiculum and closed the door that had opened itself in the night. The latch was ordinary.</w:t>
+      </w:r>
+    </w:p>
+    <w:p>
+      <w:r>
+        <w:rPr/>
+        <w:t>“He will come back,” she told the empty bed, and hated that she had said it aloud. She did not invent the sound that would prove her wrong. She sat with the order she had given, and with Decimus’s chin-tip still bright behind her eyes: the little road habit that had always meant the friend would go.</w:t>
+      </w:r>
+    </w:p>
+    <w:p>
+      <w:r>
+        <w:rPr/>
+        <w:t>The bed did not argue. From the street rose the ordinary roar of the Ides. The litter was already gone.</w:t>
       </w:r>
     </w:p>
     <w:p>
@@ -6573,7 +6561,7 @@
     <w:p>
       <w:r>
         <w:rPr/>
-        <w:t>Caesar’s thumb brushed the seal. Curiosity almost woke. Then he slid the tablet into the stack with the others, among other papers, and the litter moved on because litters moved on. The seal vanished under petitions and lists. Unread became ordinary again. Ordinary was how mornings killed.</w:t>
+        <w:t>Caesar’s thumb brushed the seal. Curiosity almost woke. Then he slid the tablet into the stack with the others, among other papers, and the litter moved on because litters moved on. The seal vanished under petitions and lists.</w:t>
       </w:r>
     </w:p>
     <w:p>
@@ -6592,12 +6580,6 @@
       <w:r>
         <w:rPr/>
         <w:t>“The street writes to everyone,” said Caesar. “It is only a matter of whether they write back.”</w:t>
-      </w:r>
-    </w:p>
-    <w:p>
-      <w:r>
-        <w:rPr/>
-        <w:t>Caesar did not open it. The unread paper rode against his knee like any other chore.</w:t>
       </w:r>
     </w:p>
     <w:p>
@@ -6874,7 +6856,7 @@
     <w:p>
       <w:r>
         <w:rPr/>
-        <w:t>Trebonius said something mild. Antony didn’t keep it. The mildness sat wrong, warmth while the Curia broke open.</w:t>
+        <w:t>Trebonius said something mild. Antony didn’t keep it.</w:t>
       </w:r>
     </w:p>
     <w:p>
@@ -7169,13 +7151,13 @@
     <w:p>
       <w:r>
         <w:rPr/>
-        <w:t>In the lane of light just beyond the Curia door, before the crowd’s animal closed again, Cassius’s mouth changed. “Capitol,” he repeated, softer, not for the room. “Say it as fear. Antony was held outside, Trebonius’s market day. That gift is already walking toward us with a sword-shaped appetite. Do not stand over the marble arranging vocabulary while the spare learns he is spare.”</w:t>
-      </w:r>
-    </w:p>
-    <w:p>
-      <w:r>
-        <w:rPr/>
-        <w:t>Brutus looked once more at the shape on the stones. Softness tried to rise in him. Not the abstract debt: the late hour after forgiveness when Caesar had still wanted his company and made the war feel finished between them. The ordinary talk. The laugh at something small. The hand on his shoulder like kinship politics had not earned. That was the betrayal’s true size. It did not leave when he named the body tyrant. He stood one breath longer than Cassius wanted, long enough to feel the softness as a weight that would follow him up the hill. Then he crushed it the way he crushed unearned tears: privately, incompletely, with the lie that ancestors approved. Under the crush the spare was not mercy’s clean face now. It was a clock. The crush did not empty him. It only made room to walk.</w:t>
+        <w:t>At the door Cassius said it again, softer, for Brutus alone. “Capitol. Trebonius has Antony talking in the portico, and talk does not hold a consul long.”</w:t>
+      </w:r>
+    </w:p>
+    <w:p>
+      <w:r>
+        <w:rPr/>
+        <w:t>Brutus looked once more at the shape on the stones. Softness tried to rise in him. Not the abstract debt: the late hour after forgiveness when Caesar had still wanted his company and made the war feel finished between them. The ordinary talk. The laugh at something small. The hand on his shoulder like kinship politics had not earned. That was the betrayal’s true size. It did not leave when he named the body tyrant. He stood one breath longer than Cassius wanted. Then he crushed it the way he crushed unearned tears: privately, incompletely, with the lie that ancestors approved.</w:t>
       </w:r>
     </w:p>
     <w:p>
@@ -7424,7 +7406,7 @@
     <w:p>
       <w:r>
         <w:rPr/>
-        <w:t>Brutus watched a knot of women shove a knot of men and felt the first cold thought that was not philosophical: we have killed a man the city loved more than it loves our vocabulary. Under it, smaller and worse: I killed a man who forgave me and kept me close. The late hour after the spare returned without asking leave and stood beside the Forum noise. Wine gone warm. Ordinary talk. The war treated as a misunderstanding their house could afford. The rock could not make private guilt public enough to share. He wanted, badly, to wait until the Forum rearranged itself into the audience the words deserved. Waiting was the softest cowardice available. It looked like hope.</w:t>
+        <w:t>Brutus watched a knot of women shove a knot of men and felt the first cold thought that was not philosophical: we have killed a man the city loved more than it loves our vocabulary. Under it, smaller and worse: I killed a man who forgave me and kept me close. The late hour after the spare returned without asking leave and stood beside the Forum noise. Wine gone warm. Ordinary talk. The war treated as a misunderstanding their house could afford. The rock could not make private guilt public enough to share. He wanted, badly, to wait until the Forum rearranged itself into the audience the words deserved.</w:t>
       </w:r>
     </w:p>
     <w:p>
@@ -7454,7 +7436,7 @@
     <w:p>
       <w:r>
         <w:rPr/>
-        <w:t>Brutus kept each report as incomplete. He had been trained for incompleteness in books. The street’s incompleteness had teeth. The decision to wait used incompleteness as cover.</w:t>
+        <w:t>Brutus kept each report as incomplete. He had been trained for incompleteness in books. The street’s incompleteness had teeth.</w:t>
       </w:r>
     </w:p>
     <w:p>
@@ -7512,7 +7494,7 @@
     <w:p>
       <w:r>
         <w:rPr/>
-        <w:t>Toward evening the light went copper. The Capitol’s stone held heat. Brutus’s hands smelled of metal no matter how often he washed them in a basin someone provided like a sacrament. He dried them on his toga and still would not look at his own palms. Eyes could not make the spare into something other than blood. He drafted, in his head, the speech he might write down so the day would have a cleaner spine than it deserved. Drafting was another way of not leaving.</w:t>
+        <w:t>Toward evening the light went copper. The Capitol’s stone held heat. Brutus’s hands smelled of metal no matter how often he washed them in a basin someone provided like a sacrament. He dried them on his toga and still would not look at his own palms. He drafted, in his head, the speech he might write down so the day would have a cleaner spine than it deserved. Drafting was another way of not leaving.</w:t>
       </w:r>
     </w:p>
     <w:p>
@@ -7530,7 +7512,7 @@
     <w:p>
       <w:r>
         <w:rPr/>
-        <w:t>They moved a few paces off the sight-line, into a corridor of stone where the Forum’s noise became weather. Cassius’s polite face dropped. He had set down a cup. “Beginning,” he said, not for the crowd. “You just spent the afternoon teaching Rome that knives climb hills and wait to be loved. Decimus wants a road. Casca wants a cheer. You want a cleaner text. The city is shopping for who pays. Mark that when your vocabulary comes back stained.”</w:t>
+        <w:t>Cassius waited until Casca had turned to the parapet. “Beginning,” he said, not for the crowd. “You just spent the afternoon teaching Rome that knives climb hills and wait to be loved. Decimus wants a road. Casca wants a cheer. You want a cleaner text. The city is shopping for who pays.”</w:t>
       </w:r>
     </w:p>
     <w:p>
@@ -7548,7 +7530,7 @@
     <w:p>
       <w:r>
         <w:rPr/>
-        <w:t>Brutus took the corridor truth without answering it in kind. Answering would have been another speech. Below them, Rome did not kneel. It shopped, wept, armed, and waited to see who paid. The rock had just taught him that waiting could be a choice with a cost, not only a virtue with a view.</w:t>
+        <w:t>Brutus did not answer in kind. Answering would have been another speech. Below them, Rome did not kneel. It shopped, wept, armed, and waited to see who paid.</w:t>
       </w:r>
     </w:p>
     <w:p>
@@ -7665,7 +7647,7 @@
     <w:p>
       <w:r>
         <w:rPr/>
-        <w:t>Pacuvius wanted his storm. The officer wanted his paint. Lepidus wanted survivors left over to bargain with. Antony felt the group lean as a single weight, massacre versus how the body would look tomorrow, and chose the slower blade because the slower blade still had a consul’s name on it.</w:t>
+        <w:t>Antony chose the slower blade, because the slower blade still had a consul’s name on it.</w:t>
       </w:r>
     </w:p>
     <w:p>
@@ -7695,25 +7677,7 @@
     <w:p>
       <w:r>
         <w:rPr/>
-        <w:t>Pacuvius made the face of a man receiving wisdom, chin-tip, eyes grateful, the station grin that kept consuls from smelling mutiny. “As you say. Rooms. Doors. Feed them soft.”</w:t>
-      </w:r>
-    </w:p>
-    <w:p>
-      <w:r>
-        <w:rPr/>
-        <w:t>Antony turned toward the Capitol. Behind him Pacuvius’s soft dropped, for Lepidus’s nearest ear and two officers who had wanted dark, and not quite out of a consul’s hearing. “Rooms. While the rock still has senators on it with warm knives. He’ll remember caution more than our hunger, mark that when the Forum wants blood and we offer clauses.”</w:t>
-      </w:r>
-    </w:p>
-    <w:p>
-      <w:r>
-        <w:rPr/>
-        <w:t>Antony let it pass without turning. Lepidus did not contradict. Contradiction in open air made you the man who lit the massacre early. Pacuvius looked cheated anyway. Good. Cheated soldiers still listened. Satisfied soldiers invented orders.</w:t>
-      </w:r>
-    </w:p>
-    <w:p>
-      <w:r>
-        <w:rPr/>
-        <w:t>Antony spat blood from a bitten cheek he did not remember biting and stared toward the Capitol. Contempt would not collapse it. Pacuvius’s hunger still wanted paint; Antony wanted a funeral that paid.</w:t>
+        <w:t>Antony spat blood from a bitten cheek he did not remember biting and stared toward the Capitol.</w:t>
       </w:r>
     </w:p>
     <w:p>
@@ -7860,25 +7824,19 @@
     <w:p>
       <w:r>
         <w:rPr/>
-        <w:t>Cicero was nearly at the corner when the banker’s voice thinned behind him: “He polishes periods while we price the corpse. Useful man.”</w:t>
-      </w:r>
-    </w:p>
-    <w:p>
-      <w:r>
-        <w:rPr/>
-        <w:t>Cicero heard enough. He did not enter the corridor argument. Entering would have made him a stall. He preferred rooms that asked for periods. The praise-smile lasted until the temple steps; then it was only a face arranging itself for Atticus.</w:t>
-      </w:r>
-    </w:p>
-    <w:p>
-      <w:r>
-        <w:rPr/>
-        <w:t>He went home, or to someone’s home that would do, and dictated notes until his hand cramped. Outside, Rome buried rumour under rumour. Cicero slept two hours and dreamed he was consul again: the old habit, not prophecy.</w:t>
-      </w:r>
-    </w:p>
-    <w:p>
-      <w:r>
-        <w:rPr/>
-        <w:t>On the seventeenth, when the bargain had begun to harden, he allowed himself a thin satisfaction and sanded a period until it shone. He slept two more hours and did not dream at all.</w:t>
+        <w:t>Cicero did not stop. Stopping would have made him a stall. The praise-smile lasted until the temple steps; then it was only a face arranging itself for Atticus.</w:t>
+      </w:r>
+    </w:p>
+    <w:p>
+      <w:r>
+        <w:rPr/>
+        <w:t>He went home, or to someone’s home that would do, and dictated notes until his hand cramped. Outside, Rome buried rumour under rumour. Cicero slept two hours.</w:t>
+      </w:r>
+    </w:p>
+    <w:p>
+      <w:r>
+        <w:rPr/>
+        <w:t>On the seventeenth, when the bargain had begun to harden, he allowed himself a thin satisfaction and sanded a period until it shone.</w:t>
       </w:r>
     </w:p>
     <w:p>
@@ -7956,18 +7914,6 @@
     <w:p>
       <w:r>
         <w:rPr/>
-        <w:t>“Acts stand,” Sosia muttered, tasting the amnesty bargain. “Gardens walk. Who finishes the queen?”</w:t>
-      </w:r>
-    </w:p>
-    <w:p>
-      <w:r>
-        <w:rPr/>
-        <w:t>“Whoever opens the seal,” Hordeonius said. “Or whoever pretends not to notice she was priced before the seal existed.”</w:t>
-      </w:r>
-    </w:p>
-    <w:p>
-      <w:r>
-        <w:rPr/>
         <w:t>Seius wiped his eyes. “You talk as if mourning were a price list.”</w:t>
       </w:r>
     </w:p>
@@ -8046,13 +7992,13 @@
     <w:p>
       <w:r>
         <w:rPr/>
-        <w:t>The whisperer bowed. “Of course. Sacred. Living seals only.” Past the next pillar he caught a runner who had been waiting for crumbs: “He mourns punctual corpses and prices gardens. Ask him for blackmail and he sells you a sermon. Next time we take the tablet to someone who still believes the dead can squeal.”</w:t>
-      </w:r>
-    </w:p>
-    <w:p>
-      <w:r>
-        <w:rPr/>
-        <w:t>Hordeonius heard the shape without needing every word. He almost added that he mourned Visellius still. He did mourn him, as one mourned a punctual instrument. He kept that off his tongue. The basilica didn’t deserve his private liturgy.</w:t>
+        <w:t>The whisperer bowed. “Of course. Sacred. Living seals only.” He took the tablet two pillars down, to someone who still believed the dead could squeal.</w:t>
+      </w:r>
+    </w:p>
+    <w:p>
+      <w:r>
+        <w:rPr/>
+        <w:t>He did mourn Visellius, as one mourned a punctual instrument. He kept that off his tongue. The basilica didn’t deserve his private liturgy.</w:t>
       </w:r>
     </w:p>
     <w:p>
@@ -8118,7 +8064,7 @@
     <w:p>
       <w:r>
         <w:rPr/>
-        <w:t>Piso’s people made their legality faces. The room smelled of wax and wine. In the outer fringe, before the clauses finished being blows, a widow’s steward asked whether three hundred a head meant bread this Kalends or a story for wine shops. A freedman with one of Caesar’s old house-rings asked whether the freedmen were named. A junior laughed that Decimus’s second line would make knife-men into a mime’s turn, and nobody laughed with him. Antony heard the fringe the way he heard cohorts shifting, noise that would become policy if ignored. He stood where a consul stands when he intends to own the consequences.</w:t>
+        <w:t>Piso’s people made their legality faces. The room smelled of wax and wine. In the outer fringe, before the clauses finished being blows, a widow’s steward asked whether three hundred a head meant bread this Kalends or a story for wine shops. A freedman with one of Caesar’s old house-rings asked whether the freedmen were named. A junior laughed that Decimus’s second line would make knife-men into a mime’s turn, and nobody laughed with him. Antony stood where a consul stands when he intends to own the consequences.</w:t>
       </w:r>
     </w:p>
     <w:p>
@@ -8136,7 +8082,7 @@
     <w:p>
       <w:r>
         <w:rPr/>
-        <w:t>“He loved you,” Antony said in Decimus’s general direction, though Decimus wasn’t there to receive it. Loved you enough to write you into the will and die on your schedule. Second degree. Second line. The portico joke had grown teeth and ink. The laugh wanted to become a story. Antony swallowed it. Stories would be for the Forum.</w:t>
+        <w:t>“He loved you,” Antony said in Decimus’s general direction, though Decimus wasn’t there to receive it. Loved you enough to write you into the will and die on your schedule. Second degree. Second line. The portico joke had grown teeth and ink.</w:t>
       </w:r>
     </w:p>
     <w:p>
@@ -8173,12 +8119,6 @@
       <w:r>
         <w:rPr/>
         <w:t>“The city is not cooling,” Antony said. “It is fermenting. Open the jar.”</w:t>
-      </w:r>
-    </w:p>
-    <w:p>
-      <w:r>
-        <w:rPr/>
-        <w:t>In the anteroom, after the seal’s news had begun to leak toward the street, the delayer said nothing more to the clerk who still wanted hours. The clerk would hear the boy’s name from the street soon enough; delay had already lost.</w:t>
       </w:r>
     </w:p>
     <w:p>
@@ -8307,7 +8247,7 @@
     <w:p>
       <w:r>
         <w:rPr/>
-        <w:t>Someone sobbed. Someone cursed Brutus by name. A veteran near the front reached for the cloth the way men reached for a donative. Antony’s arm did not yield. For a breath the Forum became a wrestle over fabric. Grief wanting a relic. The consul wanting a steering oar. He kept his face between mourning and command. Too many tears and he was soft. Too few and he was a usurper of grief. Too loose a grip and the cloth became theirs to tear into a hundred private wars.</w:t>
+        <w:t>Someone sobbed. Someone cursed Brutus by name. A veteran near the front reached for the cloth the way men reached for a donative. Antony’s arm did not yield. For a breath the Forum became a wrestle over fabric. Grief wanting a relic. The consul wanting a steering oar. He kept his face between mourning and command. Too many tears and he was soft. Too few and he was a usurper of grief.</w:t>
       </w:r>
     </w:p>
     <w:p>
@@ -8362,12 +8302,6 @@
       <w:r>
         <w:rPr/>
         <w:t>The pyre took. Benches fed it. A veteran dragged a brand from the Forum fire. Another man took the next brand toward the streets where Liberators kept doors: same heat, new address. Antony watched the first flame leave the body for a house and did not call it back. When the first shops began to burn toward those doors anyway, farther and faster than the grain line, he felt the old campaign clarity and a newer friction. The enemy’s city had become the enemy. It was no longer waiting for his nod. The second officer was already too far forward to call back. Calling him would look like fear of his own heat.</w:t>
-      </w:r>
-    </w:p>
-    <w:p>
-      <w:r>
-        <w:rPr/>
-        <w:t>Teaching looked like smoke that had walked. The smoke did not ask which market day had left him alive to aim it. It only asked whether the man with the cloth could still tell heat from a plan once the Forum had chosen fire.</w:t>
       </w:r>
     </w:p>
     <w:p>
@@ -8430,7 +8364,7 @@
     <w:p>
       <w:r>
         <w:rPr/>
-        <w:t>Laberius closed his fist on air, not wood. “I came for Capua,” he said: the dated promise, the after-Parthia land that had just died with the paymaster. “Not for which door burns first.” The corporal heard Capua and did not laugh. Capua without a living name to date it was only rage looking for a street. Laberius took a mental note of who took torches. Notes survived campaigns. Torches made you someone else’s note. Capua unpaid had just learned it could walk without waiting for clerks.</w:t>
+        <w:t>Laberius closed his fist on air, not wood. “I came for Capua,” he said: the dated promise, the after-Parthia land that had just died with the paymaster. “Not for which door burns first.” The corporal heard Capua and did not laugh. Laberius took a mental note of who took torches. Notes survived campaigns.</w:t>
       </w:r>
     </w:p>
     <w:p>
@@ -8442,19 +8376,13 @@
     <w:p>
       <w:r>
         <w:rPr/>
-        <w:t>Laberius closed his fist on air. Capua was still unpaid.</w:t>
-      </w:r>
-    </w:p>
-    <w:p>
-      <w:r>
-        <w:rPr/>
-        <w:t>An older veteran, scar through the lip, no torch, caught Laberius’s sleeve once the surge thinned. “Capua was dirt with a date when he breathed,” the man said. “Now Capua is only dirt that walks. I take the torch because dirt without a paymaster still needs a street. You keep your note. Notes don’t feed boys.” Laberius felt the cost change. Refusal had just priced him as the man who would not burn for unpaid land while other men burned for the same unpaid word. He did not argue. Argument would have been a second yes.</w:t>
-      </w:r>
-    </w:p>
-    <w:p>
-      <w:r>
-        <w:rPr/>
-        <w:t>By dusk he knew the only Senate that mattered today was this crowd. The Capitol could keep its speeches. The street had voted with smoke. Laberius had voted, by refusal, to keep his name off the first fire-list while Capua’s unpaid date burned in other men’s hands.</w:t>
+        <w:t>An older veteran, scar through the lip, no torch, caught Laberius’s sleeve once the surge thinned. “Capua was dirt with a date when he breathed,” the man said. “Now Capua is only dirt that walks. I take the torch because dirt without a paymaster still needs a street. You keep your note. Notes don’t feed boys.” He did not argue. Argument would have been a second yes.</w:t>
+      </w:r>
+    </w:p>
+    <w:p>
+      <w:r>
+        <w:rPr/>
+        <w:t>By dusk he knew the only Senate that mattered today was this crowd. The street had voted with smoke, and Laberius had kept his name off the first fire-list.</w:t>
       </w:r>
     </w:p>
     <w:p>

</xml_diff>

<commit_message>
Regenerate Book 1 docx export
Co-Authored-By: Claude Opus 5.5 (1M context) <noreply@anthropic.com>
Claude-Session: https://claude.ai/code/session_01FSCYsPeDfkvMsFPq7SVUiz
</commit_message>
<xml_diff>
--- a/exports/Ides_Book1_FULL_Ch01-36.docx
+++ b/exports/Ides_Book1_FULL_Ch01-36.docx
@@ -27,7 +27,7 @@
         <w:br/>
         <w:t>Book 1 reading export · Utica prologue, then Ch 1 dinner · ends at Philippi · author-voice (no em dash)</w:t>
         <w:br/>
-        <w:t>Source: Manuscript 5f49eb2 (2026-10-24) · generated 2026-10-24 09:41 UTC from claude/project-thread-yoegy1 @ 5f49eb2 · source digest f079248c437c5713 · prologue, chapters 1–36, historical note and cast</w:t>
+        <w:t>Source: Manuscript 3b6f59e (2026-10-24) · generated 2026-10-24 13:04 UTC from claude/project-thread-axr348 @ 3b6f59e · source digest 2e1f7d647c048e58 · prologue, chapters 1–36, historical note and cast</w:t>
       </w:r>
     </w:p>
     <w:p>
@@ -1349,133 +1349,6 @@
     </w:p>
     <w:p>
       <w:pPr>
-        <w:spacing w:before="200"/>
-      </w:pPr>
-      <w:r>
-        <w:rPr/>
-        <w:t>Peace Rates</w:t>
-      </w:r>
-    </w:p>
-    <w:p>
-      <w:r>
-        <w:rPr/>
-        <w:t>“Peace,” Hordeonius announced to a knot of men who wanted comfort priced, “is the month I lend at one in the hundred instead of two. Do not confuse it with virtue. Virtue does not clear.”</w:t>
-      </w:r>
-    </w:p>
-    <w:p>
-      <w:r>
-        <w:rPr/>
-        <w:t xml:space="preserve">He adjusted tablets with priestly care. Africa’s ending had softened some rates, the same </w:t>
-      </w:r>
-      <w:r>
-        <w:rPr>
-          <w:i/>
-        </w:rPr>
-        <w:t>closed enough</w:t>
-      </w:r>
-      <w:r>
-        <w:rPr/>
-        <w:t xml:space="preserve"> the Forum had spit about while cake-sellers laughed. The western edges of the paper still burned enough to keep bakers polite.</w:t>
-      </w:r>
-    </w:p>
-    <w:p>
-      <w:r>
-        <w:rPr/>
-        <w:t>“The west?” said a man in the knot, as if it might be a district.</w:t>
-      </w:r>
-    </w:p>
-    <w:p>
-      <w:r>
-        <w:rPr/>
-        <w:t>“Spain,” said Hordeonius. “Pompey’s sons got out of Africa with ships, grudges and their father’s name, and Spain is full of old soldiers who still owe the father a favour. Caesar will have to go and finish it. Until he does, any loan with a Spanish edge smells of smoke.”</w:t>
-      </w:r>
-    </w:p>
-    <w:p>
-      <w:r>
-        <w:rPr/>
-        <w:t>The new-ring’s held rate still sat unpaid under yesterday’s wax: patriotism that had not cleared. Spain unfinished was not a rumour. It was a column that refused to settle. A baker’s agent wanted cheaper seed grain “now that Cato is philosophy.” Hordeonius priced the man’s hunger without insulting it. Insulting hunger was bad for repeat custom.</w:t>
-      </w:r>
-    </w:p>
-    <w:p>
-      <w:r>
-        <w:rPr/>
-        <w:t>Sosia, at his shoulder, muttered for the knot’s benefit, “Sea paper makes honest men seasick.”</w:t>
-      </w:r>
-    </w:p>
-    <w:p>
-      <w:r>
-        <w:rPr/>
-        <w:t>Hordeonius held a little sea paper and loved none of it. “A loan on a cargo,” he told the knot. “Repaid if the ship comes in, forgiven if Neptune keeps it. A bet that the sea pays its debts.”</w:t>
-      </w:r>
-    </w:p>
-    <w:p>
-      <w:r>
-        <w:rPr/>
-        <w:t>A client laughed, loud enough that two stalls looked over. “You talk as if the Republic were a warehouse.”</w:t>
-      </w:r>
-    </w:p>
-    <w:p>
-      <w:r>
-        <w:rPr/>
-        <w:t>“The Republic,” Hordeonius said solemnly, “is the only warehouse large enough to hold our greed without confessing it. I do not bet against Caesar. I bet against other men’s certainty. Certainty is expensive and usually wrong.”</w:t>
-      </w:r>
-    </w:p>
-    <w:p>
-      <w:r>
-        <w:rPr/>
-        <w:t>The baker’s agent snorted wine through his nose and had to wipe his chin on his sleeve. “Warehouse of greed, Jupiter. Write that on a cake.”</w:t>
-      </w:r>
-    </w:p>
-    <w:p>
-      <w:r>
-        <w:rPr/>
-        <w:t>“I will write it on your rate,” said Hordeonius, “which is the only cake I bake.”</w:t>
-      </w:r>
-    </w:p>
-    <w:p>
-      <w:r>
-        <w:rPr/>
-        <w:t>Hordeonius did not smile. Smiling would have spoiled the sale. He entered Seius’s fresh obligation among the morning’s new wax, small and neat, already growing interest, and ignored the courier from Puteoli until the knot thinned. Sosia had already read the man’s dust: the harbour road from Puteoli, where the Alexandrian grain ships tied up, so he knew a week ahead of the Forum whether Rome would eat. Sea-rumour dressed as numbers could wait. Laughter that bought a second cup could not.</w:t>
-      </w:r>
-    </w:p>
-    <w:p>
-      <w:r>
-        <w:rPr/>
-        <w:t>When the baker left clutching his rate like a blessing, Sosia waited until the man’s back was only a tunic in the crowd. “He’ll tell his wife you made a joke. You’ll become witty by accident again.”</w:t>
-      </w:r>
-    </w:p>
-    <w:p>
-      <w:r>
-        <w:rPr/>
-        <w:t>“Wit is a tax on clarity,” Hordeonius said. “I prefer clarity. Clarity clears.”</w:t>
-      </w:r>
-    </w:p>
-    <w:p>
-      <w:r>
-        <w:rPr/>
-        <w:t>A cake-seller from two stalls over (flour still on her forearms) leaned in with a question that wanted to be gossip and a price that wanted to be faith. “If Spain settles, do my boys eat cheaper seed, or do you invent another unfinished west?” Hordeonius priced her hunger the way he priced the baker’s: without insult, without prophecy. “When Spain settles, rates move. Until then I sell umbrellas for unfinished weather.” The cake-seller snorted once and bought the rate anyway.</w:t>
-      </w:r>
-    </w:p>
-    <w:p>
-      <w:r>
-        <w:rPr/>
-        <w:t>“The courier is still sweating,” Sosia said.</w:t>
-      </w:r>
-    </w:p>
-    <w:p>
-      <w:r>
-        <w:rPr/>
-        <w:t>“Let him. A ship that is late is only late. A ship that is announced early is a salesman.”</w:t>
-      </w:r>
-    </w:p>
-    <w:p>
-      <w:r>
-        <w:rPr/>
-        <w:t>“A man who needs a nod,” he added to the shelf, “will always pay for the story of the nod.” The shelf did not argue. That was why he liked it.</w:t>
-      </w:r>
-    </w:p>
-    <w:p>
-      <w:pPr>
         <w:spacing w:before="280"/>
       </w:pPr>
       <w:r>
@@ -1819,7 +1692,7 @@
     <w:p>
       <w:r>
         <w:rPr/>
-        <w:t>Clemency sat in the room like a soft chain. Caesar had spared. At Pharsalus he had sent word down the line before the fighting began: take Brutus alive, if it can be done. Brutus had lived. Tonight the spared life felt less like gratitude and more like a costume that still fit too well. Spain was “settled” in other men’s mouths. The chain had not loosened. He reached for a philosophical sentence and found only the cup in his hand. Wine gone warm and flat. Unbidden: the hour after the spare. Caesar had kept him late over ordinary talk, laughed at something small, and sent him home as if the war between them had been a misunderstanding their house could afford. That warmth was the part of the chain that still cut.</w:t>
+        <w:t>Clemency sat in the room like a soft chain. Caesar had spared. At Pharsalus he had sent word down the line before the fighting began: take Brutus alive, if it can be done. Brutus had lived. Tonight the spared life felt less like gratitude and more like a costume that still fit too well. Spain was “settled” in other men’s mouths. The chain had not loosened. He reached for a philosophical sentence and found only the cup in his hand. Wine gone warm and flat.</w:t>
       </w:r>
     </w:p>
     <w:p>
@@ -2032,127 +1905,202 @@
       </w:pPr>
       <w:r>
         <w:rPr/>
-        <w:t>Nobody Watches</w:t>
-      </w:r>
-    </w:p>
-    <w:p>
-      <w:r>
-        <w:rPr/>
-        <w:t>On the temple steps above the Forum, heat came off the stone into Octavian’s thin shoes. He stood where important men’s shadows fell and practised being invisible on purpose.</w:t>
-      </w:r>
-    </w:p>
-    <w:p>
-      <w:r>
-        <w:rPr/>
-        <w:t>He took his own inventory while he waited, because no one else would. Gaius Octavius. Eighteen, and nobody yet had a reason to remember it. Caesar’s sister’s grandson, which made him a great-nephew: near enough to be invited, far enough to be stood at the edge. On his father’s side, a respectable house with a modest fortune and no armies. On his great-uncle’s, a great many armies. The gap between those two columns was the whole of his position.</w:t>
-      </w:r>
-    </w:p>
-    <w:p>
-      <w:r>
-        <w:rPr/>
-        <w:t>Priests moved with the boredom of men who handled gods professionally. Senators performed importance for one another. A woman selling wreaths named three wrong officials and sold the wreaths anyway. He listened more than he spoke. A boy without legions borrowed maps with his ears.</w:t>
-      </w:r>
-    </w:p>
-    <w:p>
-      <w:r>
-        <w:rPr/>
-        <w:t>Caesar’s glance found him once, brief as a list check, not unkind, not enough. No prophecy in it. Octavian’s shoulders stayed still until the glance moved on. Only then did he breathe. He didn’t look at Agrippa to confirm he had been seen. Looking would have spent the moment.</w:t>
-      </w:r>
-    </w:p>
-    <w:p>
-      <w:r>
-        <w:rPr/>
-        <w:t>Marcus Agrippa at his shoulder said nothing. Same age. Farm-bred, a soldier’s forearms, no family name worth the price of a seat. He had attached himself to Octavian the way some dogs attach themselves to the one person in the house who forgets to be afraid of them. Apollodorus, his Greek, hired to turn rhetoric into a statesman and so far the maker of a very good cloak-holder, fidgeted somewhere behind with the cloaks like a man who wanted his principal larger than the hour allowed.</w:t>
-      </w:r>
-    </w:p>
-    <w:p>
-      <w:r>
-        <w:rPr/>
-        <w:t>“They don’t know your name yet,” Agrippa murmured.</w:t>
-      </w:r>
-    </w:p>
-    <w:p>
-      <w:r>
-        <w:rPr/>
-        <w:t>“Good,” Octavian said. “Names that arrive early get spent.”</w:t>
-      </w:r>
-    </w:p>
-    <w:p>
-      <w:r>
-        <w:rPr/>
-        <w:t>“That sounds wise. Where did you read it?”</w:t>
-      </w:r>
-    </w:p>
-    <w:p>
-      <w:r>
-        <w:rPr/>
-        <w:t>“I made it up on the steps.”</w:t>
-      </w:r>
-    </w:p>
-    <w:p>
-      <w:r>
-        <w:rPr/>
-        <w:t>“It’s very good.”</w:t>
-      </w:r>
-    </w:p>
-    <w:p>
-      <w:r>
-        <w:rPr/>
-        <w:t>“It’s very hot,” said Octavian, “and I would trade it for a seat in the shade.”</w:t>
-      </w:r>
-    </w:p>
-    <w:p>
-      <w:r>
-        <w:rPr/>
-        <w:t>A senator’s attendant brushed past and apologised to Agrippa by mistake. Octavian kept the mistake quiet. Corrections announced you wanted space you had not earned. A moment later the same attendant returned with a reserved place nearer the rail, meant for Caesar’s kin, and offered it to Agrippa again, eyes skipping Octavian like a cloak-stand. Agrippa didn’t take the place. He tipped his chin a fraction toward Octavian. The attendant’s face flickered annoyance, then blankness, then a bow that arrived late and wrong.</w:t>
-      </w:r>
-    </w:p>
-    <w:p>
-      <w:r>
-        <w:rPr/>
-        <w:t>Octavian stepped into the gap anyway, thin shoes on hotter stone. The attendant’s arm stayed a half-breath too long in the way, then withdrew without apology. Octavian counted faces from the new angle: who leaned toward Caesar, who leaned toward money, who leaned only toward their own reflection. When the ceremony ended he was still publicly irrelevant. In his head the reserved place had already been entered beside the wrong chest.</w:t>
-      </w:r>
-    </w:p>
-    <w:p>
-      <w:r>
-        <w:rPr/>
-        <w:t>“He looked at you,” Agrippa said, once the crowd had thinned.</w:t>
-      </w:r>
-    </w:p>
-    <w:p>
-      <w:r>
-        <w:rPr/>
-        <w:t>“He looked at the steps.”</w:t>
-      </w:r>
-    </w:p>
-    <w:p>
-      <w:r>
-        <w:rPr/>
-        <w:t>“He looked at you on the steps.”</w:t>
-      </w:r>
-    </w:p>
-    <w:p>
-      <w:r>
-        <w:rPr/>
-        <w:t>“He was checking whether I was ill again.” Octavian had been ill most of his life, coughs and fevers and a stomach that disliked every campaign he had ever approached, and Caesar knew it. That spring, when Caesar had gone to finish the war in Spain, Octavian had followed late, half-wrecked by sea and sickness, and arrived to find the battle already won. His uncle had looked at him as if he were a mildly interesting line in the day’s dispatches. Then he had asked, with great politeness, whether the journey had been bad. It had been the longest conversation they had ever had.</w:t>
-      </w:r>
-    </w:p>
-    <w:p>
-      <w:r>
-        <w:rPr/>
-        <w:t>“That’s a conversation,” Agrippa had said at the time.</w:t>
-      </w:r>
-    </w:p>
-    <w:p>
-      <w:r>
-        <w:rPr/>
-        <w:t>“It was weather.”</w:t>
-      </w:r>
-    </w:p>
-    <w:p>
-      <w:r>
-        <w:rPr/>
-        <w:t>The unfinished inventory followed him off the steps. Rome’s dinners did not suddenly learn his name. Packing lists did. Within days the same thin shoes stood on ship plank instead of temple stone, and the wrong chest became a joke Agrippa refused to finish aloud.</w:t>
+        <w:t>Apollonia</w:t>
+      </w:r>
+    </w:p>
+    <w:p>
+      <w:r>
+        <w:rPr/>
+        <w:t>Apollonia was not a reward. It was distance with lessons.</w:t>
+      </w:r>
+    </w:p>
+    <w:p>
+      <w:r>
+        <w:rPr/>
+        <w:t>“A Greek town with Italy’s heel for a view,” Agrippa had said from the boat rail, and that was description enough. Caesar had not chosen it for him. Over the hills in Macedonia the army was gathering, and the officers who came down to the coast said the numbers the way other men said prayers: sixteen legions, ten thousand horse, the best of what Spain and Africa had left alive. Then Parthia, beyond Syria, where Crassus’s eagles still hung in some temple. Whoever brought the eagles home, the officers said, would be remembered longer than the man who had only won the war at home, and then they glanced to see whether the boy had heard.</w:t>
+      </w:r>
+    </w:p>
+    <w:p>
+      <w:r>
+        <w:rPr/>
+        <w:t>Somewhere in that plan, Caesar had given his great-nephew a place. Octavian was to study with the army and sail for the East beside the general’s staff. He was to learn the work of a master of the horse, the second chair, the man who rode behind the dictator. Nobody at the dinners had been told. If they had been, they would have laughed.</w:t>
+      </w:r>
+    </w:p>
+    <w:p>
+      <w:r>
+        <w:rPr/>
+        <w:t>The last time the dinners had seen him at all was on the temple steps above the Forum in late summer, heat coming up through his thin shoes. Gaius Octavius, eighteen, Caesar’s sister’s grandson: near enough to be invited, far enough to be stood at the edge. A senator’s attendant had come down the steps with a reserved place nearer the rail, meant for Caesar’s kin, and offered it to Agrippa. Then offered it to Agrippa again, his eyes skipping Octavian like a cloak-stand. Marcus Agrippa was the same age, farm-bred, with a soldier’s forearms and no family name worth the price of a seat. He did not take the place. He tipped his chin a fraction toward the boy beside him, and the bow that followed arrived late and wrong. Octavian stepped into the gap and said nothing. Corrections announced you wanted space you had not earned.</w:t>
+      </w:r>
+    </w:p>
+    <w:p>
+      <w:r>
+        <w:rPr/>
+        <w:t>“They don’t know your name yet,” Agrippa had murmured.</w:t>
+      </w:r>
+    </w:p>
+    <w:p>
+      <w:r>
+        <w:rPr/>
+        <w:t>“Good. Names that arrive early get spent.”</w:t>
+      </w:r>
+    </w:p>
+    <w:p>
+      <w:r>
+        <w:rPr/>
+        <w:t>Caesar’s glance had found him once that day, brief as a list check, not unkind, not enough. In Spain that spring Octavian had followed his uncle late, half-wrecked by sea and sickness, and arrived to find the battle already won. Caesar had asked, with great politeness, whether the journey had been bad. It had been the longest conversation they had ever had. Within days of the steps the same thin shoes stood on ship plank, and Apollodorus, the Greek hired to turn him into a statesman, was being sick over the rail.</w:t>
+      </w:r>
+    </w:p>
+    <w:p>
+      <w:r>
+        <w:rPr/>
+        <w:t>On the Illyrian coast he studied war like a schoolboy learning a speech another boy might be called on to declaim.</w:t>
+      </w:r>
+    </w:p>
+    <w:p>
+      <w:r>
+        <w:rPr/>
+        <w:t>Agrippa drilled until sweat made honesty cheaper than speech. Octavian’s body complained; he didn’t narrate the complaint. Weakness spoken aloud became other men’s tool. He asked questions that sounded younger than his calculations, supply, winds, what older officers feared when they joked about the East.</w:t>
+      </w:r>
+    </w:p>
+    <w:p>
+      <w:r>
+        <w:rPr/>
+        <w:t>“What do they fear?” Agrippa asked, on the second night, while they scrubbed their gear.</w:t>
+      </w:r>
+    </w:p>
+    <w:p>
+      <w:r>
+        <w:rPr/>
+        <w:t>“The bowmen. Mounted archers who shoot backwards while they run. They say you can chase them until you drop and never touch a man.”</w:t>
+      </w:r>
+    </w:p>
+    <w:p>
+      <w:r>
+        <w:rPr/>
+        <w:t>“That’s not a fear. That’s a boast about the enemy.”</w:t>
+      </w:r>
+    </w:p>
+    <w:p>
+      <w:r>
+        <w:rPr/>
+        <w:t>“It’s both. When a man brags about how clever the other side is, he’s already asking for a bigger army.”</w:t>
+      </w:r>
+    </w:p>
+    <w:p>
+      <w:r>
+        <w:rPr/>
+        <w:t>Those officers brightened at Parthia talk, months east, glory, the map widening. One sketched a route in dust with a stick and erased it with his boot, laughing. Octavian copied the erased lines before the boot finished. Then he looked at the sea long enough that Agrippa followed his gaze. Rome’s dinners and this packing list never shared a shore.</w:t>
+      </w:r>
+    </w:p>
+    <w:p>
+      <w:r>
+        <w:rPr/>
+        <w:t>“When he calls us,” Agrippa said once, meaning Caesar.</w:t>
+      </w:r>
+    </w:p>
+    <w:p>
+      <w:r>
+        <w:rPr/>
+        <w:t>“When he calls,” Octavian agreed. He almost added a colder clause about mouths and mornings, then bit it off. He kept what he could own without saying it: the dust-route, the wind, Agrippa’s stubborn loyalty, and the attendant’s late bow, filed where names that arrive early get spent.</w:t>
+      </w:r>
+    </w:p>
+    <w:p>
+      <w:r>
+        <w:rPr/>
+        <w:t>An older officer clapped his shoulder and called him Caesar’s hopeful shadow. Octavian smiled the polite smile and didn’t correct the furniture.</w:t>
+      </w:r>
+    </w:p>
+    <w:p>
+      <w:r>
+        <w:rPr/>
+        <w:t>When the officer moved off, Agrippa bumped Octavian’s elbow, barely play, barely warning. “Cheer up, Shadow. At least they remember you have edges.”</w:t>
+      </w:r>
+    </w:p>
+    <w:p>
+      <w:r>
+        <w:rPr/>
+        <w:t>Octavian’s polite smile thinned to nothing. “Don’t.”</w:t>
+      </w:r>
+    </w:p>
+    <w:p>
+      <w:r>
+        <w:rPr/>
+        <w:t>“Don’t what?”</w:t>
+      </w:r>
+    </w:p>
+    <w:p>
+      <w:r>
+        <w:rPr/>
+        <w:t>“That name. Not from you.” He wiped sweat with the wrong wrist, awkward. “They can call me furniture. You don’t.”</w:t>
+      </w:r>
+    </w:p>
+    <w:p>
+      <w:r>
+        <w:rPr/>
+        <w:t>Agrippa’s mouth twitched, caught, not cruel. “Noted. No shadows. Only drill.” He paused. “Though you do look like a boy arguing with the sun.”</w:t>
+      </w:r>
+    </w:p>
+    <w:p>
+      <w:r>
+        <w:rPr/>
+        <w:t>Octavian almost laughed, then turned it into a cough so the older men would not own the sound. “Keep close,” he said, still awkward with warmth.</w:t>
+      </w:r>
+    </w:p>
+    <w:p>
+      <w:r>
+        <w:rPr/>
+        <w:t>Apollodorus found them at the end of one day, grey with dust and distaste, carrying a roll of Greek he had been trying to teach Octavian for a month. “If the young master is finished being a soldier,” he said, “there is a speech of Demosthenes that has been waiting since breakfast.”</w:t>
+      </w:r>
+    </w:p>
+    <w:p>
+      <w:r>
+        <w:rPr/>
+        <w:t>“What does he say?” Agrippa asked.</w:t>
+      </w:r>
+    </w:p>
+    <w:p>
+      <w:r>
+        <w:rPr/>
+        <w:t>“He says that Athens should have fought Philip while there was still time.”</w:t>
+      </w:r>
+    </w:p>
+    <w:p>
+      <w:r>
+        <w:rPr/>
+        <w:t>“Did Athens listen?”</w:t>
+      </w:r>
+    </w:p>
+    <w:p>
+      <w:r>
+        <w:rPr/>
+        <w:t>“No.”</w:t>
+      </w:r>
+    </w:p>
+    <w:p>
+      <w:r>
+        <w:rPr/>
+        <w:t>“Then he’s no use to us,” said Agrippa, and Octavian laughed in earnest and had to turn it into a second cough. Apollodorus rolled the scroll with the dignity of a man who had heard worse reviews.</w:t>
+      </w:r>
+    </w:p>
+    <w:p>
+      <w:r>
+        <w:rPr/>
+        <w:t>Before sleep they shared a heel of bread Agrippa had bullied from a cook who respected fists more than kin names. No officers. No Parthia sticks in dust. Just the ordinary theft of calories and Agrippa’s rule spoken twice without theatre: no shadows between them. Octavian practised a thank-you and discarded it. He bumped Agrippa’s shoulder back, clumsy, almost play, and lay down sore, young, and unfinished, exactly as far from Senate heat as the sea allowed. He didn’t dream of crowns. He dreamed of the reserved place offered to the wrong chest, then of missing a drill step and being laughed at by men whose names he needed.</w:t>
+      </w:r>
+    </w:p>
+    <w:p>
+      <w:pPr>
+        <w:spacing w:before="280"/>
+      </w:pPr>
+      <w:r>
+        <w:rPr/>
+        <w:t>Chapter 6</w:t>
+      </w:r>
+    </w:p>
+    <w:p>
+      <w:r>
+        <w:rPr/>
+        <w:t>Perpetuo</w:t>
       </w:r>
     </w:p>
     <w:p>
@@ -2161,184 +2109,229 @@
       </w:pPr>
       <w:r>
         <w:rPr/>
-        <w:t>Apollonia</w:t>
-      </w:r>
-    </w:p>
-    <w:p>
-      <w:r>
-        <w:rPr/>
-        <w:t>Apollonia was not a reward. It was distance with lessons.</w:t>
-      </w:r>
-    </w:p>
-    <w:p>
-      <w:r>
-        <w:rPr/>
-        <w:t>“A Greek town with Italy’s heel for a view,” Agrippa had said from the boat rail, and that was description enough. Caesar had not chosen it for him. Over the hills in Macedonia the army was gathering, and the officers who came down to the coast said the numbers the way other men said prayers: sixteen legions, ten thousand horse, the best of what Spain and Africa had left alive. Then Parthia, beyond Syria, where Crassus’s eagles still hung in some temple. Whoever brought the eagles home, the officers said, would be remembered longer than the man who had only won the war at home, and then they glanced to see whether the boy had heard.</w:t>
-      </w:r>
-    </w:p>
-    <w:p>
-      <w:r>
-        <w:rPr/>
-        <w:t>Somewhere in that plan, Caesar had given his great-nephew a place. Octavian was to study with the army and sail for the East beside the general’s staff. He was to learn the work of a master of the horse, the second chair, the man who rode behind the dictator. Nobody at the dinners had been told. If they had been, they would have laughed.</w:t>
-      </w:r>
-    </w:p>
-    <w:p>
-      <w:r>
-        <w:rPr/>
-        <w:t>On the Illyrian coast he studied war like a schoolboy learning a speech another boy might be called on to declaim.</w:t>
-      </w:r>
-    </w:p>
-    <w:p>
-      <w:r>
-        <w:rPr/>
-        <w:t>Agrippa drilled until sweat made honesty cheaper than speech. Octavian’s body complained; he didn’t narrate the complaint. Weakness spoken aloud became other men’s tool. He asked questions that sounded younger than his calculations, supply, winds, what older officers feared when they joked about the East.</w:t>
-      </w:r>
-    </w:p>
-    <w:p>
-      <w:r>
-        <w:rPr/>
-        <w:t>“What do they fear?” Agrippa asked, on the second night, while they scrubbed their gear.</w:t>
-      </w:r>
-    </w:p>
-    <w:p>
-      <w:r>
-        <w:rPr/>
-        <w:t>“The bowmen. Mounted archers who shoot backwards while they run. They say you can chase them until you drop and never touch a man.”</w:t>
-      </w:r>
-    </w:p>
-    <w:p>
-      <w:r>
-        <w:rPr/>
-        <w:t>“That’s not a fear. That’s a boast about the enemy.”</w:t>
-      </w:r>
-    </w:p>
-    <w:p>
-      <w:r>
-        <w:rPr/>
-        <w:t>“It’s both. When a man brags about how clever the other side is, he’s already asking for a bigger army.”</w:t>
-      </w:r>
-    </w:p>
-    <w:p>
-      <w:r>
-        <w:rPr/>
-        <w:t>Those officers brightened at Parthia talk, months east, glory, the map widening. One sketched a route in dust with a stick and erased it with his boot, laughing. Octavian copied the erased lines before the boot finished. Then he looked at the sea long enough that Agrippa followed his gaze. Rome’s dinners and this packing list never shared a shore.</w:t>
-      </w:r>
-    </w:p>
-    <w:p>
-      <w:r>
-        <w:rPr/>
-        <w:t>“When he calls us,” Agrippa said once, meaning Caesar.</w:t>
-      </w:r>
-    </w:p>
-    <w:p>
-      <w:r>
-        <w:rPr/>
-        <w:t>“When he calls,” Octavian agreed. He almost added a colder clause about mouths and mornings, then bit it off. He kept what he could own without saying it: the dust-route, the wind, Agrippa’s stubborn loyalty, and the attendant’s late bow, filed where names that arrive early get spent.</w:t>
-      </w:r>
-    </w:p>
-    <w:p>
-      <w:r>
-        <w:rPr/>
-        <w:t>An older officer clapped his shoulder and called him Caesar’s hopeful shadow. Octavian smiled the polite smile and didn’t correct the furniture.</w:t>
-      </w:r>
-    </w:p>
-    <w:p>
-      <w:r>
-        <w:rPr/>
-        <w:t>When the officer moved off, Agrippa bumped Octavian’s elbow, barely play, barely warning. “Cheer up, Shadow. At least they remember you have edges.”</w:t>
-      </w:r>
-    </w:p>
-    <w:p>
-      <w:r>
-        <w:rPr/>
-        <w:t>Octavian’s polite smile thinned to nothing. “Don’t.”</w:t>
-      </w:r>
-    </w:p>
-    <w:p>
-      <w:r>
-        <w:rPr/>
-        <w:t>“Don’t what?”</w:t>
-      </w:r>
-    </w:p>
-    <w:p>
-      <w:r>
-        <w:rPr/>
-        <w:t>“That name. Not from you.” He wiped sweat with the wrong wrist, awkward. “They can call me furniture. You don’t.”</w:t>
-      </w:r>
-    </w:p>
-    <w:p>
-      <w:r>
-        <w:rPr/>
-        <w:t>Agrippa’s mouth twitched, caught, not cruel. “Noted. No shadows. Only drill.” He paused. “Though you do look like a boy arguing with the sun.”</w:t>
-      </w:r>
-    </w:p>
-    <w:p>
-      <w:r>
-        <w:rPr/>
-        <w:t>Octavian almost laughed, then turned it into a cough so the older men would not own the sound. “Keep close,” he said, still awkward with warmth.</w:t>
-      </w:r>
-    </w:p>
-    <w:p>
-      <w:r>
-        <w:rPr/>
-        <w:t>Apollodorus found them at the end of the day, grey with dust and distaste, carrying a roll of Greek he had been trying to teach Octavian for a month. “If the young master is finished being a soldier,” he said, “there is a speech of Demosthenes that has been waiting since breakfast.”</w:t>
-      </w:r>
-    </w:p>
-    <w:p>
-      <w:r>
-        <w:rPr/>
-        <w:t>“What does he say?” Agrippa asked.</w:t>
-      </w:r>
-    </w:p>
-    <w:p>
-      <w:r>
-        <w:rPr/>
-        <w:t>“He says that Athens should have fought Philip while there was still time.”</w:t>
-      </w:r>
-    </w:p>
-    <w:p>
-      <w:r>
-        <w:rPr/>
-        <w:t>“Did Athens listen?”</w:t>
-      </w:r>
-    </w:p>
-    <w:p>
-      <w:r>
-        <w:rPr/>
-        <w:t>“No.”</w:t>
-      </w:r>
-    </w:p>
-    <w:p>
-      <w:r>
-        <w:rPr/>
-        <w:t>“Then he’s no use to us,” said Agrippa, and Octavian laughed in earnest and had to turn it into a second cough. Apollodorus rolled the scroll with the dignity of a man who had heard worse reviews.</w:t>
-      </w:r>
-    </w:p>
-    <w:p>
-      <w:r>
-        <w:rPr/>
-        <w:t>They drilled again until the erased dust-route lived in Octavian’s legs as much as in his head. An officer asked whether the boy would last a month east. Agrippa answered with water and another lap, which was clearer than speech. Octavian did not thank him in front of the men. Thanks announced need.</w:t>
-      </w:r>
-    </w:p>
-    <w:p>
-      <w:r>
-        <w:rPr/>
-        <w:t>Before sleep they shared a heel of bread Agrippa had bullied from a cook who respected fists more than kin names. No officers. No Parthia sticks in dust. Just the ordinary theft of calories and Agrippa’s rule spoken twice without theatre: no shadows between them. Octavian practised a thank-you and discarded it. He bumped Agrippa’s shoulder back, clumsy, almost play, and lay down sore, young, and unfinished, exactly as far from Senate heat as the sea allowed. He didn’t dream of crowns. He dreamed of the reserved place offered to the wrong chest, then of missing a drill step and being laughed at by men whose names he needed.</w:t>
-      </w:r>
-    </w:p>
-    <w:p>
-      <w:pPr>
-        <w:spacing w:before="280"/>
-      </w:pPr>
-      <w:r>
-        <w:rPr/>
-        <w:t>Chapter 6</w:t>
-      </w:r>
-    </w:p>
-    <w:p>
-      <w:r>
-        <w:rPr/>
-        <w:t>Perpetuo</w:t>
+        <w:t>The First Praetorship</w:t>
+      </w:r>
+    </w:p>
+    <w:p>
+      <w:r>
+        <w:rPr/>
+        <w:t>The outer court of the Domus Publica was full of men pretending not to wait. Brutus knew most of them by the backs of their heads. Cassius stood by the cold brazier with his arms folded, the way he stood on a ship’s deck, and pretended nothing.</w:t>
+      </w:r>
+    </w:p>
+    <w:p>
+      <w:r>
+        <w:rPr/>
+        <w:t>“He’ll see you first,” Cassius said.</w:t>
+      </w:r>
+    </w:p>
+    <w:p>
+      <w:r>
+        <w:rPr/>
+        <w:t>“He sent for us both.”</w:t>
+      </w:r>
+    </w:p>
+    <w:p>
+      <w:r>
+        <w:rPr/>
+        <w:t>“He sent for us both at the same hour. That is a different thing.” Cassius looked at the door to the inner rooms. “Go on. I’ll warm the brazier with my temper.”</w:t>
+      </w:r>
+    </w:p>
+    <w:p>
+      <w:r>
+        <w:rPr/>
+        <w:t>A slave led Brutus through rooms that smelled of lamp oil and old priests. The chief priest of Rome lived in the house of its religion and kept his papers there like a general’s baggage. Caesar sat at a table under two lamps with lists spread in front of him, and his secretary Faberius at the far end copied names in a hand so small it looked like seed.</w:t>
+      </w:r>
+    </w:p>
+    <w:p>
+      <w:r>
+        <w:rPr/>
+        <w:t>“Marcus,” Caesar said, and stood, which he did not need to do. “Sit. You look like a man who has come to be sentenced.”</w:t>
+      </w:r>
+    </w:p>
+    <w:p>
+      <w:r>
+        <w:rPr/>
+        <w:t>“I have come to be told.”</w:t>
+      </w:r>
+    </w:p>
+    <w:p>
+      <w:r>
+        <w:rPr/>
+        <w:t xml:space="preserve">“In this house that is the same thing.” Caesar turned one of the tablets so Brutus could read it. Next year, written out: the consuls, the praetors, the provinces after. Brutus found his own name before he found the words beside it. </w:t>
+      </w:r>
+      <w:r>
+        <w:rPr>
+          <w:i/>
+        </w:rPr>
+        <w:t>Praetor urbanus.</w:t>
+      </w:r>
+      <w:r>
+        <w:rPr/>
+        <w:t xml:space="preserve"> The city praetorship. The court in the Forum, the edicts, the games of Apollo in July. The first of the praetors, the one men remembered.</w:t>
+      </w:r>
+    </w:p>
+    <w:p>
+      <w:r>
+        <w:rPr/>
+        <w:t xml:space="preserve">Two lines below: </w:t>
+      </w:r>
+      <w:r>
+        <w:rPr>
+          <w:i/>
+        </w:rPr>
+        <w:t>C. Cassius Longinus, inter peregrinos.</w:t>
+      </w:r>
+      <w:r>
+        <w:rPr/>
+        <w:t xml:space="preserve"> The praetor for foreigners. A Greek and a Gaul quarrelling over a cargo of hides.</w:t>
+      </w:r>
+    </w:p>
+    <w:p>
+      <w:r>
+        <w:rPr/>
+        <w:t>“Cassius has served longer,” Brutus said. He had promised himself on the walk over that he would say it, and he was relieved to hear that he had. “He held Syria after Carrhae with what was left of Crassus’s army. He beat the Parthians at Antigonea when nobody in Rome could have found it on a map.”</w:t>
+      </w:r>
+    </w:p>
+    <w:p>
+      <w:r>
+        <w:rPr/>
+        <w:t>“I know. I have read his letters. He writes them as if the Senate were a slow schoolboy.” Caesar took the stylus from Faberius, looked at the tablet, and handed it back. “Cassius has the juster claim. But Brutus must have the first.”</w:t>
+      </w:r>
+    </w:p>
+    <w:p>
+      <w:r>
+        <w:rPr/>
+        <w:t>Faberius wrote nothing. It was already written.</w:t>
+      </w:r>
+    </w:p>
+    <w:p>
+      <w:r>
+        <w:rPr/>
+        <w:t>Brutus waited to be sent away, and was not. Caesar called for wine and then forgot to drink it. He asked about Cisalpine Gaul, where Brutus had governed the year before, and listened to the answer, which was rare enough in Rome that Brutus caught himself talking too long. Caesar had ridden through the province on his way home from Spain and found the towns grateful instead of merely afraid, and he said so, and named two of the towns correctly.</w:t>
+      </w:r>
+    </w:p>
+    <w:p>
+      <w:r>
+        <w:rPr/>
+        <w:t>“And you have been writing,” Caesar said.</w:t>
+      </w:r>
+    </w:p>
+    <w:p>
+      <w:r>
+        <w:rPr/>
+        <w:t>“A little.”</w:t>
+      </w:r>
+    </w:p>
+    <w:p>
+      <w:r>
+        <w:rPr/>
+        <w:t xml:space="preserve">“A little. Your </w:t>
+      </w:r>
+      <w:r>
+        <w:rPr>
+          <w:i/>
+        </w:rPr>
+        <w:t>Cato</w:t>
+      </w:r>
+      <w:r>
+        <w:rPr/>
+        <w:t xml:space="preserve"> reached me in Spain. So did Cicero’s. I had a war to finish and two books telling me Cato was the last Roman, so I wrote back from camp.” He smiled. “You have read my answer?”</w:t>
+      </w:r>
+    </w:p>
+    <w:p>
+      <w:r>
+        <w:rPr/>
+        <w:t>“I have.”</w:t>
+      </w:r>
+    </w:p>
+    <w:p>
+      <w:r>
+        <w:rPr/>
+        <w:t>“It isn’t good. It’s angry, which is worse than bad. I lost my temper with a dead man, and the dead always win that.” He tapped the table. “Write me another and I will answer that too. We will keep the copyists fed.”</w:t>
+      </w:r>
+    </w:p>
+    <w:p>
+      <w:r>
+        <w:rPr/>
+        <w:t>Brutus laughed, and heard himself laugh, and could not take it back.</w:t>
+      </w:r>
+    </w:p>
+    <w:p>
+      <w:r>
+        <w:rPr/>
+        <w:t>Caesar talked about Nicaea, two summers gone, when Brutus had stood in front of him and spoken for King Deiotarus, who had backed Pompey and wanted to keep his kingdom anyway. “I sat there thinking, it matters a great deal what this young man wants. Because whatever he wants, he wants hard.” He meant it as praise. Brutus took it as praise, and only later, walking home, wondered who else had heard it said.</w:t>
+      </w:r>
+    </w:p>
+    <w:p>
+      <w:r>
+        <w:rPr/>
+        <w:t>Faberius trimmed the lamps and went back to his seed-small names. Two doors away the court was still waiting. Caesar talked about the dull things a man talks about at the end of a day: a leaking cistern, a horse gone lame at Narbo, a priest who could not be made to finish a sacrifice before noon. He asked after Porcia.</w:t>
+      </w:r>
+    </w:p>
+    <w:p>
+      <w:r>
+        <w:rPr/>
+        <w:t>“Is she as clever as her father?”</w:t>
+      </w:r>
+    </w:p>
+    <w:p>
+      <w:r>
+        <w:rPr/>
+        <w:t>“Cleverer. Less patient.”</w:t>
+      </w:r>
+    </w:p>
+    <w:p>
+      <w:r>
+        <w:rPr/>
+        <w:t>“Then you will do well, if she lets you.”</w:t>
+      </w:r>
+    </w:p>
+    <w:p>
+      <w:r>
+        <w:rPr/>
+        <w:t>When Brutus rose at last, Caesar walked him to the inner door with a hand on his shoulder. It had the same weight it had had at Larissa after Pharsalus, when Brutus came in out of the mud expecting chains and was given dinner.</w:t>
+      </w:r>
+    </w:p>
+    <w:p>
+      <w:r>
+        <w:rPr/>
+        <w:t>“People tell me things about you,” Caesar said at the door, lightly. He laid the flat of his hand on his own chest. “I tell them Brutus will wait for this poor body. He can afford to.”</w:t>
+      </w:r>
+    </w:p>
+    <w:p>
+      <w:r>
+        <w:rPr/>
+        <w:t>Then he was back at his lists, and Brutus was in the corridor with his face doing something he had not told it to do.</w:t>
+      </w:r>
+    </w:p>
+    <w:p>
+      <w:r>
+        <w:rPr/>
+        <w:t>Cassius was still by the brazier. He looked at Brutus once and unfolded his arms.</w:t>
+      </w:r>
+    </w:p>
+    <w:p>
+      <w:r>
+        <w:rPr/>
+        <w:t>“Well?”</w:t>
+      </w:r>
+    </w:p>
+    <w:p>
+      <w:r>
+        <w:rPr/>
+        <w:t>“He will tell you himself.”</w:t>
+      </w:r>
+    </w:p>
+    <w:p>
+      <w:r>
+        <w:rPr/>
+        <w:t>“He has already told me,” Cassius said. “You came out smiling.” He went past Brutus toward the inner rooms without waiting for the slave. The men in the court watched him go and then watched Brutus, and Brutus put the smile away too late for any of them to miss it.</w:t>
+      </w:r>
+    </w:p>
+    <w:p>
+      <w:r>
+        <w:rPr/>
+        <w:t>He walked home the long way, through the Forum, past the tribunal where in a few days he would sit as first praetor of Rome. The weight stayed on his shoulder the whole way. He tried to think of it as a debt, because a debt could be paid.</w:t>
       </w:r>
     </w:p>
     <w:p>
@@ -2630,49 +2623,13 @@
     <w:p>
       <w:r>
         <w:rPr/>
-        <w:t>A third voice, two stools down, tried to sell another question as grain. “And the gardens across the river: if the foreign lodging holds, do the trees count as collateral, or only the leases men are already shopping?”</w:t>
-      </w:r>
-    </w:p>
-    <w:p>
-      <w:r>
-        <w:rPr/>
-        <w:t>Sosia snorted into his cup. “Last month it was half-hours on roads and a boy with a schedule. Now it’s trees. Same river, worse arithmetic.”</w:t>
-      </w:r>
-    </w:p>
-    <w:p>
-      <w:r>
-        <w:rPr/>
-        <w:t>“Gardens are gardens,” Hordeonius said, mild as a rate sheet. “I price what a lease can move before the Kalends. I do not underwrite Alexandria on a dinner story.”</w:t>
-      </w:r>
-    </w:p>
-    <w:p>
-      <w:r>
-        <w:rPr/>
-        <w:t>He did not certify the child. He certified that the market had begun shopping the river as if trees could clear a debt. Enough for a banker who preferred Kalends to crowns.</w:t>
-      </w:r>
-    </w:p>
-    <w:p>
-      <w:r>
-        <w:rPr/>
-        <w:t>“Nobody says the queen’s name,” said the third voice, pleased with himself.</w:t>
-      </w:r>
-    </w:p>
-    <w:p>
-      <w:r>
-        <w:rPr/>
-        <w:t>“Nobody needs to,” said Sosia. “You have said the trees.”</w:t>
-      </w:r>
-    </w:p>
-    <w:p>
-      <w:r>
-        <w:rPr/>
-        <w:t>He felt the market’s mood thicken. Thick markets made people invent virtues. Virtues, priced wrongly, became recruitment talk before anyone admitted the word. Forever at the doorway. Dead calendars at the stall. Eastern crates counting months.</w:t>
-      </w:r>
-    </w:p>
-    <w:p>
-      <w:r>
-        <w:rPr/>
-        <w:t>“Watch,” the young agent said, already halfway to a darker room in his mind. Hordeonius marked him for interest, not for liberty.</w:t>
+        <w:t>He felt the market’s mood thicken. Thick markets made people invent virtues, and virtues priced wrongly became recruitment talk before anyone admitted the word.</w:t>
+      </w:r>
+    </w:p>
+    <w:p>
+      <w:r>
+        <w:rPr/>
+        <w:t>The young agent folded his tablet of names into his sleeve and went off toward the baths, where men who were not on the list had begun to meet in the side rooms. Hordeonius marked him for interest, not for liberty.</w:t>
       </w:r>
     </w:p>
     <w:p>
@@ -3477,7 +3434,7 @@
     <w:p>
       <w:r>
         <w:rPr/>
-        <w:t>Brutus walked the corridor strip where the older Brutus lived in paint. He wanted the ancestors to forbid him. Paint forbade nothing useful. The shoulder-touch from the spared years sat in his muscle anyway, closer than paint, harder to draft away. For a breath he let himself picture Caesar’s face if the door ever opened with a knife behind it, and the picture hurt enough that he almost ordered them out for that reason alone.</w:t>
+        <w:t>Brutus walked the corridor strip where the older Brutus lived in paint. He wanted the ancestors to forbid him. Paint forbade nothing useful. For a breath he let himself picture Caesar’s face if the door ever opened with a knife behind it, and the picture hurt enough that he almost ordered them out for that reason alone.</w:t>
       </w:r>
     </w:p>
     <w:p>
@@ -7157,7 +7114,7 @@
     <w:p>
       <w:r>
         <w:rPr/>
-        <w:t>Brutus looked once more at the shape on the stones. Softness tried to rise in him. Not the abstract debt: the late hour after forgiveness when Caesar had still wanted his company and made the war feel finished between them. The ordinary talk. The laugh at something small. The hand on his shoulder like kinship politics had not earned. That was the betrayal’s true size. It did not leave when he named the body tyrant. He stood one breath longer than Cassius wanted. Then he crushed it the way he crushed unearned tears: privately, incompletely, with the lie that ancestors approved.</w:t>
+        <w:t>Brutus looked once more at the shape on the stones. Softness tried to rise in him. Not the abstract debt: the December evening of the praetorship, when Caesar had given him the first chair over Cassius and then kept him late anyway, as if he wanted the company. The leaking cistern. The laugh Brutus could not take back. The hand on his shoulder at the door. That was the betrayal’s true size. It did not leave when he named the body tyrant. He stood one breath longer than Cassius wanted. Then he crushed it the way he crushed unearned tears: privately, incompletely, with the lie that ancestors approved.</w:t>
       </w:r>
     </w:p>
     <w:p>
@@ -7406,7 +7363,7 @@
     <w:p>
       <w:r>
         <w:rPr/>
-        <w:t>Brutus watched a knot of women shove a knot of men and felt the first cold thought that was not philosophical: we have killed a man the city loved more than it loves our vocabulary. Under it, smaller and worse: I killed a man who forgave me and kept me close. The late hour after the spare returned without asking leave and stood beside the Forum noise. Wine gone warm. Ordinary talk. The war treated as a misunderstanding their house could afford. The rock could not make private guilt public enough to share. He wanted, badly, to wait until the Forum rearranged itself into the audience the words deserved.</w:t>
+        <w:t>Brutus watched a knot of women shove a knot of men and felt the first cold thought that was not philosophical: we have killed a man the city loved more than it loves our vocabulary. Under it, smaller and worse: I killed a man who forgave me and kept me close. The rock could not make private guilt public enough to share. He wanted, badly, to wait until the Forum rearranged itself into the audience the words deserved.</w:t>
       </w:r>
     </w:p>
     <w:p>
@@ -7974,7 +7931,7 @@
     <w:p>
       <w:r>
         <w:rPr/>
-        <w:t>He entered prices the way other men entered omens. Up a hair on river-adjacent leases. Down on properties too near Liberators’ doors. A man tried to sell him, quietly, a copy of Visellius’s old debt marks, the ghost of a ledger already closed, hinting Basilus and an Antonian name could still be made to squeal.</w:t>
+        <w:t>He entered prices the way other men entered omens. Up a hair on river-adjacent leases. Down on properties too near Liberators’ doors. A man tried to sell him, quietly, a copy of Visellius’s old debt marks, the ghost of a ledger already closed, hinting Basilus and an Antonian name could still be made to squeal. Hordeonius had already looked for the Antonian name himself that morning. Bucco’s stool by the Janus stood empty, his boards taken down in the night, and the soldiers’ widows who owed him were telling each other he had gone south with his tablets before anyone thought to ask for them.</w:t>
       </w:r>
     </w:p>
     <w:p>
@@ -9559,7 +9516,7 @@
     <w:p>
       <w:r>
         <w:rPr/>
-        <w:t>Brutus drafted speeches for a city that would not let him deliver them. Ink dried on periods that would never meet a Forum. Twice he began a sentence that needed Caesar’s name as tyrant and found his hand stopping before the stylus could finish the cruelty. Late-hour forgiveness still had a claim on the grammar. He read Cato into the hedges until a steward’s report of Antonian veterans drinking in the Forum made him set the scroll down mid-sentence. He pressed his thumb hard into the wooden rim of the bench.</w:t>
+        <w:t>Brutus drafted speeches for a city that would not let him deliver them. Ink dried on periods that would never meet a Forum. Twice he began a sentence that needed Caesar’s name as tyrant and found his hand stopping before the stylus could finish the cruelty. He read Cato into the hedges until a steward’s report of Antonian veterans drinking in the Forum made him set the scroll down mid-sentence. He pressed his thumb hard into the wooden rim of the bench.</w:t>
       </w:r>
     </w:p>
     <w:p>
@@ -14304,6 +14261,175 @@
       </w:pPr>
       <w:r>
         <w:rPr/>
+        <w:t>The Legion That Stood</w:t>
+      </w:r>
+    </w:p>
+    <w:p>
+      <w:r>
+        <w:rPr/>
+        <w:t>On the second morning the legion stood again.</w:t>
+      </w:r>
+    </w:p>
+    <w:p>
+      <w:r>
+        <w:rPr/>
+        <w:t>It stood on the parade ground in its lines with its shields grounded and its standards up, in good order, and when the trumpet went it did not move. Nobody shouted. Nobody threw anything. Five thousand men stood in the sun as if they had been told to, and looked across the camp at the good house where Gaius Antonius had dined with their centurions every night that week.</w:t>
+      </w:r>
+    </w:p>
+    <w:p>
+      <w:r>
+        <w:rPr/>
+        <w:t>Brutus watched from the gate of his quarters. He had a speech ready. He had had it ready since the first morning, and each time he looked at the lines it seemed more likely that the speech was what they were waiting for, so that they could refuse to listen to it.</w:t>
+      </w:r>
+    </w:p>
+    <w:p>
+      <w:r>
+        <w:rPr/>
+        <w:t>“They want to be asked,” said one of his officers.</w:t>
+      </w:r>
+    </w:p>
+    <w:p>
+      <w:r>
+        <w:rPr/>
+        <w:t>“They want to be paid,” said another.</w:t>
+      </w:r>
+    </w:p>
+    <w:p>
+      <w:r>
+        <w:rPr/>
+        <w:t>“They want to be his brother’s,” Brutus said, “and they do not want to say so.”</w:t>
+      </w:r>
+    </w:p>
+    <w:p>
+      <w:r>
+        <w:rPr/>
+        <w:t>A rider came up the coast road in the middle of that, grey with dust, with his mother’s seal on the bag, and the guards let him through. It was Servilia’s freedman, the old one who had carried her letters for thirty years and had once carried Brutus on his shoulders round the atrium to look at the masks. He got down off the horse badly. He did not hand over the bag. He stood in front of Brutus with it held against his chest, and Brutus knew from the way he held it.</w:t>
+      </w:r>
+    </w:p>
+    <w:p>
+      <w:r>
+        <w:rPr/>
+        <w:t>“Tell me,” Brutus said.</w:t>
+      </w:r>
+    </w:p>
+    <w:p>
+      <w:r>
+        <w:rPr/>
+        <w:t>“The lady Porcia, master. In Rome. Before the Kalends.”</w:t>
+      </w:r>
+    </w:p>
+    <w:p>
+      <w:r>
+        <w:rPr/>
+        <w:t>Brutus nodded. He found he was still nodding and stopped.</w:t>
+      </w:r>
+    </w:p>
+    <w:p>
+      <w:r>
+        <w:rPr/>
+        <w:t>“Your mother writes that she had been...”</w:t>
+      </w:r>
+    </w:p>
+    <w:p>
+      <w:r>
+        <w:rPr/>
+        <w:t>“No,” Brutus said. “Not how. Not yet.”</w:t>
+      </w:r>
+    </w:p>
+    <w:p>
+      <w:r>
+        <w:rPr/>
+        <w:t>The freedman opened the bag. There were three letters on top, and the uppermost had Cicero’s seal. Cicero must have written the same day the news went round the Palatine and sent it to Servilia’s house to travel with hers, because Cicero would always know which courier was fastest. Brutus took that one. He could bear Cicero. Cicero would be well written.</w:t>
+      </w:r>
+    </w:p>
+    <w:p>
+      <w:r>
+        <w:rPr/>
+        <w:t>It was. It told him he was a philosopher, and that philosophers were watched. It told him that the whole army was looking to see how he bore it, and that a man who had read what he had read would know how to set a measure to grief.</w:t>
+      </w:r>
+    </w:p>
+    <w:p>
+      <w:r>
+        <w:rPr/>
+        <w:t>He looked up from the wax. Across the parade ground five thousand men were looking at him.</w:t>
+      </w:r>
+    </w:p>
+    <w:p>
+      <w:r>
+        <w:rPr/>
+        <w:t>They had seen the rider. They had seen the old man’s face, and the bag held like that, and their general at his gate reading. Word was already going down the ranks the way word does in a camp, faster than a trumpet: the front cohort, then the second, a turn of heads like wind going over barley.</w:t>
+      </w:r>
+    </w:p>
+    <w:p>
+      <w:r>
+        <w:rPr/>
+        <w:t>He gave the letter to the freedman. “Put it with the others.”</w:t>
+      </w:r>
+    </w:p>
+    <w:p>
+      <w:r>
+        <w:rPr/>
+        <w:t>Then he walked out onto the parade ground without his lictors and without the speech. The sun was hot on his head. He walked until he was in front of the first cohort, near enough to see the sweat on the standard-bearer’s lip, and he stopped there and said nothing at all. He had nothing he could say that would not be either about her or not about her, and both were impossible.</w:t>
+      </w:r>
+    </w:p>
+    <w:p>
+      <w:r>
+        <w:rPr/>
+        <w:t>“Sound it,” he said to the trumpeter, over his shoulder.</w:t>
+      </w:r>
+    </w:p>
+    <w:p>
+      <w:r>
+        <w:rPr/>
+        <w:t>The trumpet went.</w:t>
+      </w:r>
+    </w:p>
+    <w:p>
+      <w:r>
+        <w:rPr/>
+        <w:t>For three breaths nothing happened. Then the centurion of the front cohort, a broad Picene with a scar through one eyebrow who had dined at Gaius’s table two nights running, lifted his shield off the ground. His men lifted theirs. Down the line, cohort by cohort, the shields came up, and the standards dipped and rose, and the legion turned the way it was meant to turn and marched off the parade ground to its drill.</w:t>
+      </w:r>
+    </w:p>
+    <w:p>
+      <w:r>
+        <w:rPr/>
+        <w:t>Brutus stood and watched it go. He knew why they had moved. It was not the Republic, and it was not his speech, and it was not the pay chest. They had moved because their general’s wife was dead and he had walked out into the sun with no words, and they could not bring themselves to make him stand there.</w:t>
+      </w:r>
+    </w:p>
+    <w:p>
+      <w:r>
+        <w:rPr/>
+        <w:t>He would have given a great deal for it to have been the Republic.</w:t>
+      </w:r>
+    </w:p>
+    <w:p>
+      <w:r>
+        <w:rPr/>
+        <w:t>That evening he gave the order for the ship. Gaius would be well treated, with his own servants and a guard, anchored off the coast and out of reach of anyone’s dinner. Brutus wrote it to the Senate as a measure for Gaius’s own safety, and it was well written.</w:t>
+      </w:r>
+    </w:p>
+    <w:p>
+      <w:r>
+        <w:rPr/>
+        <w:t xml:space="preserve">His mother’s letter he did not open. He knew it would tell him how. He put it in the cedar box with Cicero’s, unopened, and sat with his hand on the lid until the lamp went out on its own. He thought of her hand in March, hot in his until the window greyed, and her voice saying </w:t>
+      </w:r>
+      <w:r>
+        <w:rPr>
+          <w:i/>
+        </w:rPr>
+        <w:t>I can</w:t>
+      </w:r>
+      <w:r>
+        <w:rPr/>
+        <w:t>.</w:t>
+      </w:r>
+    </w:p>
+    <w:p>
+      <w:pPr>
+        <w:spacing w:before="200"/>
+      </w:pPr>
+      <w:r>
+        <w:rPr/>
         <w:t>Consul</w:t>
       </w:r>
     </w:p>
@@ -15067,7 +15193,7 @@
       </w:r>
       <w:r>
         <w:rPr/>
-        <w:t xml:space="preserve"> in a private cipher and hated that honesty still felt like bookkeeping virtue. In the dark he smelled Visellius’s old room for no reason and told himself archaeology was closed.</w:t>
+        <w:t xml:space="preserve"> in a private cipher and hated that honesty still felt like bookkeeping virtue. In the dark he smelled Visellius’s old room for no reason. Bucco was back from the south that week, Sosia said, lending to the triumvirs’ soldiers against their share of the auctions, and no magistrate in Rome was going to ask Antony’s moneylender about a freedman’s son’s throat. Hordeonius told himself archaeology was closed.</w:t>
       </w:r>
     </w:p>
     <w:p>
@@ -16160,13 +16286,13 @@
     <w:p>
       <w:r>
         <w:rPr/>
-        <w:t>The litter swayed on the Formiae road. Sea air lifted the curtain edges and brought salt that tasted like unfinished letters. Atticus unanswered. Philippics still warm in memory like a fever that thought it was an army. He had left too late and too early. Late for safety. Early for the dignity of a man who still thought negotiation might grow legs if fed enough clauses.</w:t>
-      </w:r>
-    </w:p>
-    <w:p>
-      <w:r>
-        <w:rPr/>
-        <w:t xml:space="preserve">He had already tried the sea. A hired ship out of Astura, Brutus somewhere beyond the far coast with legions and a welcome, and Marcus among the legions, and the swell had turned his stomach and then his nerve. He had made them put in at Caieta. He had climbed to the villa above Formiae with salt in his beard and told his slaves, </w:t>
+        <w:t>The crows woke him. There was a small temple of Apollo on the shore below the villa, and the birds that lived in its roof had come up to his window at first light, a whole quarrelling crowd of them on the sill. One had hopped inside and was tugging with its beak at the blanket over his face. He lay and watched it work. Tiro would have written it down as an omen. Tiro was not there. The slaves were, standing in the doorway, and they were not asking his opinion.</w:t>
+      </w:r>
+    </w:p>
+    <w:p>
+      <w:r>
+        <w:rPr/>
+        <w:t xml:space="preserve">He had already tried the sea. A hired ship out of Astura, Brutus somewhere beyond the far coast with legions and a welcome, and Marcus among the legions, and the swell had turned his stomach and then his nerve. He had made them put in at Caieta. He had climbed to the villa with salt in his beard and told his slaves, </w:t>
       </w:r>
       <w:r>
         <w:rPr>
@@ -16176,67 +16302,91 @@
       </w:r>
       <w:r>
         <w:rPr/>
-        <w:t xml:space="preserve"> By dinner the sentence embarrassed him; it had come too easily. At first light the slaves had not asked his opinion. They had lifted him into the litter and turned it back toward the water.</w:t>
-      </w:r>
-    </w:p>
-    <w:p>
-      <w:r>
-        <w:rPr/>
-        <w:t>Proscription had turned his name into a price. A freedman had brought the copy to Tusculum: his own name, and his brother Quintus’s, and the nephew’s, under an edict sealed by three men. One of the three was the boy. He tried to treat the price as a rhetorical problem and failed. Rhetoric needed an audience; hunters weren’t one. He catalogued, helplessly, the old skills: period, antithesis, the pause that made juries lean. None of them lengthened a road.</w:t>
-      </w:r>
-    </w:p>
-    <w:p>
-      <w:r>
-        <w:rPr/>
-        <w:t>Atticus lived in his head as audience. So did the Capitol’s first day after the knives, enlarged by memory into courage. So did the boy he had aimed at Antony and called statecraft. The boy had learned. Antony had remembered. Brutus’s polite exile at Lanuvium felt, suddenly, like a kinder country. A cage with a view.</w:t>
-      </w:r>
-    </w:p>
-    <w:p>
-      <w:r>
-        <w:rPr/>
-        <w:t>He remembered telling a friend that the Republic still had a voice. The friend had said the Republic had Cicero’s voice. The distinction, once clever, now walked beside the litter like a creditor. He had waved caution away with a jury gesture once. The gesture had not grown a cohort.</w:t>
-      </w:r>
-    </w:p>
-    <w:p>
-      <w:r>
-        <w:rPr/>
-        <w:t>A boy selling fish by the verge stared at the litter. Fame might have been a colour on it. Cicero almost shaped a greeting and then didn’t. Greeting belonged to mornings when names weren’t prices. He counted the poles’ rhythm and tried to turn it into a period. The period refused to close.</w:t>
-      </w:r>
-    </w:p>
-    <w:p>
-      <w:r>
-        <w:rPr/>
-        <w:t>“Faster,” he told the bearers, then hated the undignified word. Speed wasn’t eloquence. Speed was what animals did when the forest closed.</w:t>
-      </w:r>
-    </w:p>
-    <w:p>
-      <w:r>
-        <w:rPr/>
-        <w:t>When the killers found the road, his attendants made the noises attendants make. Panic first. Then the reckoning of their own skins. Someone begged. Someone ran. Someone stayed because staying was also a calculation, and calculations had always been Cicero’s neighbours if not his friends. He put his head out enough to be seen.</w:t>
-      </w:r>
-    </w:p>
-    <w:p>
-      <w:r>
-        <w:rPr/>
-        <w:t>The officer at the front had a face he knew. It took a moment; names had begun to take him moments. Popillius. A young man once, charged with his father’s death, and Cicero had talked a jury out of sewing him into the parricide’s sack and giving him to the river. The jury had leaned. Popillius had kissed his hand in the street. Now he held a drawn sword and would not look at the litter, and a centurion beside him did the looking for both.</w:t>
-      </w:r>
-    </w:p>
-    <w:p>
-      <w:r>
-        <w:rPr/>
-        <w:t>Cicero looked at them the way he had looked at juries: measuring, already composing, already knowing the verdict lived outside the speech.</w:t>
-      </w:r>
-    </w:p>
-    <w:p>
-      <w:r>
-        <w:rPr/>
-        <w:t>He didn’t deliver a final Philippic. Rhetoric needed breath and an hour. He had seconds and a neck. He offered them the stillness he had practised in courts when the verdict was already known. He almost shaped a line about the Republic. He let it die unspoken.</w:t>
-      </w:r>
-    </w:p>
-    <w:p>
-      <w:r>
-        <w:rPr/>
-        <w:t>He thought, absurdly, of a softened sentence he had once drafted for Atticus about extraordinary medicine. Medicine had become the list. The list had become this road.</w:t>
+        <w:t xml:space="preserve"> By dinner the sentence embarrassed him. It had come too easily.</w:t>
+      </w:r>
+    </w:p>
+    <w:p>
+      <w:r>
+        <w:rPr/>
+        <w:t>“There are soldiers on the Formiae road, master,” said the steward. “We are taking you to the ship.”</w:t>
+      </w:r>
+    </w:p>
+    <w:p>
+      <w:r>
+        <w:rPr/>
+        <w:t>They lifted him into the litter in his night tunic, with a cloak thrown over it, and carried him out by the garden door and down the shaded walk that ran through the trees to the sea. Through the gap in the curtain he saw green and then grey, the water showing between trunks. Sea air brought salt that tasted like unfinished letters.</w:t>
+      </w:r>
+    </w:p>
+    <w:p>
+      <w:r>
+        <w:rPr/>
+        <w:t>Proscription had turned his name into a price. A freedman had brought the copy to Tusculum: his own name, and his brother Quintus’s, and the nephew’s, under an edict sealed by three men. One of the three was the boy. He had tried to treat it as a rhetorical problem and failed. Rhetoric needed an audience, and hunters were not one. The boy he had aimed at Antony and called statecraft had learned. Antony had remembered.</w:t>
+      </w:r>
+    </w:p>
+    <w:p>
+      <w:r>
+        <w:rPr/>
+        <w:t>Behind them, up at the villa, someone was beating on a door. Then wood gave, and there was shouting in the house, the flat Latin of men who had been told a name and a reward.</w:t>
+      </w:r>
+    </w:p>
+    <w:p>
+      <w:r>
+        <w:rPr/>
+        <w:t>“Faster,” he told the bearers, and hated the word. Speed was not eloquence. Speed was what animals did when the forest closed.</w:t>
+      </w:r>
+    </w:p>
+    <w:p>
+      <w:r>
+        <w:rPr/>
+        <w:t>He looked back up the walk through the curtain. At the top of it, by the garden door, a young man was standing among the soldiers and pointing down the path between the trees. Cicero knew the shape of him before he knew the face. Philologus. Quintus’s freedman, a clever boy Cicero had taught to read Greek himself, at his own table, because the boy had wanted it so badly. Philologus pointed, and the soldiers came down the walk at a run, and some of them peeled off to the left to go round by the shore and cut the litter off where the trees ended.</w:t>
+      </w:r>
+    </w:p>
+    <w:p>
+      <w:r>
+        <w:rPr/>
+        <w:t>His bearers stopped. Some of the slaves had knives out. One of them, a big Thracian who carried the front left pole, turned with his feet set as if he meant to hold the path alone.</w:t>
+      </w:r>
+    </w:p>
+    <w:p>
+      <w:r>
+        <w:rPr/>
+        <w:t>“Put it down,” Cicero said. “Put it down. All of you. Put those away.”</w:t>
+      </w:r>
+    </w:p>
+    <w:p>
+      <w:r>
+        <w:rPr/>
+        <w:t>They put the litter down on the walk. He did not get out. He sat as he had sat in a hundred courts while the other side finished, his left hand at his chin, and looked at the men coming down between the trees. He knew what he looked like. Dust in his hair, which nobody had combed; a face gone thin with the weeks since Tusculum; sixty-three years old in a night tunic in a wood. He let them look.</w:t>
+      </w:r>
+    </w:p>
+    <w:p>
+      <w:r>
+        <w:rPr/>
+        <w:t>The officer at the front had a face he knew. It took a moment; names had begun to take him moments. Popillius. A young man once, charged with his father’s death, and Cicero had talked a jury out of sewing him into the parricide’s sack and giving him to the river. The jury had leaned. Popillius had kissed his hand in the street. Now he held a drawn sword and would not look at the litter. The centurion beside him did the looking for both. Herennius, someone said. The name meant nothing. That seemed wrong too.</w:t>
+      </w:r>
+    </w:p>
+    <w:p>
+      <w:r>
+        <w:rPr/>
+        <w:t>Most of the soldiers covered their faces. He noticed that and was absurdly grateful for it, as for applause from the back benches.</w:t>
+      </w:r>
+    </w:p>
+    <w:p>
+      <w:r>
+        <w:rPr/>
+        <w:t>He did not deliver a final Philippic. Rhetoric needed breath and an hour, and he had a neck. He thought of Atticus, who would understand the silence without needing a courier to explain it. He hoped the boy would not mistake it for permission.</w:t>
+      </w:r>
+    </w:p>
+    <w:p>
+      <w:r>
+        <w:rPr/>
+        <w:t>Herennius came up to the litter. Cicero leaned out of it and stretched his neck over the edge, the way a man leans out to hear something said quietly.</w:t>
+      </w:r>
+    </w:p>
+    <w:p>
+      <w:r>
+        <w:rPr/>
+        <w:t>“Come on, veteran,” he said. “If you can do nothing else properly, do this.”</w:t>
       </w:r>
     </w:p>
     <w:p>
@@ -16248,13 +16398,156 @@
     <w:p>
       <w:r>
         <w:rPr/>
-        <w:t>The sea kept sounding like itself. That offended him more than the blades. The surf didn’t pause for a verdict.</w:t>
-      </w:r>
-    </w:p>
-    <w:p>
-      <w:r>
-        <w:rPr/>
-        <w:t>His last clear thought was the petty wish that Atticus would understand the silence without needing a courier to explain it. And that the boy wouldn’t mistake silence for permission.</w:t>
+        <w:t>Through the trees the sea kept sounding like itself.</w:t>
+      </w:r>
+    </w:p>
+    <w:p>
+      <w:pPr>
+        <w:spacing w:before="200"/>
+      </w:pPr>
+      <w:r>
+        <w:rPr/>
+        <w:t>Good Sister</w:t>
+      </w:r>
+    </w:p>
+    <w:p>
+      <w:r>
+        <w:rPr/>
+        <w:t>The tribunal had been built in a morning, out of planks and an old awning, and by December it had the look of a counting table that had been left out in the rain. Antony sat at one end of it, Lepidus in the middle because Lepidus liked the middle, and the boy at the far end with a brazier at his feet and a cloak up to his ears.</w:t>
+      </w:r>
+    </w:p>
+    <w:p>
+      <w:r>
+        <w:rPr/>
+        <w:t>Business came up the steps in the order the clerks allowed. A slave who had given up his master wanted the reward and his freedom, and had a witness to swear he had pointed out the right man. A widow wanted her dowry back out of an estate that was being auctioned. A tribune of the soldiers wanted a house on the Esquiline before the auction rather than after it. Antony paid the slave, refused the widow, and told the tribune to bid like an honest thief. The crowd below liked that. The crowd liked most of what he said, the way a crowd likes a big man who is not pretending to be sorry.</w:t>
+      </w:r>
+    </w:p>
+    <w:p>
+      <w:r>
+        <w:rPr/>
+        <w:t>Then the crowd went quiet from the back, which crowds do not do for petitions, and opened.</w:t>
+      </w:r>
+    </w:p>
+    <w:p>
+      <w:r>
+        <w:rPr/>
+        <w:t>His mother came through it with two grey maids and her old doorkeeper behind her. She had put on her good stola and no jewellery at all. She walked as if the Forum were her own atrium and the soldiers along the steps were furniture somebody else had bought, and when she reached the foot of the tribunal she did not wait for a clerk.</w:t>
+      </w:r>
+    </w:p>
+    <w:p>
+      <w:r>
+        <w:rPr/>
+        <w:t>“Imperator,” she said.</w:t>
+      </w:r>
+    </w:p>
+    <w:p>
+      <w:r>
+        <w:rPr/>
+        <w:t xml:space="preserve">She had never once called him that. He had been </w:t>
+      </w:r>
+      <w:r>
+        <w:rPr>
+          <w:i/>
+        </w:rPr>
+        <w:t>Marcus</w:t>
+      </w:r>
+      <w:r>
+        <w:rPr/>
+        <w:t xml:space="preserve"> to her through two wars and a consulship, and </w:t>
+      </w:r>
+      <w:r>
+        <w:rPr>
+          <w:i/>
+        </w:rPr>
+        <w:t>you</w:t>
+      </w:r>
+      <w:r>
+        <w:rPr/>
+        <w:t xml:space="preserve"> when she was angry.</w:t>
+      </w:r>
+    </w:p>
+    <w:p>
+      <w:r>
+        <w:rPr/>
+        <w:t>“I have come to inform against myself,” Julia said, clearly enough for the back of the crowd. “Lucius Caesar is in my house. I took him in and I am keeping him, and I will go on keeping him until you kill us both, since the law you have made gives the same penalty to those who hide them.”</w:t>
+      </w:r>
+    </w:p>
+    <w:p>
+      <w:r>
+        <w:rPr/>
+        <w:t>Nobody on the tribunal moved. Lepidus looked at his hands. Antony could feel the boy looking at him from the far end without turning his head.</w:t>
+      </w:r>
+    </w:p>
+    <w:p>
+      <w:r>
+        <w:rPr/>
+        <w:t>Lucius had stood up in the Senate in the spring and voted his nephew a public enemy. Antony had remembered it at Bononia, on the island in the river, with the three of them trading names like dice. The boy had given up Cicero. Lepidus had given up his own brother. Antony had given up his mother’s brother and thought it cheap at the price. Cicero was on a path at Caieta now. Lepidus’s brother was on his way to Brutus. Lucius was in a back room below the Carinae, drinking his sister’s wine.</w:t>
+      </w:r>
+    </w:p>
+    <w:p>
+      <w:r>
+        <w:rPr/>
+        <w:t>He looked down at her. She was smaller than he remembered, and straighter. Her hands were inside her sleeves. He had seen her stand like this once before, when he was twenty and his stepfather had been strangled in the prison under the Capitol on Cicero’s word, and his mother had gone to Cicero’s wife to beg for the body. Cicero had made her beg.</w:t>
+      </w:r>
+    </w:p>
+    <w:p>
+      <w:r>
+        <w:rPr/>
+        <w:t>She was not going to wait for this.</w:t>
+      </w:r>
+    </w:p>
+    <w:p>
+      <w:r>
+        <w:rPr/>
+        <w:t>Antony laughed. It came out louder than he meant, and the front of the crowd flinched before it understood that it was being allowed to laugh too.</w:t>
+      </w:r>
+    </w:p>
+    <w:p>
+      <w:r>
+        <w:rPr/>
+        <w:t>“You have been a good sister,” he said, as loud as she had been. “You have been a very bad mother. You should have let him go to the river in the spring, when he was voting me an enemy, and you should let him go now.” He leaned back. The planks creaked. “Plancus.”</w:t>
+      </w:r>
+    </w:p>
+    <w:p>
+      <w:r>
+        <w:rPr/>
+        <w:t>Plancus was at the foot of the steps with his own clerks, a fortnight from his triumph and his consulship both, and he came up the steps as fast as dignity allowed.</w:t>
+      </w:r>
+    </w:p>
+    <w:p>
+      <w:r>
+        <w:rPr/>
+        <w:t>“The consul-designate will bring a motion,” Antony said, “restoring Lucius Julius Caesar to his rights. My mother has the gratitude of the Republic, which is not much, and mine, which is less.”</w:t>
+      </w:r>
+    </w:p>
+    <w:p>
+      <w:r>
+        <w:rPr/>
+        <w:t>Plancus said that it would be done. The crowd made the noise a crowd makes when it has been given a story to take home.</w:t>
+      </w:r>
+    </w:p>
+    <w:p>
+      <w:r>
+        <w:rPr/>
+        <w:t>Julia did not thank him. She looked at him a moment longer, the look that had always meant she would discuss it with him later, and then she turned and went back through the crowd the way she had come, with the doorkeeper hurrying to keep up.</w:t>
+      </w:r>
+    </w:p>
+    <w:p>
+      <w:r>
+        <w:rPr/>
+        <w:t>The boy said, from the far end, quietly, “That was well done.”</w:t>
+      </w:r>
+    </w:p>
+    <w:p>
+      <w:r>
+        <w:rPr/>
+        <w:t>“It was my mother,” Antony said. “Next.”</w:t>
+      </w:r>
+    </w:p>
+    <w:p>
+      <w:r>
+        <w:rPr/>
+        <w:t>The next man up the steps had a list of his own, three neighbours and a debt, and he had already started talking. Antony listened. He found that he was listening hard, harder than the man deserved, so that he would not have to look at the gap in the crowd where his mother had been.</w:t>
       </w:r>
     </w:p>
     <w:p>
@@ -16714,7 +17007,7 @@
     <w:p>
       <w:r>
         <w:rPr/>
-        <w:t>The next day it was given out that the list of women was cut from fourteen hundred to four hundred, and that men with more than a hundred thousand would pay instead. The kitchen talked about nothing else. The cook said it was the first time in living memory the three of them had taken a step back. The steward said it was arithmetic. The boy who could read said Lucius Caesar was off the lists too, and had been since before the Saturnalia, after his sister stood in front of this same tribunal and said she had hidden him and would go with him if he went. Nysa had heard the beginning of that, at a door, with a jug in her hand.</w:t>
+        <w:t>The next day it was given out that the list of women was cut from fourteen hundred to four hundred, and that men with more than a hundred thousand would pay instead. The kitchen talked about nothing else. The cook said it was the first time in living memory the three of them had taken a step back. The steward said it was arithmetic. The boy who could read said Lucius Caesar was off the lists too, and had been since before the Saturnalia. Nysa had heard the beginning of that, at a door, with a jug in her hand.</w:t>
       </w:r>
     </w:p>
     <w:p>
@@ -17329,29 +17622,13 @@
     <w:p>
       <w:r>
         <w:rPr/>
-        <w:t>When the secretary had gone he put the August letter back in the cedar box with the others. At the bottom of the box, under all of them, was the one he had not taken out since the summer.</w:t>
-      </w:r>
-    </w:p>
-    <w:p>
-      <w:r>
-        <w:rPr/>
-        <w:t xml:space="preserve">Cicero had written it in June, from Rome, when the news came. It was a fine letter. Brutus had known it would be a fine letter before he broke the seal, and had hated that he knew. It told him that he was a philosopher, and that philosophers were watched; that the whole army was looking to see how he bore it; that grief was natural and a man who had read what he had read would know how to set a measure to it. It did not say how she had died. Cicero did not know. Nobody seemed to know. One letter from Rome said she had been ill since the spring and the illness had taken her. One said her women had shut her in a room with a brazier, to keep her safe, and in the morning the room was very quiet. One said coals, from the brazier, and her own hand, and that she had been watched for days and had waited until she was not. Brutus had read them all once and asked no one which was true. He had thought, for one evening, of the leg, and the fever, and her voice saying </w:t>
-      </w:r>
-      <w:r>
-        <w:rPr>
-          <w:i/>
-        </w:rPr>
-        <w:t>I can</w:t>
-      </w:r>
-      <w:r>
-        <w:rPr/>
-        <w:t>.</w:t>
-      </w:r>
-    </w:p>
-    <w:p>
-      <w:r>
-        <w:rPr/>
-        <w:t>He did not take the letter out. He laid his hand flat on the others, over it, for a moment, the way he had held her hot hand in March until the window greyed. Then he closed the clasp. He did not think he would want to read them when he was old. He did not think, now, that he would be.</w:t>
+        <w:t>When the secretary had gone he put the August letter back in the cedar box with the others. At the bottom of the box, under all of them, were the two from June: Cicero’s, which told him that philosophers were watched, and his mother’s, still sealed. Other letters since had told him how she died, in three different ways. An illness since the spring. A shut room and a brazier, to keep her safe, and in the morning the room very quiet. Coals from the brazier, and her own hand, after days of being watched. He had read each once and asked no one which was true.</w:t>
+      </w:r>
+    </w:p>
+    <w:p>
+      <w:r>
+        <w:rPr/>
+        <w:t>He laid his hand flat on the letters for a moment. Then he closed the clasp. He did not think he would want to read them when he was old. He did not think, now, that he would be.</w:t>
       </w:r>
     </w:p>
     <w:p>
@@ -17964,99 +18241,131 @@
     <w:p>
       <w:r>
         <w:rPr/>
-        <w:t>The messenger’s mouth was wrong before the words were.</w:t>
-      </w:r>
-    </w:p>
-    <w:p>
-      <w:r>
-        <w:rPr/>
-        <w:t xml:space="preserve">Dust made the man’s tongue thick; fear made it thicker. He had lost a sandal somewhere on the climb; one foot bled into the packed dirt of Cassius’s forward post. The map in Cassius’s head hungered for confirmation anyway. The first report said </w:t>
+        <w:t>By noon Cassius had lost his camp.</w:t>
+      </w:r>
+    </w:p>
+    <w:p>
+      <w:r>
+        <w:rPr/>
+        <w:t>He had watched it go from the slope above the marsh. Antony’s men came up out of the reeds at the end of the causeway they had spent ten nights building, and the palisade went down in one place and then in three, and his tents were burning before the trumpets on his own side had finished arguing about what to sound. He took a standard from a man who was running past him and drove it into the ground at his feet. The man kept running. Now Cassius stood on a low hill above the ruin with a few officers, a handful of horse and Pindarus, and below him the plain was dust.</w:t>
+      </w:r>
+    </w:p>
+    <w:p>
+      <w:r>
+        <w:rPr/>
+        <w:t>It was his birthday. The cook had said so at dawn, over the bread, and Cassius had told him to save it for the evening.</w:t>
+      </w:r>
+    </w:p>
+    <w:p>
+      <w:r>
+        <w:rPr/>
+        <w:t>“Brutus,” he said. Nobody answered, because nobody knew. The messengers who came up the slope had lost sandals and words on the climb. One said the left was gone. One said the right was. A third said there had been shouting somewhere north, which could have meant anything. Cassius made each of them point. Their fingers landed on different parts of the same dust.</w:t>
+      </w:r>
+    </w:p>
+    <w:p>
+      <w:r>
+        <w:rPr/>
+        <w:t>“Numbers,” Cassius said. “Cohorts. Eagles. Anything with a body attached.”</w:t>
+      </w:r>
+    </w:p>
+    <w:p>
+      <w:r>
+        <w:rPr/>
+        <w:t>There were no numbers. He sent a runner down the reverse slope for a count and the runner did not come back. He checked the water jars himself while he waited. Half full. He moved a shield that did not need moving. His eyes had never been good at distance, and in glare they were worse. He had spent twenty years making other men’s reports clear enough to act on, and now he could not see the end of his own hill.</w:t>
+      </w:r>
+    </w:p>
+    <w:p>
+      <w:r>
+        <w:rPr/>
+        <w:t>Then horsemen came out of the dust from the north, a troop of them, riding hard toward the hill.</w:t>
+      </w:r>
+    </w:p>
+    <w:p>
+      <w:r>
+        <w:rPr/>
+        <w:t>“Ours,” said one of the officers.</w:t>
+      </w:r>
+    </w:p>
+    <w:p>
+      <w:r>
+        <w:rPr/>
+        <w:t>“Antony’s,” said another. “They’ve gone round the marsh.”</w:t>
+      </w:r>
+    </w:p>
+    <w:p>
+      <w:r>
+        <w:rPr/>
+        <w:t>Cassius looked for a colour, a crest, the way a man sat a horse, and got only movement. “Titinius.”</w:t>
+      </w:r>
+    </w:p>
+    <w:p>
+      <w:r>
+        <w:rPr/>
+        <w:t>Titinius was beside him at once. He was an old friend and had the good soldier’s habit of waiting to be told.</w:t>
+      </w:r>
+    </w:p>
+    <w:p>
+      <w:r>
+        <w:rPr/>
+        <w:t>“Go down and see who they are,” Cassius said. “Then come back up and tell me. Not your opinion. What you see.”</w:t>
+      </w:r>
+    </w:p>
+    <w:p>
+      <w:r>
+        <w:rPr/>
+        <w:t>Titinius rode down. Cassius watched him go small. He watched him reach the horsemen and watched them close round him, and then a shout went up off the plain, a great ragged roar, and men were jumping down off their horses and seizing Titinius and pulling him out of the saddle.</w:t>
+      </w:r>
+    </w:p>
+    <w:p>
+      <w:r>
+        <w:rPr/>
+        <w:t xml:space="preserve">“Taken,” said the officer who had said </w:t>
       </w:r>
       <w:r>
         <w:rPr>
           <w:i/>
         </w:rPr>
-        <w:t>lost</w:t>
-      </w:r>
-      <w:r>
-        <w:rPr/>
-        <w:t xml:space="preserve"> in a shape that matched Cassius’s worst sketch of the day. Standards gone. Wing broken. Brutus somewhere beyond the marsh and silent. Cassius’s hand found a tablet edge and gripped until the wax remembered his thumb.</w:t>
-      </w:r>
-    </w:p>
-    <w:p>
-      <w:r>
-        <w:rPr/>
-        <w:t>“Say it again,” Cassius said. “Slower. Names. Directions. Which standard.”</w:t>
-      </w:r>
-    </w:p>
-    <w:p>
-      <w:r>
-        <w:rPr/>
-        <w:t>The messenger tried. Names arrived missing: a century mark without a cognomen, a hill that might have been the left ditch. Directions softened into gestures at dust. A standard might have fallen or only dipped. Cassius made him point at the wax sketch of the sector. The finger landed between two lines and stayed there, trembling.</w:t>
-      </w:r>
-    </w:p>
-    <w:p>
-      <w:r>
-        <w:rPr/>
-        <w:t>Cassius sent a runner down the reverse slope for a second count: cohort numbers, eagle sightings, anything with a body attached. He checked the water jars himself while he waited. Half full. He moved a shield that did not need moving. Do the next countable thing while the uncountable arrives.</w:t>
-      </w:r>
-    </w:p>
-    <w:p>
-      <w:r>
-        <w:rPr/>
-        <w:t>The runner came back empty-mouthed. No second count. Only another man who had heard the first yell secondhand and wanted to be useful by repeating it louder.</w:t>
-      </w:r>
-    </w:p>
-    <w:p>
-      <w:r>
-        <w:rPr/>
-        <w:t xml:space="preserve">“Brutus,” Cassius said. One clarifying question about the sector. The answer came as a shrug wearing words: </w:t>
-      </w:r>
-      <w:r>
-        <w:rPr>
-          <w:i/>
-        </w:rPr>
-        <w:t>no word; marsh between; dust.</w:t>
-      </w:r>
-    </w:p>
-    <w:p>
-      <w:r>
-        <w:rPr/>
-        <w:t>Cassius, who had trusted numbers, trusted a broken number because broken numbers still looked like numbers if you needed them enough to hate delay. Incomplete had always been his enemy in other men’s mouths. Now it lived in his own ears. He looked once toward the dust where Brutus might still be winning and saw only glare, nothing he could count, nothing he could punish.</w:t>
-      </w:r>
-    </w:p>
-    <w:p>
-      <w:r>
-        <w:rPr/>
-        <w:t>He almost waited. Waiting was the mathematician’s virtue. Waiting here meant listening to more mouths invent geometry. He felt the old contempt for delay rise and catch on something softer: hope, or the habit of correcting clerks before they ruined a sum. For three breaths he held both. The incomplete report as a sum that would not clear. And the possibility that Brutus was still rearranging the other half of the plain without him.</w:t>
-      </w:r>
-    </w:p>
-    <w:p>
-      <w:r>
-        <w:rPr/>
-        <w:t>The softer thing lost.</w:t>
-      </w:r>
-    </w:p>
-    <w:p>
-      <w:r>
-        <w:rPr/>
-        <w:t xml:space="preserve">He dismissed the messengers with a bow that meant </w:t>
-      </w:r>
-      <w:r>
-        <w:rPr>
-          <w:i/>
-        </w:rPr>
-        <w:t>done</w:t>
-      </w:r>
-      <w:r>
-        <w:rPr/>
-        <w:t>. With only two men left near him, whose faces already disagreed about everything except the steel, he called Pindarus over. He had kept the freedman at his elbow since Carrhae, since the desert where he had watched what the Parthians did with Crassus’s head, for this one errand. Pindarus held the blade where Cassius set it. Cassius made the end himself rather than wait for the plain to invent a worse one.</w:t>
-      </w:r>
-    </w:p>
-    <w:p>
-      <w:r>
-        <w:rPr/>
-        <w:t>He closed the account the only way left.</w:t>
+        <w:t>Antony’s</w:t>
+      </w:r>
+      <w:r>
+        <w:rPr/>
+        <w:t>.</w:t>
+      </w:r>
+    </w:p>
+    <w:p>
+      <w:r>
+        <w:rPr/>
+        <w:t>Nobody contradicted him. From the hill it looked exactly like that. It looked like a man dragged down by his enemies with his friends standing on a hill doing nothing. Cassius held the sight for three breaths and tried to make it into anything else. A man pulled from a horse. A shout. Arms round a body. He had always despised officers who acted on half a report. He stood there and could not get the other half.</w:t>
+      </w:r>
+    </w:p>
+    <w:p>
+      <w:r>
+        <w:rPr/>
+        <w:t>“I have loved being alive too much,” he said, quite quietly. “I waited, and now I have watched them take a friend in front of my face.”</w:t>
+      </w:r>
+    </w:p>
+    <w:p>
+      <w:r>
+        <w:rPr/>
+        <w:t>He walked away from the officers to an empty tent at the back of the hill, a supply tent with nothing in it but a broken stool, and called Pindarus in after him. He had kept the freedman at his elbow since Carrhae, since the desert where he had seen what the Parthians did with Crassus’s head, for this one errand. Pindarus came in and let the flap fall.</w:t>
+      </w:r>
+    </w:p>
+    <w:p>
+      <w:r>
+        <w:rPr/>
+        <w:t>Cassius drew his cloak up over his head. The wool smelled of smoke from the camp. He found the place on his neck with two fingers and set the point of the blade there and put Pindarus’s hand on the hilt.</w:t>
+      </w:r>
+    </w:p>
+    <w:p>
+      <w:r>
+        <w:rPr/>
+        <w:t>Outside, hooves were coming up the hill, a lot of them, and voices with them, too many voices to make words of. He could not tell from inside the cloak whose they were.</w:t>
+      </w:r>
+    </w:p>
+    <w:p>
+      <w:r>
+        <w:rPr/>
+        <w:t>He did not wait to find out. Pindarus held the blade where Cassius set it. Cassius made the end himself.</w:t>
       </w:r>
     </w:p>
     <w:p>

</xml_diff>

<commit_message>
Re-export Book 1 DOCX after one-word sentence pass
Co-Authored-By: Claude Opus 5.5 <noreply@anthropic.com>
Claude-Session: https://claude.ai/code/session_01SH3diYcDdknGoJv9n7SFJ3
</commit_message>
<xml_diff>
--- a/exports/Ides_Book1_FULL_Ch01-36.docx
+++ b/exports/Ides_Book1_FULL_Ch01-36.docx
@@ -109,7 +109,7 @@
           <w:i/>
           <w:sz w:val="17"/>
         </w:rPr>
-        <w:t>Source: Manuscript e29ed6c (2026-10-24) · generated 2026-10-25 06:14 UTC from main @ fef5410 · source digest d979fd30961ca29c · prologue, chapters 1–36, historical note and cast</w:t>
+        <w:t>Source: Manuscript c265a94 (2026-10-29) · generated 2026-10-29 12:32 UTC from claude/project-thread-ha6sm6 @ c265a94 · source digest 0a699543b6d52367 · prologue, chapters 1–36, historical note and cast</w:t>
       </w:r>
     </w:p>
     <w:p>
@@ -1117,7 +1117,7 @@
       </w:pPr>
       <w:r>
         <w:rPr/>
-        <w:t>The host had given him the third couch, a seat chosen the way a man chooses which cloak to lend a stranger. Not an insult. Not an honour. Sextilius had the couch beside it, still pink from the bath and the afternoon’s flattery.</w:t>
+        <w:t>The host had given him the third couch, a seat chosen the way a man chooses which cloak to lend a stranger: not an insult, not an honour. Sextilius had the couch beside it, still pink from the bath and the afternoon’s flattery.</w:t>
       </w:r>
     </w:p>
     <w:p>
@@ -1796,7 +1796,7 @@
       </w:pPr>
       <w:r>
         <w:rPr/>
-        <w:t>“Thapsus,” someone said. Then: “Cato.” The names were not fresh, but the Forum still wanted them loud. Shouts. Bets. Sudden philosophy, months after the runner’s dust should have settled. A man at the next board was still arguing Utica hard enough to reopen a vein. Hordeonius didn’t shout. Shouting was for men who sold certainty by the jug.</w:t>
+        <w:t>“Thapsus,” someone said. Then: “Cato.” The names were not fresh, but the Forum still wanted them loud: shouts, bets, sudden philosophy, months after the runner’s dust should have settled. A man at the next board was still arguing Utica hard enough to reopen a vein. Hordeonius didn’t shout. Shouting was for men who sold certainty by the jug.</w:t>
       </w:r>
     </w:p>
     <w:p>
@@ -1952,7 +1952,7 @@
       </w:r>
       <w:r>
         <w:rPr/>
-        <w:t xml:space="preserve"> Hordeonius filed the word where he filed all of Caesar’s promises to his old soldiers: farms, somewhere, eventually, on ground nobody had yet explained how to take from the men currently farming it. Fine paper. It paid nothing until it was kept.</w:t>
+        <w:t xml:space="preserve"> Hordeonius filed the word where he filed all of Caesar’s promises to his old soldiers: farms, somewhere, eventually, on ground nobody had yet explained how to take from the men currently farming it. It was fine paper, and it paid nothing until it was kept.</w:t>
       </w:r>
     </w:p>
     <w:p>
@@ -1972,7 +1972,7 @@
       </w:pPr>
       <w:r>
         <w:rPr/>
-        <w:t>Hordeonius kept the rate where it was. He tapped the tablet once. Soft. Final.</w:t>
+        <w:t>Hordeonius kept the rate where it was. He tapped the tablet once, soft and final.</w:t>
       </w:r>
     </w:p>
     <w:p>
@@ -2062,7 +2062,7 @@
       </w:pPr>
       <w:r>
         <w:rPr/>
-        <w:t>Across the way stood Cicero. Hordeonius had him filed with the forgiven: backed Pompey, lost, pardoned by Caesar. A debt that could never be repaid, only rolled over at a worse rate. He received the same Africa as a bruise that had not faded. Cato dead by his own hand. Caesar’s victory complete enough to make mercy look like a style. Cicero’s mouth shaped a period and lost it. Lesser men converted suicide into slogan. Hordeonius watched the unfinished period. Interesting. Not urgent. Like any account that had not cleared.</w:t>
+        <w:t>Across the way stood Cicero. Hordeonius had him filed with the forgiven: backed Pompey, lost, pardoned by Caesar. A debt that could never be repaid, only rolled over at a worse rate. He received the same Africa as a bruise that had not faded. Cato dead by his own hand. Caesar’s victory complete enough to make mercy look like a style. Cicero’s mouth shaped a period and lost it. Lesser men converted suicide into slogan. Hordeonius watched the unfinished period and filed it as interesting but not urgent, like any account that had not cleared.</w:t>
       </w:r>
     </w:p>
     <w:p>
@@ -2165,7 +2165,7 @@
       </w:pPr>
       <w:r>
         <w:rPr/>
-        <w:t>Captives. Gold. Painted lies on wagons. Four triumphs in one month: Gaul, Egypt, Pontus, Africa. Rome had swallowed Caesar’s whole war in four courses, and Africa had been the last, and the taste was still on the street. Phileros had sent her for oil and eyes: watch who lingered near the Domus Publica’s public smile, count which clients arrived early to borrow the house’s favour. She understood tasks. She didn’t understand why men needed wagons to prove they had already won.</w:t>
+        <w:t>Captives, gold and painted lies on wagons. Four triumphs in one month: Gaul, Egypt, Pontus, Africa. Rome had swallowed Caesar’s whole war in four courses, and Africa had been the last, and the taste was still on the street. Phileros had sent her for oil and eyes: watch who lingered near the Domus Publica’s public smile, count which clients arrived early to borrow the house’s favour. She understood tasks. She didn’t understand why men needed wagons to prove they had already won.</w:t>
       </w:r>
     </w:p>
     <w:p>
@@ -3337,7 +3337,7 @@
       </w:pPr>
       <w:r>
         <w:rPr/>
-        <w:t>Before Porcia could press again, a steward brought word that his mother’s messenger waited in the outer court. Servilia. The whole city knew she was the woman Caesar had loved longest; Brutus had spent twenty years not knowing it. Not quite an invitation. A mother’s reminder: pardoned sons still owed dinners they did not choose. Soft chains got priced in women’s rooms first. Men’s masks judged later. Porcia’s mouth tightened. “She sends weather,” Porcia said. “I send refusal. Do not confuse the two.”</w:t>
+        <w:t>Before Porcia could press again, a steward brought word that Servilia’s messenger waited in the outer court. The whole city knew she was the woman Caesar had loved longest; Brutus had spent twenty years not knowing it. Not quite an invitation. A mother’s reminder: pardoned sons still owed dinners they did not choose. Soft chains got priced in women’s rooms first. Men’s masks judged later. Porcia’s mouth tightened. “She sends weather,” Porcia said. “I send refusal. Do not confuse the two.”</w:t>
       </w:r>
     </w:p>
     <w:p>
@@ -3367,7 +3367,7 @@
       </w:pPr>
       <w:r>
         <w:rPr/>
-        <w:t>A slave’s foot whispered in the corridor. Ordinary. Brutus lowered his voice anyway.</w:t>
+        <w:t>A slave’s foot whispered in the corridor, an ordinary sound, and Brutus lowered his voice anyway.</w:t>
       </w:r>
     </w:p>
     <w:p>
@@ -3536,7 +3536,7 @@
       </w:pPr>
       <w:r>
         <w:rPr/>
-        <w:t>Useful. Warm. Specific. Decimus left the inner room still tasting it. Essays had never earned him that.</w:t>
+        <w:t>It was useful, warm and specific, and Decimus left the inner room still tasting it. Essays had never earned him that.</w:t>
       </w:r>
     </w:p>
     <w:p>
@@ -4407,7 +4407,7 @@
       </w:pPr>
       <w:r>
         <w:rPr/>
-        <w:t>Cicero heard it and felt his face arrange itself into the old accommodation smile before his mind finished objecting. The mind objected in history, because that was where it lived. Six months: that was a dictator, once. A man the Republic hired in an emergency, handed every power, and thanked when he had put the fire out and gone home. Sulla had broken the habit. Caesar had stretched it, a year here, ten years there, and now some obliging senator had drafted the last clause. Not for the crisis. For good. The couriers had carried it up to Tusculum’s summer villas with the morning bread.</w:t>
+        <w:t>Cicero heard it and felt his face arrange itself into the old accommodation smile before his mind finished objecting. The mind objected in history, because that was where it lived. Six months: that was a dictator, once. A man the Republic hired in an emergency, handed every power, and thanked when he had put the fire out and gone home. Sulla had broken the habit. Caesar had stretched it, a year here, ten years there, and now some obliging senator had drafted the last clause: not for the crisis, but for good. The couriers had carried it up to Tusculum’s summer villas with the morning bread.</w:t>
       </w:r>
     </w:p>
     <w:p>
@@ -4950,7 +4950,7 @@
       </w:pPr>
       <w:r>
         <w:rPr/>
-        <w:t>When Antony came forward with the diadem, call it wreath, call it crown’s cousin, call it a test, the Forum’s noise changed pitch. White linen bound round laurel, light as nothing in his fist: the headband of every foreign king Rome had ever hated. Somewhere below the Rostra a voice shouted the tribunes’ names, the two who had torn the same white band off Caesar’s statue a fortnight back and lost their office for it. Nobody had yet decided who had been insulted. Offer. The gesture hung. Wool and metal. A child’s cry somewhere under the press. Antony’s grin was wide enough to hide whether he had been told to offer or had offered to see what broke.</w:t>
+        <w:t>When Antony came forward with the diadem, call it wreath, call it crown’s cousin, call it a test, the Forum’s noise changed pitch. White linen bound round laurel, light as nothing in his fist: the headband of every foreign king Rome had ever hated. Somewhere below the Rostra a voice shouted the tribunes’ names, the two who had torn the same white band off Caesar’s statue a fortnight back and lost their office for it. Nobody had yet decided who had been insulted. The offer hung, wool and metal. A child’s cry somewhere under the press. Antony’s grin was wide enough to hide whether he had been told to offer or had offered to see what broke.</w:t>
       </w:r>
     </w:p>
     <w:p>
@@ -4970,7 +4970,7 @@
       </w:pPr>
       <w:r>
         <w:rPr/>
-        <w:t>Not once only. He refused in a way that let every watcher invent a script: humility, theatre, or a trap dressed as a joke. Antony offered it a second time and was refused a second time, louder, and there was a roar that was neither cheer nor protest. The third time, Caesar stood and said that Jupiter alone was king of the Romans, and had the wreath carried to the temple on the Capitol. Antony lowered the thing as if lowering a cup he had not meant to empty. The Forum exhaled wrong, half relief, half hunger.</w:t>
+        <w:t>He refused more than once, and in a way that let every watcher invent a script: humility, theatre, or a trap dressed as a joke. Antony offered it a second time and was refused a second time, louder, and there was a roar that was neither cheer nor protest. The third time, Caesar stood and said that Jupiter alone was king of the Romans, and had the wreath carried to the temple on the Capitol. Antony lowered the thing as if lowering a cup he had not meant to empty. The Forum exhaled wrong, half relief, half hunger.</w:t>
       </w:r>
     </w:p>
     <w:p>
@@ -5792,7 +5792,7 @@
       </w:pPr>
       <w:r>
         <w:rPr/>
-        <w:t>Galba’s mouth tightened. Not refusal. Calculation. “And Brutus?”</w:t>
+        <w:t>Galba’s mouth tightened, in calculation rather than refusal. “And Brutus?”</w:t>
       </w:r>
     </w:p>
     <w:p>
@@ -6264,7 +6264,7 @@
       </w:pPr>
       <w:r>
         <w:rPr/>
-        <w:t>The Curia. Not the old one; that stood half torn down behind scaffolding while Caesar rebuilt it larger. The next sitting would be in the hall beside Pompey’s theatre, nine hundred senators, most of them Caesar’s new men, on the benches under Pompey’s own statue. Decimus thought that last thing and felt his stomach turn over.</w:t>
+        <w:t>It would be the Curia, though not the old one; that stood half torn down behind scaffolding while Caesar rebuilt it larger. The next sitting would be in the hall beside Pompey’s theatre, nine hundred senators, most of them Caesar’s new men, on the benches under Pompey’s own statue. Decimus thought that last thing and felt his stomach turn over.</w:t>
       </w:r>
     </w:p>
     <w:p>
@@ -6647,7 +6647,7 @@
       </w:pPr>
       <w:r>
         <w:rPr/>
-        <w:t>Brutus held the spare. Cassius stored the loss like interest, visible in the jaw, kept for later collection. A slave’s foot scuffed beyond the hedge, too near. Conversation became cover chat: rain, a cousin’s wedding, whether the chickens had been rude. The foot retreated. Almost.</w:t>
+        <w:t>Brutus held the spare. Cassius stored the loss like interest, visible in the jaw, kept for later collection. A slave’s foot scuffed beyond the hedge, too near. Conversation became cover chat: rain, a cousin’s wedding, whether the chickens had been rude. The foot retreated, or nearly did.</w:t>
       </w:r>
     </w:p>
     <w:p>
@@ -7850,7 +7850,27 @@
       </w:pPr>
       <w:r>
         <w:rPr/>
-        <w:t>He told the courier, “Tell Hirtius the books are being misused by flatterers, and that I am occupied with letters that keep the Republic’s throat clear.” Occupied. Clear. The words sounded like action and were a refusal to leave the desk.</w:t>
+        <w:t xml:space="preserve">He told the courier, “Tell Hirtius the books are being misused by flatterers, and that I am occupied with letters that keep the Republic’s throat clear.” </w:t>
+      </w:r>
+      <w:r>
+        <w:rPr>
+          <w:i/>
+        </w:rPr>
+        <w:t>Occupied</w:t>
+      </w:r>
+      <w:r>
+        <w:rPr/>
+        <w:t xml:space="preserve"> and </w:t>
+      </w:r>
+      <w:r>
+        <w:rPr>
+          <w:i/>
+        </w:rPr>
+        <w:t>clear</w:t>
+      </w:r>
+      <w:r>
+        <w:rPr/>
+        <w:t>: the words sounded like action and were a refusal to leave the desk.</w:t>
       </w:r>
     </w:p>
     <w:p>
@@ -8252,7 +8272,7 @@
       </w:r>
       <w:r>
         <w:rPr/>
-        <w:t xml:space="preserve"> Incomplete. Ugly. Misfiled even as she wrote it, she put </w:t>
+        <w:t xml:space="preserve"> It came out incomplete and ugly, misfiled even as she wrote it: she put </w:t>
       </w:r>
       <w:r>
         <w:rPr>
@@ -8395,7 +8415,7 @@
       </w:pPr>
       <w:r>
         <w:rPr/>
-        <w:t>He kept ships, grain, maps, the stubborn arithmetic of an eastern war, and the smaller arithmetic of which men still laughed when he cut a joke. Calpurnia’s hands, the staff’s sudden piety, Spurinna’s professional beware: he treated the fear in the house like March weather. Real. Inconvenient. Not a reason to cancel the city’s work.</w:t>
+        <w:t>He kept ships, grain, maps, the stubborn arithmetic of an eastern war, and the smaller arithmetic of which men still laughed when he cut a joke. Calpurnia’s hands, the staff’s sudden piety, Spurinna’s professional beware: he treated the fear in the house like March weather: real, inconvenient, and no reason to cancel the city’s work.</w:t>
       </w:r>
     </w:p>
     <w:p>
@@ -9463,7 +9483,7 @@
       </w:pPr>
       <w:r>
         <w:rPr/>
-        <w:t>Somewhere beyond the wall a board complained. Farther off, toward the atrium, or the shrine where the shields and spears of Mars lay in the chief priest’s keeping, metal spoke. Every nurse in Rome told every child the same thing: the war god’s arms rattled on their own before a great disaster. A clatter. A settling. Something hung for war had remembered it was metal.</w:t>
+        <w:t>Somewhere beyond the wall a board complained. Farther off, toward the atrium, or the shrine where the shields and spears of Mars lay in the chief priest’s keeping, metal spoke. Every nurse in Rome told every child the same thing: the war god’s arms rattled on their own before a great disaster. A clatter, then a settling. Something hung for war had remembered it was metal.</w:t>
       </w:r>
     </w:p>
     <w:p>
@@ -9949,7 +9969,7 @@
       </w:pPr>
       <w:r>
         <w:rPr/>
-        <w:t>In the atrium Calpurnia’s fear was already a climate. Caesar stood dressed enough for the street, the unfinished stack of tablets behind him like a second, quieter Senate. Nysa had followed as far as the useful edge. Decimus counted what the room wanted. Caesar’s ease. Calpurnia’s grip on the doorframe. Phileros’s keys.</w:t>
+        <w:t>In the atrium Calpurnia’s fear was already a climate. Caesar stood dressed enough for the street, the unfinished stack of tablets behind him like a second, quieter Senate. Nysa had followed as far as the useful edge. Decimus counted what the room wanted: Caesar’s ease, Calpurnia’s grip on the doorframe, Phileros’s keys.</w:t>
       </w:r>
     </w:p>
     <w:p>
@@ -10199,7 +10219,7 @@
       </w:pPr>
       <w:r>
         <w:rPr/>
-        <w:t>Caesar didn’t speak. Decimus filled the air anyway, soft logistics, the chatter of loyalty: which way, how many, Antony would be, Antony would be held. Trebonius’s job. Decimus didn’t say that. He said, “It will be a short session,” and smiled.</w:t>
+        <w:t>Caesar didn’t speak. Decimus filled the air anyway, soft logistics, the chatter of loyalty: which way, how many, Antony would be, Antony would be held, which was Trebonius’s job. Decimus didn’t say that. He said, “It will be a short session,” and smiled.</w:t>
       </w:r>
     </w:p>
     <w:p>
@@ -10302,7 +10322,7 @@
       </w:pPr>
       <w:r>
         <w:rPr/>
-        <w:t>Not the usual wrong, the cook shouting, a client too early at the vestibule, Phileros cursing a dog in the Sacra Via. This was quieter. Wood complaining. A door that should have stayed shut. Then metal, somewhere toward the priest-store, speaking once like a dropped tray and then pretending it had not.</w:t>
+        <w:t>Not the usual wrong, the cook shouting, a client too early at the vestibule, Phileros cursing a dog in the Sacra Via. This was quieter: wood complaining, a door that should have stayed shut. Then metal, somewhere toward the priest-store, speaking once like a dropped tray and then pretending it had not.</w:t>
       </w:r>
     </w:p>
     <w:p>
@@ -10382,7 +10402,7 @@
       </w:pPr>
       <w:r>
         <w:rPr/>
-        <w:t>Caesar’s gaze flicked to Nysa once. “Go and see if the haruspices have sent anything.” Not unkind. Not kind. A redirection of weather.</w:t>
+        <w:t>Caesar’s gaze flicked to Nysa once. “Go and see if the haruspices have sent anything.” It was not unkind and not kind: a redirection of weather.</w:t>
       </w:r>
     </w:p>
     <w:p>
@@ -11636,7 +11656,7 @@
       </w:pPr>
       <w:r>
         <w:rPr/>
-        <w:t>Tillius’s hands found the toga. Pulled.</w:t>
+        <w:t>Tillius’s hands found the toga and pulled.</w:t>
       </w:r>
     </w:p>
     <w:p>
@@ -12222,7 +12242,7 @@
       </w:pPr>
       <w:r>
         <w:rPr/>
-        <w:t>She still had the wax. Incomplete. Unopened by any dictator. Around her, Rome opened every seal at once.</w:t>
+        <w:t>She still had the wax, incomplete and unopened by any dictator. Around her, Rome opened every seal at once.</w:t>
       </w:r>
     </w:p>
     <w:p>
@@ -13383,37 +13403,37 @@
       </w:pPr>
       <w:r>
         <w:rPr/>
-        <w:t>The main lines came out like blows dressed as clauses. Young Octavius to three parts in four of the estate, and into the name, heir, son in the Roman paper sense that made old men spit. Antony knew the law well enough to dislike it: a will could adopt, make a son from the grave, and pass him the name, the household gods and every client the dead man had. Legal. Also, for an eighteen-year-old great-nephew Antony had hardly noticed, a very large coat. Pinarius and Pedius, the other great-nephews, splitting the remaining fourth like polite afterthoughts. The people remembered with gardens by the Tiber and three hundred sesterces a head. Secondary provisions that snagged Decimus Albinus among heirs in the second degree, like a fishhook left in a clean catch. Second degree: Decimus would see a coin only if the first heirs failed. Remote. But a place, and a place meant the dead man had written his name down.</w:t>
-      </w:r>
-    </w:p>
-    <w:p>
-      <w:pPr>
-        <w:ind w:firstLine="360"/>
-        <w:jc w:val="both"/>
-      </w:pPr>
-      <w:r>
-        <w:rPr/>
-        <w:t>Antony laughed once, short. Not mirth. Recognition.</w:t>
-      </w:r>
-    </w:p>
-    <w:p>
-      <w:pPr>
-        <w:ind w:firstLine="360"/>
-        <w:jc w:val="both"/>
-      </w:pPr>
-      <w:r>
-        <w:rPr/>
-        <w:t>“He loved you,” Antony said in Decimus’s general direction, though Decimus wasn’t there to receive it. Loved you enough to write you into the will and die on your schedule. Second degree. Second line. The portico joke had grown teeth and ink.</w:t>
-      </w:r>
-    </w:p>
-    <w:p>
-      <w:pPr>
-        <w:ind w:firstLine="360"/>
-        <w:jc w:val="both"/>
-      </w:pPr>
-      <w:r>
-        <w:rPr/>
-        <w:t>What mattered: the boy. The name. The crowd’s three hundred reasons to remember Caesar as a father instead of a corpse produced by philosophers. Antony priced the boy the way he priced soft cohorts: thin shoes; a careful mother, Caesar’s niece Atia, who kept her son near her and her opinions nearer; a paper-son who had never fed a veteran. Useful ink. Not a rival. He filed that price without writing it down.</w:t>
+        <w:t>The main lines came out like blows dressed as clauses. Young Octavius to three parts in four of the estate, and into the name, heir, son in the Roman paper sense that made old men spit. Antony knew the law well enough to dislike it: a will could adopt, make a son from the grave, and pass him the name, the household gods and every client the dead man had. It was legal. It was also, for an eighteen-year-old great-nephew Antony had hardly noticed, a very large coat. Pinarius and Pedius, the other great-nephews, splitting the remaining fourth like polite afterthoughts. The people remembered with gardens by the Tiber and three hundred sesterces a head. Secondary provisions that snagged Decimus Albinus among heirs in the second degree, like a fishhook left in a clean catch. Second degree: Decimus would see a coin only if the first heirs failed. It was remote, but it was a place, and a place meant the dead man had written his name down.</w:t>
+      </w:r>
+    </w:p>
+    <w:p>
+      <w:pPr>
+        <w:ind w:firstLine="360"/>
+        <w:jc w:val="both"/>
+      </w:pPr>
+      <w:r>
+        <w:rPr/>
+        <w:t>Antony laughed once, short, in recognition rather than mirth.</w:t>
+      </w:r>
+    </w:p>
+    <w:p>
+      <w:pPr>
+        <w:ind w:firstLine="360"/>
+        <w:jc w:val="both"/>
+      </w:pPr>
+      <w:r>
+        <w:rPr/>
+        <w:t>“He loved you,” Antony said in Decimus’s general direction, though Decimus wasn’t there to receive it. Loved you enough to write you into the will and die on your schedule. Second degree, second line: the portico joke had grown teeth and ink.</w:t>
+      </w:r>
+    </w:p>
+    <w:p>
+      <w:pPr>
+        <w:ind w:firstLine="360"/>
+        <w:jc w:val="both"/>
+      </w:pPr>
+      <w:r>
+        <w:rPr/>
+        <w:t>What mattered was the boy, and the name, and the crowd’s three hundred reasons to remember Caesar as a father instead of a corpse produced by philosophers. Antony priced the boy the way he priced soft cohorts: thin shoes; a careful mother, Caesar’s niece Atia, who kept her son near her and her opinions nearer; a paper-son who had never fed a veteran: useful ink, not a rival. He filed that price without writing it down.</w:t>
       </w:r>
     </w:p>
     <w:p>
@@ -14293,7 +14313,7 @@
       </w:pPr>
       <w:r>
         <w:rPr/>
-        <w:t>Decimus didn’t ask who “they” were. Veterans. Debtors. Men who had loved Caesar’s name and needed a wooden face to hit. He sent the household out by the back ways with the same calm voice he had used on the Ides morning, then wiped pitch from his palm onto his cloak and found he couldn’t get the smell off.</w:t>
+        <w:t>Decimus didn’t ask who “they” were: veterans, debtors, men who had loved Caesar’s name and needed a wooden face to hit. He sent the household out by the back ways with the same calm voice he had used on the Ides morning, then wiped pitch from his palm onto his cloak and found he couldn’t get the smell off.</w:t>
       </w:r>
     </w:p>
     <w:p>
@@ -14516,7 +14536,7 @@
       </w:pPr>
       <w:r>
         <w:rPr/>
-        <w:t>The clerk lingered on a chest that held nothing but cloth and a child’s spare sandals. Caesarion’s. Egypt called the boy Caesar’s heir; Rome had decided to call him nothing at all. The inspection became a price without naming one. Ammonius, who ran her household and spoke for her in the Roman salons, started toward an argument. Cleopatra stopped him with two fingers. Arguing fed the smile.</w:t>
+        <w:t>The clerk lingered on a chest that held nothing but cloth and a child’s spare sandals, Caesarion’s. Egypt called the boy Caesar’s heir; Rome had decided to call him nothing at all. The inspection became a price without naming one. Ammonius, who ran her household and spoke for her in the Roman salons, started toward an argument. Cleopatra stopped him with two fingers. Arguing fed the smile.</w:t>
       </w:r>
     </w:p>
     <w:p>
@@ -14566,7 +14586,7 @@
       </w:pPr>
       <w:r>
         <w:rPr/>
-        <w:t>“Father belongs to their Forum now,” Cleopatra said. Softness later. Ships first. The boy’s hours, the ones Romans had gossiped into careers, were now only packing hours, and she intended them to end on water.</w:t>
+        <w:t>“Father belongs to their Forum now,” Cleopatra said. Softness could come later; ships came first. The boy’s hours, the ones Romans had gossiped into careers, were now only packing hours, and she intended them to end on water.</w:t>
       </w:r>
     </w:p>
     <w:p>
@@ -14656,7 +14676,7 @@
       </w:pPr>
       <w:r>
         <w:rPr/>
-        <w:t>Once she was on the water, someone in Italy would finish her story for her. Clerks. Liberators on a rock. Or a boy whose name had not yet arrived with a seal.</w:t>
+        <w:t>Once she was on the water, someone in Italy would finish her story for her: clerks, Liberators on a rock, or a boy whose name had not yet arrived with a seal.</w:t>
       </w:r>
     </w:p>
     <w:p>
@@ -14709,7 +14729,7 @@
       </w:pPr>
       <w:r>
         <w:rPr/>
-        <w:t>“Caesar,” the man said, and then the rest came broken. Knives. Senate. Pompey’s place. Brutus. Blood. The city upside down. A mother’s hand was in the urgency. Come home. She didn’t know what would happen next. Smoke in the report, too. Houses. Forum heat. Late, incomplete, the same dirty weather Italy was already breathing.</w:t>
+        <w:t>“Caesar,” the man said, and then the rest came broken. Knives. Senate. Pompey’s place. Brutus. Blood. The city upside down. A mother’s hand was in the urgency. Come home. She didn’t know what would happen next. There was smoke in the report, too: houses, Forum heat. Late, incomplete, the same dirty weather Italy was already breathing.</w:t>
       </w:r>
     </w:p>
     <w:p>
@@ -14819,7 +14839,7 @@
       </w:pPr>
       <w:r>
         <w:rPr/>
-        <w:t>Behind his eyes, for one unguarded blink, he saw Caesar’s face as it had been in rarer kindnesses, and shut it away. Kindness wasn’t a plan. Names first.</w:t>
+        <w:t>Behind his eyes, for one unguarded blink, he saw Caesar’s face as it had been in rarer kindnesses, and shut it away. Kindness wasn’t a plan; names came first.</w:t>
       </w:r>
     </w:p>
     <w:p>
@@ -15405,7 +15425,7 @@
       </w:pPr>
       <w:r>
         <w:rPr/>
-        <w:t xml:space="preserve">People brought things. Bread. Honey cakes. Little jars of oil no bigger than a thumb. A soldier with one arm laid a bronze arm-ring on the step and walked away without looking at it. A woman Nysa knew from the Subura fountain, who sold thread and had never in her life been inside a house on the Palatine, knelt and put her forehead to the stone and stayed there. Somebody had written on the base in charcoal, then somebody else had cut it properly into the marble: </w:t>
+        <w:t xml:space="preserve">People brought things: bread, honey cakes, little jars of oil no bigger than a thumb. A soldier with one arm laid a bronze arm-ring on the step and walked away without looking at it. A woman Nysa knew from the Subura fountain, who sold thread and had never in her life been inside a house on the Palatine, knelt and put her forehead to the stone and stayed there. Somebody had written on the base in charcoal, then somebody else had cut it properly into the marble: </w:t>
       </w:r>
       <w:r>
         <w:rPr>
@@ -16122,7 +16142,7 @@
       </w:pPr>
       <w:r>
         <w:rPr/>
-        <w:t>Not under the breath. Aloud. The room flinched. Atia’s face did something private and then went blank. Philippus’s jaw set. Agrippa’s stillness deepened, approval without theatre.</w:t>
+        <w:t>He said it aloud, not under his breath, and the room flinched. Atia’s face did something private and then went blank. Philippus’s jaw set. Agrippa’s stillness deepened, approval without theatre.</w:t>
       </w:r>
     </w:p>
     <w:p>
@@ -17737,7 +17757,7 @@
       </w:pPr>
       <w:r>
         <w:rPr/>
-        <w:t>Servilia cut in, not loud. Loud was for men who needed to be seen cutting. “The corn clause in the decree,” she said, naming the thorn without asking permission. “It can come out. I will see it taken out.” No vote. No request. A mother’s firm rewriting the state’s paper through private channels. Hilarus was already halfway to the door with the look of a man who understood which errands mattered.</w:t>
+        <w:t>Servilia cut in, not loud. Loud was for men who needed to be seen cutting. “The corn clause in the decree,” she said, naming the thorn without asking permission. “It can come out. I will see it taken out.” No vote, no request: a mother’s firm rewriting the state’s paper through private channels. Hilarus was already halfway to the door with the look of a man who understood which errands mattered.</w:t>
       </w:r>
     </w:p>
     <w:p>
@@ -18735,7 +18755,7 @@
       </w:pPr>
       <w:r>
         <w:rPr/>
-        <w:t>The seal was broken. The wax had been thumb-smeared and pressed again badly: an insult, not a forgery. Across the top margin someone had scored a short line with a knife-point, deep enough to scar the wood beneath. No sentence. Only the mark. A smear of something that might have been wine or might have been worse.</w:t>
+        <w:t>The seal was broken. The wax had been thumb-smeared and pressed again badly: an insult, not a forgery. Across the top margin someone had scored a short line with a knife-point, deep enough to scar the wood beneath: no sentence, only the mark. A smear of something that might have been wine or might have been worse.</w:t>
       </w:r>
     </w:p>
     <w:p>
@@ -19393,7 +19413,7 @@
       </w:pPr>
       <w:r>
         <w:rPr/>
-        <w:t>It was Caesar’s voice. Not the words; Caesar’s words had been fewer. The warmth. The pleasure in it. The quick sweet feeling in the chest of a man who has someone at his mercy and has decided, generously, to be merciful, and can feel the other man feel it. Brutus had stood where Gaius was standing. He had stood in a tent at Larissa after Pharsalus with mud to his knees and heard Caesar be kind to him, and had felt himself feel grateful, and had hated it, and had carried it four years under his ribs like a stone he could not cough up. And here it was in his own mouth. It tasted of nothing. It tasted like being good.</w:t>
+        <w:t>It was Caesar’s voice. Not the words, since Caesar’s words had been fewer, but the warmth. The pleasure in it. The quick sweet feeling in the chest of a man who has someone at his mercy and has decided, generously, to be merciful, and can feel the other man feel it. Brutus had stood where Gaius was standing. He had stood in a tent at Larissa after Pharsalus with mud to his knees and heard Caesar be kind to him, and had felt himself feel grateful, and had hated it, and had carried it four years under his ribs like a stone he could not cough up. And here it was in his own mouth. It tasted of nothing. It tasted like being good.</w:t>
       </w:r>
     </w:p>
     <w:p>
@@ -20531,7 +20551,7 @@
       </w:pPr>
       <w:r>
         <w:rPr/>
-        <w:t>A rider came up the Via Aemilia from Ariminum with his horse lathered to the girth: Antony had left Rome with what the boy had left him of the Macedonian legions and was on the road north. Not hurrying. That was worse.</w:t>
+        <w:t>A rider came up the Via Aemilia from Ariminum with his horse lathered to the girth: Antony had left Rome with what the boy had left him of the Macedonian legions and was on the road north, not hurrying, which was worse.</w:t>
       </w:r>
     </w:p>
     <w:p>
@@ -21082,7 +21102,7 @@
       </w:pPr>
       <w:r>
         <w:rPr/>
-        <w:t xml:space="preserve">Amyntas wrote it down as he did everything. Barley, so many medimni. Wine, so many jars, the second quality. Oil. Fodder for four hundred horses. Sheep, live, driven out of the north gate each morning to the camp on the plain where the consul of last year, the proconsul of Syria, the son-in-law of Cicero, sat with his legions and waited to be let in and was not. Each night the gates were shut and the watch doubled. Each morning the carts went out again. Amyntas entered the cost under a heading he invented for it, </w:t>
+        <w:t xml:space="preserve">Amyntas wrote it down as he did everything. Barley, so many medimni. Wine, so many jars, the second quality; oil; fodder for four hundred horses. Sheep, live, driven out of the north gate each morning to the camp on the plain where the consul of last year, the proconsul of Syria, the son-in-law of Cicero, sat with his legions and waited to be let in and was not. Each night the gates were shut and the watch doubled. Each morning the carts went out again. Amyntas entered the cost under a heading he invented for it, </w:t>
       </w:r>
       <w:r>
         <w:rPr>
@@ -21162,7 +21182,7 @@
       </w:pPr>
       <w:r>
         <w:rPr/>
-        <w:t>He went up on to his roof in his night tunic. The streets below the temple were full of soldiers. Not running. Walking fast, in file, with their shields covered and their swords drawn and nobody talking. They had come over the wall on the seaward side, where it was lowest, with ladders. Later he learned they had turned back on the Ephesus road at dusk, a few cohorts of them, and come up through the olive groves in the dark while the rest of the column went on making noise to the south. Later he learned all of it. That night he only stood on his roof and watched the files go by below, all going the same way, uphill, toward the governor’s house.</w:t>
+        <w:t>He went up on to his roof in his night tunic. The streets below the temple were full of soldiers, not running but walking fast, in file, with their shields covered and their swords drawn and nobody talking. They had come over the wall on the seaward side, where it was lowest, with ladders. Later he learned they had turned back on the Ephesus road at dusk, a few cohorts of them, and come up through the olive groves in the dark while the rest of the column went on making noise to the south. Later he learned all of it. That night he only stood on his roof and watched the files go by below, all going the same way, uphill, toward the governor’s house.</w:t>
       </w:r>
     </w:p>
     <w:p>
@@ -21715,7 +21735,7 @@
       </w:pPr>
       <w:r>
         <w:rPr/>
-        <w:t>Further on, the road was full of what an army leaves when it runs. Shields. A wagon on its side with the mules still in the traces, one dead, one trying to stand. Javelins stuck in the road like stalks. And bodies, not many on the road itself, more in the ditches either side, and more beyond that in the marsh, where the reeds were broken flat in long lanes as if cattle had been driven through them.</w:t>
+        <w:t>Further on, the road was full of what an army leaves when it runs: shields, a wagon on its side with the mules still in the traces, one dead, one trying to stand. Javelins stuck in the road like stalks. And bodies, not many on the road itself, more in the ditches either side, and more beyond that in the marsh, where the reeds were broken flat in long lanes as if cattle had been driven through them.</w:t>
       </w:r>
     </w:p>
     <w:p>
@@ -22340,7 +22360,7 @@
       </w:pPr>
       <w:r>
         <w:rPr/>
-        <w:t>Then Mutina, and the siege broken, and the price of it: Hirtius dead in the ditch, Pansa of his wound a day after. Two consuls gone in a week. The Senate had sat with their chairs empty and voted what it could. A triumph for Decimus, who had held the wall. The dead consuls’ legions to Decimus, to finish Antony. Thanksgivings. Statues. And for the boy, whose veterans had stood in the mud beside the consuls, an ovation and a vote of thanks, and a quiet agreement among the older benches that he had served his turn.</w:t>
+        <w:t>Then Mutina, and the siege broken, and the price of it: Hirtius dead in the ditch, Pansa of his wound a day after. Two consuls gone in a week. The Senate had sat with their chairs empty and voted what it could. A triumph for Decimus, who had held the wall. The dead consuls’ legions to Decimus, to finish Antony, with thanksgivings and statues besides. And for the boy, whose veterans had stood in the mud beside the consuls, an ovation and a vote of thanks, and a quiet agreement among the older benches that he had served his turn.</w:t>
       </w:r>
     </w:p>
     <w:p>
@@ -23049,7 +23069,7 @@
       </w:pPr>
       <w:r>
         <w:rPr/>
-        <w:t>He did not send word first. Decimus woke one morning in September before light because his horse was restless, and went up on the bank of the camp ditch with his cloak over his shoulders, and saw that the higher ground by the river was moving. Plancus’s camp was being struck. Not in haste. Tents coming down in order, cohort by cohort, wagons being loaded, the eagle of the first legion already out in front of its column on the road toward the bridge Plancus’s engineers had built across the Isara in the spring and never yet used.</w:t>
+        <w:t>He did not send word first. Decimus woke one morning in September before light because his horse was restless, and went up on the bank of the camp ditch with his cloak over his shoulders, and saw that the higher ground by the river was moving. Plancus’s camp was being struck, not in haste: tents coming down in order, cohort by cohort, wagons being loaded, the eagle of the first legion already out in front of its column on the road toward the bridge Plancus’s engineers had built across the Isara in the spring and never yet used.</w:t>
       </w:r>
     </w:p>
     <w:p>
@@ -23099,7 +23119,7 @@
       </w:pPr>
       <w:r>
         <w:rPr/>
-        <w:t>By noon the recruits had begun to go. Not all at once. Not with noise. A tent-group here, a century there, walking out of the gate with their shields on their backs as if they had been sent on fatigues, and not coming back. Some went south over the bridge after Plancus. Some went east toward the boy, whose name was on the law that had condemned their general. Some just went home. The centurions did not stop them. The centurions were going too.</w:t>
+        <w:t>By noon the recruits had begun to go, not all at once and not with noise. A tent-group here, a century there, walking out of the gate with their shields on their backs as if they had been sent on fatigues, and not coming back. Some went south over the bridge after Plancus. Some went east toward the boy, whose name was on the law that had condemned their general. Some just went home. The centurions did not stop them. The centurions were going too.</w:t>
       </w:r>
     </w:p>
     <w:p>
@@ -24466,7 +24486,7 @@
       </w:pPr>
       <w:r>
         <w:rPr/>
-        <w:t>Antony’s stylus paused on a lesser enemy first, a man who had borrowed money and returned sermons. Easy. The stylus moved. Then it paused again on a blank that was not blank in anyone’s throat.</w:t>
+        <w:t>Antony’s stylus paused on a lesser enemy first, a man who had borrowed money and returned sermons, an easy one. The stylus moved. Then it paused again on a blank that was not blank in anyone’s throat.</w:t>
       </w:r>
     </w:p>
     <w:p>
@@ -24506,7 +24526,7 @@
       </w:pPr>
       <w:r>
         <w:rPr/>
-        <w:t>A lesser name sat two lines up, a man Octavian half-owed from Apollonia’s edge. Useful. Not loved. Killable without rearranging the map. Striking that name instead would buy a night of quieter conscience and leave Antony’s wound open. Octavian felt the cheaper exit in his hands: the stylus, the wax, the easy swap.</w:t>
+        <w:t>A lesser name sat two lines up, a man Octavian half-owed from Apollonia’s edge: useful, not loved, killable without rearranging the map. Striking that name instead would buy a night of quieter conscience and leave Antony’s wound open. Octavian felt the cheaper exit in his hands: the stylus, the wax, the easy swap.</w:t>
       </w:r>
     </w:p>
     <w:p>
@@ -24633,7 +24653,7 @@
       </w:pPr>
       <w:r>
         <w:rPr/>
-        <w:t>Hordeonius acquired a neighbour’s leases, and a widow’s garden rights, through channels that smelled like lists. The widow’s steward spat near his shoes and called it accident. Hordeonius called it business and paid anyway. He told himself seals were older than pity. Sleep disagreed. Arrived late. Left early. Charged interest he could not collect from his own nerves.</w:t>
+        <w:t>Hordeonius acquired a neighbour’s leases, and a widow’s garden rights, through channels that smelled like lists. The widow’s steward spat near his shoes and called it accident. Hordeonius called it business and paid anyway. He told himself seals were older than pity. Sleep disagreed: it arrived late, left early, and charged interest he could not collect from his own nerves.</w:t>
       </w:r>
     </w:p>
     <w:p>
@@ -26439,7 +26459,7 @@
       </w:pPr>
       <w:r>
         <w:rPr/>
-        <w:t>The officer at the front had a face he knew. It took a moment; names had begun to take him moments. Popillius. A young man once, charged with his father’s death, and Cicero had talked a jury out of sewing him into the parricide’s sack and giving him to the river. The jury had leaned. Popillius had kissed his hand in the street. Now he held a drawn sword and would not look at the litter. The centurion beside him did the looking for both. Herennius, someone said. The name meant nothing. That seemed wrong too.</w:t>
+        <w:t>The officer at the front had a face he knew. It took a moment, because names had begun to take him moments, but it was Popillius, a young man once, charged with his father’s death, and Cicero had talked a jury out of sewing him into the parricide’s sack and giving him to the river. The jury had leaned. Popillius had kissed his hand in the street. Now he held a drawn sword and would not look at the litter. The centurion beside him did the looking for both. Herennius, someone said. The name meant nothing. That seemed wrong too.</w:t>
       </w:r>
     </w:p>
     <w:p>
@@ -27555,7 +27575,7 @@
       </w:pPr>
       <w:r>
         <w:rPr/>
-        <w:t>Amyntas went by sea in the hot months, with a letter from the council and the books, down the coast past Rhodes and Cyprus to where the Syrian shore ran flat and white under the sun and a town sat on its headland with the sea on three sides and an army on the fourth. Laodicea. Dolabella had gone in there in the spring, when Cassius came against him with more legions than he had, and the town had opened its gates to him, because he had been consul of Rome last year and had good teeth. Now it had walls round it on the land side, Cassius’s walls, a double ditch and a rampart across the neck of the headland, and on the sea side Cassius’s ships rode at anchor in a line, and nothing went in.</w:t>
+        <w:t>Amyntas went by sea in the hot months, with a letter from the council and the books, down the coast past Rhodes and Cyprus to where the Syrian shore ran flat and white under the sun and a town sat on its headland with the sea on three sides and an army on the fourth: Laodicea. Dolabella had gone in there in the spring, when Cassius came against him with more legions than he had, and the town had opened its gates to him, because he had been consul of Rome last year and had good teeth. Now it had walls round it on the land side, Cassius’s walls, a double ditch and a rampart across the neck of the headland, and on the sea side Cassius’s ships rode at anchor in a line, and nothing went in.</w:t>
       </w:r>
     </w:p>
     <w:p>
@@ -28579,7 +28599,7 @@
       </w:pPr>
       <w:r>
         <w:rPr/>
-        <w:t>Brutus said something. Cassius said something worse. After a while neither of them was making periods any more. Brutus was crying, which he did easily and without shame, as he had in Athens over a line of Plato; Cassius was not, which cost him more. They said everything. The money Brutus had asked for at Smyrna, which Cassius had given, a third, against the advice of his officers. The letters each had written to Rome about the other. Antony. The night of GO. Porcia, once, from Cassius, and he was sorry the moment it was out, and did not say so.</w:t>
+        <w:t>Brutus said something. Cassius said something worse. After a while neither of them was making periods any more. Brutus was crying, which he did easily and without shame, as he had in Athens over a line of Plato; Cassius was not, which cost him more. They said everything. The money Brutus had asked for at Smyrna, which Cassius had given, a third, against the advice of his officers. The letters each had written to Rome about the other. Antony, and the night of GO. Porcia, once, from Cassius, and he was sorry the moment it was out, and did not say so.</w:t>
       </w:r>
     </w:p>
     <w:p>
@@ -28639,7 +28659,7 @@
       </w:pPr>
       <w:r>
         <w:rPr/>
-        <w:t xml:space="preserve">Nestor. Old Nestor in the </w:t>
+        <w:t xml:space="preserve">It was Nestor, old Nestor in the </w:t>
       </w:r>
       <w:r>
         <w:rPr>
@@ -29391,7 +29411,7 @@
       </w:pPr>
       <w:r>
         <w:rPr/>
-        <w:t>There were no numbers. He sent a runner down the reverse slope for a count and the runner did not come back. He checked the water jars himself while he waited. Half full. He moved a shield that did not need moving. His eyes had never been good at distance, and in glare they were worse. He had spent twenty years making other men’s reports clear enough to act on, and now he could not see the end of his own hill.</w:t>
+        <w:t>There were no numbers. He sent a runner down the reverse slope for a count and the runner did not come back. He checked the water jars himself while he waited; they were half full. He moved a shield that did not need moving. His eyes had never been good at distance, and in glare they were worse. He had spent twenty years making other men’s reports clear enough to act on, and now he could not see the end of his own hill.</w:t>
       </w:r>
     </w:p>
     <w:p>
@@ -29664,7 +29684,7 @@
       </w:pPr>
       <w:r>
         <w:rPr/>
-        <w:t>Then mud and numbers undid the stiffening. He saw men who wanted tomorrow’s grain more than yesterday’s name. Both kinds broke when the plain insisted. An officer, face known from the minting days, caught his sleeve and begged him to pull back to a cleaner hill. The cleaner hill was visible. Higher ground. Fresher air. A place where the day might be lost slower and with more witnesses who could later invent dignity.</w:t>
+        <w:t>Then mud and numbers undid the stiffening. He saw men who wanted tomorrow’s grain more than yesterday’s name. Both kinds broke when the plain insisted. An officer, face known from the minting days, caught his sleeve and begged him to pull back to a cleaner hill. The cleaner hill was visible, higher ground and fresher air, a place where the day might be lost slower and with more witnesses who could later invent dignity.</w:t>
       </w:r>
     </w:p>
     <w:p>
@@ -29694,7 +29714,7 @@
       </w:pPr>
       <w:r>
         <w:rPr/>
-        <w:t>“Hold what you can,” Brutus said. Not a period. Not an antithesis. Only an order with the paint worn off.</w:t>
+        <w:t>“Hold what you can,” Brutus said. It was not a period or an antithesis, only an order with the paint worn off.</w:t>
       </w:r>
     </w:p>
     <w:p>
@@ -30186,7 +30206,7 @@
       </w:pPr>
       <w:r>
         <w:rPr/>
-        <w:t>There were more than at the games. She counted them the way she had counted the benches, in rows and then in tens, along the road and up the steps of the tombs and on the roofs of the tavern by the gate, and when the rows ran out she counted the people still coming down the hill behind her from the Caelian. Freedmen with their caps on. Shopkeepers with their shutters up. Veterans, a great many veterans, standing in their old units without being told to, with their discharge tablets in their belts. Women. Children on shoulders. A man selling hot chickpeas who sold out before the second hour and stood with his empty pan and cheered.</w:t>
+        <w:t>There were more than at the games. She counted them the way she had counted the benches, in rows and then in tens, along the road and up the steps of the tombs and on the roofs of the tavern by the gate, and when the rows ran out she counted the people still coming down the hill behind her from the Caelian. Freedmen with their caps on. Shopkeepers with their shutters up. Veterans, a great many veterans, standing in their old units without being told to, with their discharge tablets in their belts. Women, and children on shoulders. A man selling hot chickpeas who sold out before the second hour and stood with his empty pan and cheered.</w:t>
       </w:r>
     </w:p>
     <w:p>
@@ -30206,7 +30226,7 @@
       </w:pPr>
       <w:r>
         <w:rPr/>
-        <w:t>The litter came at noon. The curtains were open. Inside it, propped on cushions, a thin young man with a pale face and a cloak to the chin, looking out at them. Not waving. Looking. His eyes went along the crowd the way Nysa’s went along the benches, row by row, and for one moment, which she knew perfectly well meant nothing, they went along her row.</w:t>
+        <w:t>The litter came at noon. The curtains were open. Inside it, propped on cushions, a thin young man with a pale face and a cloak to the chin, looking out at them. He did not wave; he looked. His eyes went along the crowd the way Nysa’s went along the benches, row by row, and for one moment, which she knew perfectly well meant nothing, they went along her row.</w:t>
       </w:r>
     </w:p>
     <w:p>

</xml_diff>